<commit_message>
Need to fix calendar color mapping
</commit_message>
<xml_diff>
--- a/Documentation/AI Prompts/Vibe Coding - TNA Dashboard.docx
+++ b/Documentation/AI Prompts/Vibe Coding - TNA Dashboard.docx
@@ -21589,15 +21589,9 @@
         <w:rPr>
           <w:lang w:val="en-GB"/>
         </w:rPr>
-        <w:t>(</w:t>
+        <w:t>();</w:t>
       </w:r>
       <w:proofErr w:type="gramEnd"/>
-      <w:r>
-        <w:rPr>
-          <w:lang w:val="en-GB"/>
-        </w:rPr>
-        <w:t>);</w:t>
-      </w:r>
     </w:p>
     <w:p>
       <w:pPr>
@@ -21878,8 +21872,16 @@
         <w:rPr>
           <w:lang w:val="en-GB"/>
         </w:rPr>
-        <w:t>();</w:t>
-      </w:r>
+        <w:t>(</w:t>
+      </w:r>
+      <w:proofErr w:type="gramStart"/>
+      <w:r>
+        <w:rPr>
+          <w:lang w:val="en-GB"/>
+        </w:rPr>
+        <w:t>);</w:t>
+      </w:r>
+      <w:proofErr w:type="gramEnd"/>
     </w:p>
     <w:p>
       <w:pPr>
@@ -23189,8 +23191,16 @@
         <w:rPr>
           <w:lang w:val="en-GB"/>
         </w:rPr>
-        <w:t>}");</w:t>
-      </w:r>
+        <w:t>}"</w:t>
+      </w:r>
+      <w:proofErr w:type="gramStart"/>
+      <w:r>
+        <w:rPr>
+          <w:lang w:val="en-GB"/>
+        </w:rPr>
+        <w:t>);</w:t>
+      </w:r>
+      <w:proofErr w:type="gramEnd"/>
     </w:p>
     <w:p>
       <w:pPr>
@@ -26258,8 +26268,6 @@
       </w:r>
       <w:r>
         <w:tab/>
-      </w:r>
-      <w:r>
         <w:t>Late</w:t>
       </w:r>
     </w:p>
@@ -26299,8 +26307,6 @@
       </w:r>
       <w:r>
         <w:tab/>
-      </w:r>
-      <w:r>
         <w:t>Sick Leave</w:t>
       </w:r>
     </w:p>
@@ -27159,18 +27165,58 @@
         </w:rPr>
         <w:t>Icon</w:t>
       </w:r>
+      <w:proofErr w:type="gramStart"/>
       <w:r>
         <w:t>="@</w:t>
+      </w:r>
+      <w:proofErr w:type="spellStart"/>
+      <w:r>
+        <w:t>Icons.Material.Filled.Circle</w:t>
+      </w:r>
+      <w:proofErr w:type="spellEnd"/>
+      <w:proofErr w:type="gramEnd"/>
+      <w:r>
+        <w:t>"</w:t>
+      </w:r>
+    </w:p>
+    <w:p>
+      <w:pPr>
+        <w:spacing w:after="0" w:line="240" w:lineRule="auto"/>
+      </w:pPr>
+      <w:r>
+        <w:t xml:space="preserve">                     </w:t>
+      </w:r>
+      <w:proofErr w:type="spellStart"/>
+      <w:r>
+        <w:rPr>
+          <w:b/>
+          <w:bCs/>
+        </w:rPr>
+        <w:t>IconColor</w:t>
+      </w:r>
+      <w:proofErr w:type="spellEnd"/>
+      <w:proofErr w:type="gramStart"/>
+      <w:r>
+        <w:t>="@</w:t>
+      </w:r>
+      <w:proofErr w:type="spellStart"/>
+      <w:proofErr w:type="gramEnd"/>
+      <w:r>
+        <w:t>GetLegendColor</w:t>
+      </w:r>
+      <w:proofErr w:type="spellEnd"/>
+      <w:r>
+        <w:t>(</w:t>
       </w:r>
       <w:proofErr w:type="spellStart"/>
       <w:proofErr w:type="gramStart"/>
       <w:r>
-        <w:t>Icons.Material.Filled.Circle</w:t>
+        <w:t>legend.UDCCode</w:t>
       </w:r>
       <w:proofErr w:type="spellEnd"/>
       <w:proofErr w:type="gramEnd"/>
       <w:r>
-        <w:t>"</w:t>
+        <w:t>)"</w:t>
       </w:r>
     </w:p>
     <w:p>
@@ -27180,1514 +27226,1495 @@
       <w:r>
         <w:t xml:space="preserve">                     </w:t>
       </w:r>
-      <w:proofErr w:type="spellStart"/>
       <w:r>
         <w:rPr>
           <w:b/>
           <w:bCs/>
         </w:rPr>
-        <w:t>IconColor</w:t>
+        <w:t>Size</w:t>
+      </w:r>
+      <w:r>
+        <w:t>="</w:t>
+      </w:r>
+      <w:proofErr w:type="spellStart"/>
+      <w:r>
+        <w:t>Size.Small</w:t>
       </w:r>
       <w:proofErr w:type="spellEnd"/>
       <w:r>
-        <w:t>="@</w:t>
+        <w:t>"</w:t>
+      </w:r>
+    </w:p>
+    <w:p>
+      <w:pPr>
+        <w:spacing w:after="0" w:line="240" w:lineRule="auto"/>
+      </w:pPr>
+      <w:r>
+        <w:t xml:space="preserve">                     </w:t>
+      </w:r>
+      <w:r>
+        <w:rPr>
+          <w:b/>
+          <w:bCs/>
+        </w:rPr>
+        <w:t>Variant</w:t>
+      </w:r>
+      <w:r>
+        <w:t>="</w:t>
       </w:r>
       <w:proofErr w:type="spellStart"/>
       <w:r>
-        <w:t>GetLegendColor</w:t>
+        <w:t>Variant.Text</w:t>
       </w:r>
       <w:proofErr w:type="spellEnd"/>
       <w:r>
-        <w:t>(</w:t>
+        <w:t>"&gt;</w:t>
+      </w:r>
+    </w:p>
+    <w:p>
+      <w:pPr>
+        <w:spacing w:after="0" w:line="240" w:lineRule="auto"/>
+      </w:pPr>
+      <w:r>
+        <w:t xml:space="preserve">                     @</w:t>
+      </w:r>
+      <w:proofErr w:type="gramStart"/>
+      <w:r>
+        <w:t>legend.UDCDesc</w:t>
+      </w:r>
+      <w:proofErr w:type="gramEnd"/>
+      <w:r>
+        <w:t>1</w:t>
+      </w:r>
+    </w:p>
+    <w:p>
+      <w:pPr>
+        <w:spacing w:after="0" w:line="240" w:lineRule="auto"/>
+      </w:pPr>
+      <w:r>
+        <w:t xml:space="preserve">                 &lt;/</w:t>
+      </w:r>
+      <w:proofErr w:type="spellStart"/>
+      <w:r>
+        <w:rPr>
+          <w:b/>
+          <w:bCs/>
+        </w:rPr>
+        <w:t>MudChip</w:t>
+      </w:r>
+      <w:proofErr w:type="spellEnd"/>
+      <w:r>
+        <w:t>&gt;</w:t>
+      </w:r>
+    </w:p>
+    <w:p>
+      <w:pPr>
+        <w:spacing w:after="0" w:line="240" w:lineRule="auto"/>
+      </w:pPr>
+      <w:r>
+        <w:t xml:space="preserve">             }</w:t>
+      </w:r>
+    </w:p>
+    <w:p>
+      <w:pPr>
+        <w:spacing w:after="0" w:line="240" w:lineRule="auto"/>
+      </w:pPr>
+      <w:r>
+        <w:t xml:space="preserve">         &lt;/</w:t>
+      </w:r>
+      <w:proofErr w:type="spellStart"/>
+      <w:r>
+        <w:rPr>
+          <w:b/>
+          <w:bCs/>
+        </w:rPr>
+        <w:t>MudChipSet</w:t>
+      </w:r>
+      <w:proofErr w:type="spellEnd"/>
+      <w:r>
+        <w:t>&gt;</w:t>
+      </w:r>
+    </w:p>
+    <w:p>
+      <w:pPr>
+        <w:spacing w:after="0" w:line="240" w:lineRule="auto"/>
+      </w:pPr>
+      <w:r>
+        <w:t xml:space="preserve">     &lt;/</w:t>
+      </w:r>
+      <w:proofErr w:type="spellStart"/>
+      <w:r>
+        <w:rPr>
+          <w:b/>
+          <w:bCs/>
+        </w:rPr>
+        <w:t>MudStack</w:t>
+      </w:r>
+      <w:proofErr w:type="spellEnd"/>
+      <w:r>
+        <w:t xml:space="preserve">&gt;                    </w:t>
+      </w:r>
+    </w:p>
+    <w:p>
+      <w:pPr>
+        <w:spacing w:after="0" w:line="240" w:lineRule="auto"/>
+      </w:pPr>
+      <w:r>
+        <w:t xml:space="preserve"> &lt;/</w:t>
+      </w:r>
+      <w:proofErr w:type="spellStart"/>
+      <w:r>
+        <w:rPr>
+          <w:b/>
+          <w:bCs/>
+        </w:rPr>
+        <w:t>MudStack</w:t>
+      </w:r>
+      <w:proofErr w:type="spellEnd"/>
+      <w:r>
+        <w:t>&gt;</w:t>
+      </w:r>
+    </w:p>
+    <w:p>
+      <w:pPr>
+        <w:spacing w:after="0" w:line="240" w:lineRule="auto"/>
+        <w:rPr>
+          <w:u w:val="single"/>
+        </w:rPr>
+      </w:pPr>
+      <w:r>
+        <w:rPr>
+          <w:u w:val="single"/>
+        </w:rPr>
+        <w:t>C# Code-behind:</w:t>
+      </w:r>
+    </w:p>
+    <w:p>
+      <w:pPr>
+        <w:spacing w:after="0" w:line="240" w:lineRule="auto"/>
+      </w:pPr>
+      <w:r>
+        <w:t xml:space="preserve">private </w:t>
+      </w:r>
+      <w:proofErr w:type="spellStart"/>
+      <w:r>
+        <w:t>MudDatePicker</w:t>
+      </w:r>
+      <w:proofErr w:type="spellEnd"/>
+      <w:r>
+        <w:t xml:space="preserve"> _picker;</w:t>
+      </w:r>
+    </w:p>
+    <w:p>
+      <w:pPr>
+        <w:spacing w:after="0" w:line="240" w:lineRule="auto"/>
+      </w:pPr>
+      <w:r>
+        <w:t xml:space="preserve">private </w:t>
+      </w:r>
+      <w:proofErr w:type="spellStart"/>
+      <w:r>
+        <w:t>DateTime</w:t>
+      </w:r>
+      <w:proofErr w:type="spellEnd"/>
+      <w:r>
+        <w:t>? _</w:t>
+      </w:r>
+      <w:proofErr w:type="spellStart"/>
+      <w:r>
+        <w:t>selectedDate</w:t>
+      </w:r>
+      <w:proofErr w:type="spellEnd"/>
+      <w:r>
+        <w:t xml:space="preserve"> = </w:t>
+      </w:r>
+      <w:proofErr w:type="spellStart"/>
+      <w:r>
+        <w:t>DateTime.Today</w:t>
+      </w:r>
+      <w:proofErr w:type="spellEnd"/>
+      <w:r>
+        <w:t xml:space="preserve">;    </w:t>
+      </w:r>
+    </w:p>
+    <w:p>
+      <w:pPr>
+        <w:spacing w:after="0" w:line="240" w:lineRule="auto"/>
+      </w:pPr>
+      <w:r>
+        <w:t>private string _</w:t>
+      </w:r>
+      <w:proofErr w:type="spellStart"/>
+      <w:r>
+        <w:t>pickerStyle</w:t>
+      </w:r>
+      <w:proofErr w:type="spellEnd"/>
+      <w:r>
+        <w:t xml:space="preserve"> = "width: 420px;";</w:t>
+      </w:r>
+    </w:p>
+    <w:p>
+      <w:pPr>
+        <w:spacing w:after="0" w:line="240" w:lineRule="auto"/>
+      </w:pPr>
+      <w:r>
+        <w:t>private Orientation _</w:t>
+      </w:r>
+      <w:proofErr w:type="spellStart"/>
+      <w:r>
+        <w:t>calOrientation</w:t>
+      </w:r>
+      <w:proofErr w:type="spellEnd"/>
+      <w:r>
+        <w:t xml:space="preserve"> = </w:t>
+      </w:r>
+      <w:proofErr w:type="spellStart"/>
+      <w:r>
+        <w:t>Orientation.Landscape</w:t>
+      </w:r>
+      <w:proofErr w:type="spellEnd"/>
+      <w:r>
+        <w:t>;</w:t>
+      </w:r>
+    </w:p>
+    <w:p>
+      <w:pPr>
+        <w:spacing w:after="0" w:line="240" w:lineRule="auto"/>
+      </w:pPr>
+    </w:p>
+    <w:p>
+      <w:pPr>
+        <w:spacing w:after="0" w:line="240" w:lineRule="auto"/>
+      </w:pPr>
+      <w:r>
+        <w:t xml:space="preserve">private void </w:t>
       </w:r>
       <w:proofErr w:type="spellStart"/>
       <w:proofErr w:type="gramStart"/>
       <w:r>
-        <w:t>legend.UDCCode</w:t>
+        <w:t>OnDateChanged</w:t>
+      </w:r>
+      <w:proofErr w:type="spellEnd"/>
+      <w:r>
+        <w:t>(</w:t>
+      </w:r>
+      <w:proofErr w:type="spellStart"/>
+      <w:proofErr w:type="gramEnd"/>
+      <w:r>
+        <w:t>DateTime</w:t>
+      </w:r>
+      <w:proofErr w:type="spellEnd"/>
+      <w:r>
+        <w:t>? date)</w:t>
+      </w:r>
+    </w:p>
+    <w:p>
+      <w:pPr>
+        <w:spacing w:after="0" w:line="240" w:lineRule="auto"/>
+      </w:pPr>
+      <w:r>
+        <w:t>{</w:t>
+      </w:r>
+    </w:p>
+    <w:p>
+      <w:pPr>
+        <w:spacing w:after="0" w:line="240" w:lineRule="auto"/>
+      </w:pPr>
+      <w:r>
+        <w:t xml:space="preserve">    // Set the overlay message</w:t>
+      </w:r>
+    </w:p>
+    <w:p>
+      <w:pPr>
+        <w:spacing w:after="0" w:line="240" w:lineRule="auto"/>
+      </w:pPr>
+      <w:r>
+        <w:t xml:space="preserve">    </w:t>
+      </w:r>
+      <w:proofErr w:type="spellStart"/>
+      <w:r>
+        <w:t>overlayMessage</w:t>
+      </w:r>
+      <w:proofErr w:type="spellEnd"/>
+      <w:r>
+        <w:t xml:space="preserve"> = "Loading attendance details, please wait...";</w:t>
+      </w:r>
+    </w:p>
+    <w:p>
+      <w:pPr>
+        <w:spacing w:after="0" w:line="240" w:lineRule="auto"/>
+      </w:pPr>
+      <w:r>
+        <w:t xml:space="preserve">    </w:t>
+      </w:r>
+    </w:p>
+    <w:p>
+      <w:pPr>
+        <w:spacing w:after="0" w:line="240" w:lineRule="auto"/>
+      </w:pPr>
+      <w:r>
+        <w:t xml:space="preserve">    _ = </w:t>
+      </w:r>
+      <w:proofErr w:type="spellStart"/>
+      <w:proofErr w:type="gramStart"/>
+      <w:r>
+        <w:t>GetAttendanceDetail</w:t>
+      </w:r>
+      <w:proofErr w:type="spellEnd"/>
+      <w:r>
+        <w:t>(</w:t>
+      </w:r>
+      <w:proofErr w:type="gramEnd"/>
+      <w:r>
+        <w:t>async () =&gt;</w:t>
+      </w:r>
+    </w:p>
+    <w:p>
+      <w:pPr>
+        <w:spacing w:after="0" w:line="240" w:lineRule="auto"/>
+      </w:pPr>
+      <w:r>
+        <w:t xml:space="preserve">    {</w:t>
+      </w:r>
+    </w:p>
+    <w:p>
+      <w:pPr>
+        <w:spacing w:after="0" w:line="240" w:lineRule="auto"/>
+      </w:pPr>
+      <w:r>
+        <w:t xml:space="preserve">        //_</w:t>
+      </w:r>
+      <w:proofErr w:type="spellStart"/>
+      <w:r>
+        <w:t>isRunning</w:t>
+      </w:r>
+      <w:proofErr w:type="spellEnd"/>
+      <w:r>
+        <w:t xml:space="preserve"> = false;</w:t>
+      </w:r>
+    </w:p>
+    <w:p>
+      <w:pPr>
+        <w:spacing w:after="0" w:line="240" w:lineRule="auto"/>
+      </w:pPr>
+      <w:r>
+        <w:t xml:space="preserve">        </w:t>
+      </w:r>
+    </w:p>
+    <w:p>
+      <w:pPr>
+        <w:spacing w:after="0" w:line="240" w:lineRule="auto"/>
+      </w:pPr>
+      <w:r>
+        <w:t xml:space="preserve">        // Shows the spinner overlay</w:t>
+      </w:r>
+    </w:p>
+    <w:p>
+      <w:pPr>
+        <w:spacing w:after="0" w:line="240" w:lineRule="auto"/>
+      </w:pPr>
+      <w:r>
+        <w:t xml:space="preserve">        await </w:t>
+      </w:r>
+      <w:proofErr w:type="spellStart"/>
+      <w:proofErr w:type="gramStart"/>
+      <w:r>
+        <w:t>InvokeAsync</w:t>
+      </w:r>
+      <w:proofErr w:type="spellEnd"/>
+      <w:r>
+        <w:t>(</w:t>
+      </w:r>
+      <w:proofErr w:type="spellStart"/>
+      <w:proofErr w:type="gramEnd"/>
+      <w:r>
+        <w:t>StateHasChanged</w:t>
+      </w:r>
+      <w:proofErr w:type="spellEnd"/>
+      <w:proofErr w:type="gramStart"/>
+      <w:r>
+        <w:t>);</w:t>
+      </w:r>
+      <w:proofErr w:type="gramEnd"/>
+    </w:p>
+    <w:p>
+      <w:pPr>
+        <w:spacing w:after="0" w:line="240" w:lineRule="auto"/>
+      </w:pPr>
+    </w:p>
+    <w:p>
+      <w:pPr>
+        <w:spacing w:after="0" w:line="240" w:lineRule="auto"/>
+      </w:pPr>
+      <w:r>
+        <w:t xml:space="preserve">    }, date);</w:t>
+      </w:r>
+    </w:p>
+    <w:p>
+      <w:pPr>
+        <w:spacing w:after="0" w:line="240" w:lineRule="auto"/>
+      </w:pPr>
+      <w:r>
+        <w:t>}</w:t>
+      </w:r>
+    </w:p>
+    <w:p>
+      <w:pPr>
+        <w:spacing w:after="0" w:line="240" w:lineRule="auto"/>
+      </w:pPr>
+    </w:p>
+    <w:p>
+      <w:pPr>
+        <w:spacing w:after="0" w:line="240" w:lineRule="auto"/>
+      </w:pPr>
+      <w:r>
+        <w:t xml:space="preserve">private async Task </w:t>
+      </w:r>
+      <w:proofErr w:type="spellStart"/>
+      <w:proofErr w:type="gramStart"/>
+      <w:r>
+        <w:t>GetAttendanceDetail</w:t>
+      </w:r>
+      <w:proofErr w:type="spellEnd"/>
+      <w:r>
+        <w:t>(</w:t>
+      </w:r>
+      <w:proofErr w:type="gramEnd"/>
+      <w:r>
+        <w:t xml:space="preserve">Func&lt;Task&gt; callback, </w:t>
+      </w:r>
+      <w:proofErr w:type="spellStart"/>
+      <w:r>
+        <w:t>DateTime</w:t>
+      </w:r>
+      <w:proofErr w:type="spellEnd"/>
+      <w:r>
+        <w:t xml:space="preserve">? </w:t>
+      </w:r>
+      <w:proofErr w:type="spellStart"/>
+      <w:r>
+        <w:t>selectedDate</w:t>
+      </w:r>
+      <w:proofErr w:type="spellEnd"/>
+      <w:r>
+        <w:t>)</w:t>
+      </w:r>
+    </w:p>
+    <w:p>
+      <w:pPr>
+        <w:spacing w:after="0" w:line="240" w:lineRule="auto"/>
+      </w:pPr>
+      <w:r>
+        <w:t>{</w:t>
+      </w:r>
+    </w:p>
+    <w:p>
+      <w:pPr>
+        <w:spacing w:after="0" w:line="240" w:lineRule="auto"/>
+      </w:pPr>
+      <w:r>
+        <w:t xml:space="preserve">    try</w:t>
+      </w:r>
+    </w:p>
+    <w:p>
+      <w:pPr>
+        <w:spacing w:after="0" w:line="240" w:lineRule="auto"/>
+      </w:pPr>
+      <w:r>
+        <w:t xml:space="preserve">    {</w:t>
+      </w:r>
+    </w:p>
+    <w:p>
+      <w:pPr>
+        <w:spacing w:after="0" w:line="240" w:lineRule="auto"/>
+      </w:pPr>
+      <w:r>
+        <w:t xml:space="preserve">        _</w:t>
+      </w:r>
+      <w:proofErr w:type="spellStart"/>
+      <w:r>
+        <w:t>selectedDate</w:t>
+      </w:r>
+      <w:proofErr w:type="spellEnd"/>
+      <w:r>
+        <w:t xml:space="preserve"> = </w:t>
+      </w:r>
+      <w:proofErr w:type="spellStart"/>
+      <w:r>
+        <w:t>selectedDate</w:t>
+      </w:r>
+      <w:proofErr w:type="spellEnd"/>
+      <w:r>
+        <w:t>;</w:t>
+      </w:r>
+    </w:p>
+    <w:p>
+      <w:pPr>
+        <w:spacing w:after="0" w:line="240" w:lineRule="auto"/>
+      </w:pPr>
+    </w:p>
+    <w:p>
+      <w:pPr>
+        <w:spacing w:after="0" w:line="240" w:lineRule="auto"/>
+      </w:pPr>
+      <w:r>
+        <w:t xml:space="preserve">        // Wait for 1 second then gives control back to the runtime</w:t>
+      </w:r>
+    </w:p>
+    <w:p>
+      <w:pPr>
+        <w:spacing w:after="0" w:line="240" w:lineRule="auto"/>
+      </w:pPr>
+      <w:r>
+        <w:t xml:space="preserve">        //await </w:t>
+      </w:r>
+      <w:proofErr w:type="spellStart"/>
+      <w:r>
+        <w:t>Task.Delay</w:t>
+      </w:r>
+      <w:proofErr w:type="spellEnd"/>
+      <w:r>
+        <w:t>(500);</w:t>
+      </w:r>
+    </w:p>
+    <w:p>
+      <w:pPr>
+        <w:spacing w:after="0" w:line="240" w:lineRule="auto"/>
+      </w:pPr>
+    </w:p>
+    <w:p>
+      <w:pPr>
+        <w:spacing w:after="0" w:line="240" w:lineRule="auto"/>
+      </w:pPr>
+      <w:r>
+        <w:t xml:space="preserve">        // Reset collections</w:t>
+      </w:r>
+    </w:p>
+    <w:p>
+      <w:pPr>
+        <w:spacing w:after="0" w:line="240" w:lineRule="auto"/>
+      </w:pPr>
+      <w:r>
+        <w:t xml:space="preserve">        _</w:t>
+      </w:r>
+      <w:proofErr w:type="spellStart"/>
+      <w:r>
+        <w:t>errorMessage.Clear</w:t>
+      </w:r>
+      <w:proofErr w:type="spellEnd"/>
+      <w:r>
+        <w:t>();</w:t>
+      </w:r>
+    </w:p>
+    <w:p>
+      <w:pPr>
+        <w:spacing w:after="0" w:line="240" w:lineRule="auto"/>
+      </w:pPr>
+      <w:r>
+        <w:t xml:space="preserve">        _</w:t>
+      </w:r>
+      <w:proofErr w:type="spellStart"/>
+      <w:r>
+        <w:t>attendanceChips.Clear</w:t>
+      </w:r>
+      <w:proofErr w:type="spellEnd"/>
+      <w:r>
+        <w:t>();</w:t>
+      </w:r>
+    </w:p>
+    <w:p>
+      <w:pPr>
+        <w:spacing w:after="0" w:line="240" w:lineRule="auto"/>
+      </w:pPr>
+    </w:p>
+    <w:p>
+      <w:pPr>
+        <w:spacing w:after="0" w:line="240" w:lineRule="auto"/>
+      </w:pPr>
+      <w:r>
+        <w:t xml:space="preserve">        var </w:t>
+      </w:r>
+      <w:proofErr w:type="spellStart"/>
+      <w:r>
+        <w:t>attendanceResult</w:t>
+      </w:r>
+      <w:proofErr w:type="spellEnd"/>
+      <w:r>
+        <w:t xml:space="preserve"> = await </w:t>
+      </w:r>
+      <w:proofErr w:type="spellStart"/>
+      <w:r>
+        <w:t>AttendanceService.GetAttendanceDetailAsync</w:t>
+      </w:r>
+      <w:proofErr w:type="spellEnd"/>
+      <w:r>
+        <w:t>(</w:t>
+      </w:r>
+      <w:proofErr w:type="spellStart"/>
+      <w:r>
+        <w:t>UserEmpNo</w:t>
+      </w:r>
+      <w:proofErr w:type="spellEnd"/>
+      <w:r>
+        <w:t xml:space="preserve">, </w:t>
+      </w:r>
+      <w:proofErr w:type="spellStart"/>
+      <w:proofErr w:type="gramStart"/>
+      <w:r>
+        <w:t>selectedDate</w:t>
+      </w:r>
+      <w:proofErr w:type="spellEnd"/>
+      <w:r>
+        <w:t>!.</w:t>
+      </w:r>
+      <w:proofErr w:type="spellStart"/>
+      <w:proofErr w:type="gramEnd"/>
+      <w:r>
+        <w:t>Value.Date</w:t>
+      </w:r>
+      <w:proofErr w:type="spellEnd"/>
+      <w:proofErr w:type="gramStart"/>
+      <w:r>
+        <w:t>);</w:t>
+      </w:r>
+      <w:proofErr w:type="gramEnd"/>
+    </w:p>
+    <w:p>
+      <w:pPr>
+        <w:spacing w:after="0" w:line="240" w:lineRule="auto"/>
+      </w:pPr>
+      <w:r>
+        <w:t xml:space="preserve">        if (</w:t>
+      </w:r>
+      <w:proofErr w:type="spellStart"/>
+      <w:r>
+        <w:t>attendanceResult.Success</w:t>
+      </w:r>
+      <w:proofErr w:type="spellEnd"/>
+      <w:r>
+        <w:t>)</w:t>
+      </w:r>
+    </w:p>
+    <w:p>
+      <w:pPr>
+        <w:spacing w:after="0" w:line="240" w:lineRule="auto"/>
+      </w:pPr>
+      <w:r>
+        <w:t xml:space="preserve">        {</w:t>
+      </w:r>
+    </w:p>
+    <w:p>
+      <w:pPr>
+        <w:spacing w:after="0" w:line="240" w:lineRule="auto"/>
+      </w:pPr>
+      <w:r>
+        <w:t xml:space="preserve">            _</w:t>
+      </w:r>
+      <w:proofErr w:type="spellStart"/>
+      <w:r>
+        <w:t>attendanceDetail</w:t>
+      </w:r>
+      <w:proofErr w:type="spellEnd"/>
+      <w:r>
+        <w:t xml:space="preserve"> = new </w:t>
+      </w:r>
+      <w:proofErr w:type="spellStart"/>
+      <w:proofErr w:type="gramStart"/>
+      <w:r>
+        <w:t>AttendanceDetailDTO</w:t>
+      </w:r>
+      <w:proofErr w:type="spellEnd"/>
+      <w:r>
+        <w:t>();</w:t>
+      </w:r>
+      <w:proofErr w:type="gramEnd"/>
+    </w:p>
+    <w:p>
+      <w:pPr>
+        <w:spacing w:after="0" w:line="240" w:lineRule="auto"/>
+      </w:pPr>
+      <w:r>
+        <w:t xml:space="preserve">            _</w:t>
+      </w:r>
+      <w:proofErr w:type="spellStart"/>
+      <w:r>
+        <w:t>attendanceDetail</w:t>
+      </w:r>
+      <w:proofErr w:type="spellEnd"/>
+      <w:r>
+        <w:t xml:space="preserve"> = </w:t>
+      </w:r>
+      <w:proofErr w:type="spellStart"/>
+      <w:proofErr w:type="gramStart"/>
+      <w:r>
+        <w:t>attendanceResult</w:t>
+      </w:r>
+      <w:proofErr w:type="spellEnd"/>
+      <w:r>
+        <w:t>!.Value;</w:t>
+      </w:r>
+      <w:proofErr w:type="gramEnd"/>
+    </w:p>
+    <w:p>
+      <w:pPr>
+        <w:spacing w:after="0" w:line="240" w:lineRule="auto"/>
+      </w:pPr>
+    </w:p>
+    <w:p>
+      <w:pPr>
+        <w:spacing w:after="0" w:line="240" w:lineRule="auto"/>
+      </w:pPr>
+      <w:r>
+        <w:t xml:space="preserve">            if (_</w:t>
+      </w:r>
+      <w:proofErr w:type="spellStart"/>
+      <w:proofErr w:type="gramStart"/>
+      <w:r>
+        <w:t>attendanceDetail</w:t>
+      </w:r>
+      <w:proofErr w:type="spellEnd"/>
+      <w:r>
+        <w:t xml:space="preserve"> !</w:t>
+      </w:r>
+      <w:proofErr w:type="gramEnd"/>
+      <w:r>
+        <w:t>= null)</w:t>
+      </w:r>
+    </w:p>
+    <w:p>
+      <w:pPr>
+        <w:spacing w:after="0" w:line="240" w:lineRule="auto"/>
+      </w:pPr>
+      <w:r>
+        <w:t xml:space="preserve">            {</w:t>
+      </w:r>
+    </w:p>
+    <w:p>
+      <w:pPr>
+        <w:spacing w:after="0" w:line="240" w:lineRule="auto"/>
+      </w:pPr>
+      <w:r>
+        <w:t xml:space="preserve">                #region Get the First Time </w:t>
+      </w:r>
+      <w:proofErr w:type="gramStart"/>
+      <w:r>
+        <w:t>In</w:t>
+      </w:r>
+      <w:proofErr w:type="gramEnd"/>
+      <w:r>
+        <w:t xml:space="preserve"> and Last Time Out</w:t>
+      </w:r>
+    </w:p>
+    <w:p>
+      <w:pPr>
+        <w:spacing w:after="0" w:line="240" w:lineRule="auto"/>
+      </w:pPr>
+      <w:r>
+        <w:t xml:space="preserve">                if (_</w:t>
+      </w:r>
+      <w:proofErr w:type="spellStart"/>
+      <w:proofErr w:type="gramStart"/>
+      <w:r>
+        <w:t>attendanceDetail.FirstTimeIn.HasValue</w:t>
       </w:r>
       <w:proofErr w:type="spellEnd"/>
       <w:proofErr w:type="gramEnd"/>
       <w:r>
-        <w:t>)"</w:t>
-      </w:r>
-    </w:p>
-    <w:p>
-      <w:pPr>
-        <w:spacing w:after="0" w:line="240" w:lineRule="auto"/>
-      </w:pPr>
-      <w:r>
-        <w:t xml:space="preserve">                     </w:t>
-      </w:r>
-      <w:r>
-        <w:rPr>
-          <w:b/>
-          <w:bCs/>
-        </w:rPr>
-        <w:t>Size</w:t>
-      </w:r>
-      <w:r>
-        <w:t>="</w:t>
+        <w:t>)</w:t>
+      </w:r>
+    </w:p>
+    <w:p>
+      <w:pPr>
+        <w:spacing w:after="0" w:line="240" w:lineRule="auto"/>
+      </w:pPr>
+      <w:r>
+        <w:t xml:space="preserve">                    _</w:t>
       </w:r>
       <w:proofErr w:type="spellStart"/>
       <w:r>
-        <w:t>Size.Small</w:t>
+        <w:t>firstTimeIn</w:t>
       </w:r>
       <w:proofErr w:type="spellEnd"/>
       <w:r>
-        <w:t>"</w:t>
-      </w:r>
-    </w:p>
-    <w:p>
-      <w:pPr>
-        <w:spacing w:after="0" w:line="240" w:lineRule="auto"/>
-      </w:pPr>
-      <w:r>
-        <w:t xml:space="preserve">                     </w:t>
-      </w:r>
-      <w:r>
-        <w:rPr>
-          <w:b/>
-          <w:bCs/>
-        </w:rPr>
-        <w:t>Variant</w:t>
-      </w:r>
-      <w:r>
-        <w:t>="</w:t>
-      </w:r>
-      <w:proofErr w:type="spellStart"/>
-      <w:r>
-        <w:t>Variant.Text</w:t>
-      </w:r>
-      <w:proofErr w:type="spellEnd"/>
-      <w:r>
-        <w:t>"&gt;</w:t>
-      </w:r>
-    </w:p>
-    <w:p>
-      <w:pPr>
-        <w:spacing w:after="0" w:line="240" w:lineRule="auto"/>
-      </w:pPr>
-      <w:r>
-        <w:t xml:space="preserve">                     @</w:t>
+        <w:t xml:space="preserve"> = $"{_attendanceDetail.FirstTimeIn:</w:t>
       </w:r>
       <w:proofErr w:type="gramStart"/>
       <w:r>
-        <w:t>legend.UDCDesc</w:t>
+        <w:t>dd}{GetOrdinal(</w:t>
       </w:r>
       <w:proofErr w:type="gramEnd"/>
       <w:r>
-        <w:t>1</w:t>
-      </w:r>
-    </w:p>
-    <w:p>
-      <w:pPr>
-        <w:spacing w:after="0" w:line="240" w:lineRule="auto"/>
-      </w:pPr>
-      <w:r>
-        <w:t xml:space="preserve">                 &lt;/</w:t>
-      </w:r>
-      <w:proofErr w:type="spellStart"/>
-      <w:r>
-        <w:rPr>
-          <w:b/>
-          <w:bCs/>
-        </w:rPr>
-        <w:t>MudChip</w:t>
-      </w:r>
-      <w:proofErr w:type="spellEnd"/>
-      <w:r>
-        <w:t>&gt;</w:t>
-      </w:r>
-    </w:p>
-    <w:p>
-      <w:pPr>
-        <w:spacing w:after="0" w:line="240" w:lineRule="auto"/>
-      </w:pPr>
-      <w:r>
-        <w:t xml:space="preserve">             }</w:t>
-      </w:r>
-    </w:p>
-    <w:p>
-      <w:pPr>
-        <w:spacing w:after="0" w:line="240" w:lineRule="auto"/>
-      </w:pPr>
-      <w:r>
-        <w:t xml:space="preserve">         &lt;/</w:t>
-      </w:r>
-      <w:proofErr w:type="spellStart"/>
-      <w:r>
-        <w:rPr>
-          <w:b/>
-          <w:bCs/>
-        </w:rPr>
-        <w:t>MudChipSet</w:t>
-      </w:r>
-      <w:proofErr w:type="spellEnd"/>
-      <w:r>
-        <w:t>&gt;</w:t>
-      </w:r>
-    </w:p>
-    <w:p>
-      <w:pPr>
-        <w:spacing w:after="0" w:line="240" w:lineRule="auto"/>
-      </w:pPr>
-      <w:r>
-        <w:t xml:space="preserve">     &lt;/</w:t>
-      </w:r>
-      <w:proofErr w:type="spellStart"/>
-      <w:r>
-        <w:rPr>
-          <w:b/>
-          <w:bCs/>
-        </w:rPr>
-        <w:t>MudStack</w:t>
-      </w:r>
-      <w:proofErr w:type="spellEnd"/>
-      <w:r>
-        <w:t xml:space="preserve">&gt;                    </w:t>
-      </w:r>
-    </w:p>
-    <w:p>
-      <w:pPr>
-        <w:spacing w:after="0" w:line="240" w:lineRule="auto"/>
-      </w:pPr>
-      <w:r>
-        <w:t xml:space="preserve"> &lt;/</w:t>
-      </w:r>
-      <w:proofErr w:type="spellStart"/>
-      <w:r>
-        <w:rPr>
-          <w:b/>
-          <w:bCs/>
-        </w:rPr>
-        <w:t>MudStack</w:t>
-      </w:r>
-      <w:proofErr w:type="spellEnd"/>
-      <w:r>
-        <w:t>&gt;</w:t>
-      </w:r>
-    </w:p>
-    <w:p>
-      <w:pPr>
-        <w:spacing w:after="0" w:line="240" w:lineRule="auto"/>
-        <w:rPr>
-          <w:u w:val="single"/>
-        </w:rPr>
-      </w:pPr>
-      <w:r>
-        <w:rPr>
-          <w:u w:val="single"/>
-        </w:rPr>
-        <w:t>C# Code-behind:</w:t>
-      </w:r>
-    </w:p>
-    <w:p>
-      <w:pPr>
-        <w:spacing w:after="0" w:line="240" w:lineRule="auto"/>
-      </w:pPr>
-      <w:r>
-        <w:t xml:space="preserve">private </w:t>
-      </w:r>
-      <w:proofErr w:type="spellStart"/>
-      <w:r>
-        <w:t>MudDatePicker</w:t>
-      </w:r>
-      <w:proofErr w:type="spellEnd"/>
-      <w:r>
-        <w:t xml:space="preserve"> _picker;</w:t>
-      </w:r>
-    </w:p>
-    <w:p>
-      <w:pPr>
-        <w:spacing w:after="0" w:line="240" w:lineRule="auto"/>
-      </w:pPr>
-      <w:r>
-        <w:t xml:space="preserve">private </w:t>
-      </w:r>
-      <w:proofErr w:type="spellStart"/>
-      <w:r>
-        <w:t>DateTime</w:t>
-      </w:r>
-      <w:proofErr w:type="spellEnd"/>
-      <w:r>
-        <w:t>? _</w:t>
-      </w:r>
-      <w:proofErr w:type="spellStart"/>
-      <w:r>
-        <w:t>selectedDate</w:t>
-      </w:r>
-      <w:proofErr w:type="spellEnd"/>
-      <w:r>
-        <w:t xml:space="preserve"> = </w:t>
-      </w:r>
-      <w:proofErr w:type="spellStart"/>
-      <w:r>
-        <w:t>DateTime.Today</w:t>
-      </w:r>
-      <w:proofErr w:type="spellEnd"/>
-      <w:r>
-        <w:t xml:space="preserve">;    </w:t>
-      </w:r>
-    </w:p>
-    <w:p>
-      <w:pPr>
-        <w:spacing w:after="0" w:line="240" w:lineRule="auto"/>
-      </w:pPr>
-      <w:r>
-        <w:t>private string _</w:t>
-      </w:r>
-      <w:proofErr w:type="spellStart"/>
-      <w:r>
-        <w:t>pickerStyle</w:t>
-      </w:r>
-      <w:proofErr w:type="spellEnd"/>
-      <w:r>
-        <w:t xml:space="preserve"> = "width: 420px;";</w:t>
-      </w:r>
-    </w:p>
-    <w:p>
-      <w:pPr>
-        <w:spacing w:after="0" w:line="240" w:lineRule="auto"/>
-      </w:pPr>
-      <w:r>
-        <w:t>private Orientation _</w:t>
-      </w:r>
-      <w:proofErr w:type="spellStart"/>
-      <w:r>
-        <w:t>calOrientation</w:t>
-      </w:r>
-      <w:proofErr w:type="spellEnd"/>
-      <w:r>
-        <w:t xml:space="preserve"> = </w:t>
-      </w:r>
-      <w:proofErr w:type="spellStart"/>
-      <w:r>
-        <w:t>Orientation.Landscape</w:t>
-      </w:r>
-      <w:proofErr w:type="spellEnd"/>
-      <w:r>
-        <w:t>;</w:t>
-      </w:r>
-    </w:p>
-    <w:p>
-      <w:pPr>
-        <w:spacing w:after="0" w:line="240" w:lineRule="auto"/>
-      </w:pPr>
-    </w:p>
-    <w:p>
-      <w:pPr>
-        <w:spacing w:after="0" w:line="240" w:lineRule="auto"/>
-      </w:pPr>
-      <w:r>
-        <w:t xml:space="preserve">private void </w:t>
+        <w:t>_</w:t>
+      </w:r>
+      <w:proofErr w:type="gramStart"/>
+      <w:r>
+        <w:t>attendanceDetail.FirstTimeIn.Value.Day</w:t>
+      </w:r>
+      <w:proofErr w:type="gramEnd"/>
+      <w:r>
+        <w:t>)} {_</w:t>
       </w:r>
       <w:proofErr w:type="spellStart"/>
       <w:proofErr w:type="gramStart"/>
       <w:r>
-        <w:t>OnDateChanged</w:t>
+        <w:t>attendanceDetail.FirstTimeIn:MMM</w:t>
       </w:r>
       <w:proofErr w:type="spellEnd"/>
+      <w:proofErr w:type="gramEnd"/>
+      <w:r>
+        <w:t xml:space="preserve"> </w:t>
+      </w:r>
+      <w:proofErr w:type="spellStart"/>
+      <w:r>
+        <w:t>yyyy</w:t>
+      </w:r>
+      <w:proofErr w:type="spellEnd"/>
+      <w:r>
+        <w:t xml:space="preserve"> </w:t>
+      </w:r>
+      <w:proofErr w:type="spellStart"/>
+      <w:r>
+        <w:t>hh:</w:t>
+      </w:r>
+      <w:proofErr w:type="gramStart"/>
+      <w:r>
+        <w:t>mm:ss</w:t>
+      </w:r>
+      <w:proofErr w:type="spellEnd"/>
+      <w:proofErr w:type="gramEnd"/>
+      <w:r>
+        <w:t xml:space="preserve"> tt}</w:t>
+      </w:r>
+      <w:proofErr w:type="gramStart"/>
+      <w:r>
+        <w:t>";</w:t>
+      </w:r>
+      <w:proofErr w:type="gramEnd"/>
+    </w:p>
+    <w:p>
+      <w:pPr>
+        <w:spacing w:after="0" w:line="240" w:lineRule="auto"/>
+      </w:pPr>
+      <w:r>
+        <w:t xml:space="preserve">                else</w:t>
+      </w:r>
+    </w:p>
+    <w:p>
+      <w:pPr>
+        <w:spacing w:after="0" w:line="240" w:lineRule="auto"/>
+      </w:pPr>
+      <w:r>
+        <w:t xml:space="preserve">                    _</w:t>
+      </w:r>
+      <w:proofErr w:type="spellStart"/>
+      <w:r>
+        <w:t>firstTimeIn</w:t>
+      </w:r>
+      <w:proofErr w:type="spellEnd"/>
+      <w:r>
+        <w:t xml:space="preserve"> = </w:t>
+      </w:r>
+      <w:proofErr w:type="spellStart"/>
+      <w:proofErr w:type="gramStart"/>
+      <w:r>
+        <w:t>string.Empty</w:t>
+      </w:r>
+      <w:proofErr w:type="spellEnd"/>
+      <w:proofErr w:type="gramEnd"/>
+      <w:r>
+        <w:t>;</w:t>
+      </w:r>
+    </w:p>
+    <w:p>
+      <w:pPr>
+        <w:spacing w:after="0" w:line="240" w:lineRule="auto"/>
+      </w:pPr>
+    </w:p>
+    <w:p>
+      <w:pPr>
+        <w:spacing w:after="0" w:line="240" w:lineRule="auto"/>
+      </w:pPr>
+      <w:r>
+        <w:t xml:space="preserve">                if (_</w:t>
+      </w:r>
+      <w:proofErr w:type="spellStart"/>
+      <w:proofErr w:type="gramStart"/>
+      <w:r>
+        <w:t>attendanceDetail.LastTimeOut.HasValue</w:t>
+      </w:r>
+      <w:proofErr w:type="spellEnd"/>
+      <w:proofErr w:type="gramEnd"/>
+      <w:r>
+        <w:t>)</w:t>
+      </w:r>
+    </w:p>
+    <w:p>
+      <w:pPr>
+        <w:spacing w:after="0" w:line="240" w:lineRule="auto"/>
+      </w:pPr>
+      <w:r>
+        <w:t xml:space="preserve">                    _</w:t>
+      </w:r>
+      <w:proofErr w:type="spellStart"/>
+      <w:r>
+        <w:t>lastTimeOut</w:t>
+      </w:r>
+      <w:proofErr w:type="spellEnd"/>
+      <w:r>
+        <w:t xml:space="preserve"> = $"{_attendanceDetail.LastTimeOut:</w:t>
+      </w:r>
+      <w:proofErr w:type="gramStart"/>
+      <w:r>
+        <w:t>dd}{GetOrdinal(</w:t>
+      </w:r>
+      <w:proofErr w:type="gramEnd"/>
+      <w:r>
+        <w:t>_</w:t>
+      </w:r>
+      <w:proofErr w:type="gramStart"/>
+      <w:r>
+        <w:t>attendanceDetail.LastTimeOut.Value.Day</w:t>
+      </w:r>
+      <w:proofErr w:type="gramEnd"/>
+      <w:r>
+        <w:t>)} {_</w:t>
+      </w:r>
+      <w:proofErr w:type="spellStart"/>
+      <w:proofErr w:type="gramStart"/>
+      <w:r>
+        <w:t>attendanceDetail.LastTimeOut:MMM</w:t>
+      </w:r>
+      <w:proofErr w:type="spellEnd"/>
+      <w:proofErr w:type="gramEnd"/>
+      <w:r>
+        <w:t xml:space="preserve"> </w:t>
+      </w:r>
+      <w:proofErr w:type="spellStart"/>
+      <w:r>
+        <w:t>yyyy</w:t>
+      </w:r>
+      <w:proofErr w:type="spellEnd"/>
+      <w:r>
+        <w:t xml:space="preserve"> </w:t>
+      </w:r>
+      <w:proofErr w:type="spellStart"/>
+      <w:r>
+        <w:t>hh:</w:t>
+      </w:r>
+      <w:proofErr w:type="gramStart"/>
+      <w:r>
+        <w:t>mm:ss</w:t>
+      </w:r>
+      <w:proofErr w:type="spellEnd"/>
+      <w:proofErr w:type="gramEnd"/>
+      <w:r>
+        <w:t xml:space="preserve"> tt}</w:t>
+      </w:r>
+      <w:proofErr w:type="gramStart"/>
+      <w:r>
+        <w:t>";</w:t>
+      </w:r>
+      <w:proofErr w:type="gramEnd"/>
+    </w:p>
+    <w:p>
+      <w:pPr>
+        <w:spacing w:after="0" w:line="240" w:lineRule="auto"/>
+      </w:pPr>
+      <w:r>
+        <w:t xml:space="preserve">                else</w:t>
+      </w:r>
+    </w:p>
+    <w:p>
+      <w:pPr>
+        <w:spacing w:after="0" w:line="240" w:lineRule="auto"/>
+      </w:pPr>
+      <w:r>
+        <w:t xml:space="preserve">                    _</w:t>
+      </w:r>
+      <w:proofErr w:type="spellStart"/>
+      <w:r>
+        <w:t>lastTimeOut</w:t>
+      </w:r>
+      <w:proofErr w:type="spellEnd"/>
+      <w:r>
+        <w:t xml:space="preserve"> = </w:t>
+      </w:r>
+      <w:proofErr w:type="spellStart"/>
+      <w:proofErr w:type="gramStart"/>
+      <w:r>
+        <w:t>string.Empty</w:t>
+      </w:r>
+      <w:proofErr w:type="spellEnd"/>
+      <w:proofErr w:type="gramEnd"/>
+      <w:r>
+        <w:t>;</w:t>
+      </w:r>
+    </w:p>
+    <w:p>
+      <w:pPr>
+        <w:spacing w:after="0" w:line="240" w:lineRule="auto"/>
+      </w:pPr>
+    </w:p>
+    <w:p>
+      <w:pPr>
+        <w:spacing w:after="0" w:line="240" w:lineRule="auto"/>
+      </w:pPr>
+      <w:r>
+        <w:t xml:space="preserve">                _</w:t>
+      </w:r>
+      <w:proofErr w:type="spellStart"/>
+      <w:r>
+        <w:t>isPunchedIn</w:t>
+      </w:r>
+      <w:proofErr w:type="spellEnd"/>
+      <w:r>
+        <w:t xml:space="preserve"> = _</w:t>
+      </w:r>
+      <w:proofErr w:type="spellStart"/>
+      <w:r>
+        <w:t>attendanceDetail.SwipeType</w:t>
+      </w:r>
+      <w:proofErr w:type="spellEnd"/>
+      <w:r>
+        <w:t xml:space="preserve"> == "IN</w:t>
+      </w:r>
+      <w:proofErr w:type="gramStart"/>
+      <w:r>
+        <w:t>" ?</w:t>
+      </w:r>
+      <w:proofErr w:type="gramEnd"/>
+      <w:r>
+        <w:t xml:space="preserve"> </w:t>
+      </w:r>
+      <w:proofErr w:type="gramStart"/>
+      <w:r>
+        <w:t>true :</w:t>
+      </w:r>
+      <w:proofErr w:type="gramEnd"/>
+      <w:r>
+        <w:t xml:space="preserve"> </w:t>
+      </w:r>
+      <w:proofErr w:type="gramStart"/>
+      <w:r>
+        <w:t>false;</w:t>
+      </w:r>
+      <w:proofErr w:type="gramEnd"/>
+    </w:p>
+    <w:p>
+      <w:pPr>
+        <w:spacing w:after="0" w:line="240" w:lineRule="auto"/>
+      </w:pPr>
+      <w:r>
+        <w:t xml:space="preserve">                #endregion</w:t>
+      </w:r>
+    </w:p>
+    <w:p>
+      <w:pPr>
+        <w:spacing w:after="0" w:line="240" w:lineRule="auto"/>
+      </w:pPr>
+    </w:p>
+    <w:p>
+      <w:pPr>
+        <w:spacing w:after="0" w:line="240" w:lineRule="auto"/>
+      </w:pPr>
+      <w:r>
+        <w:t xml:space="preserve">                #region Get Attendance Duration</w:t>
+      </w:r>
+    </w:p>
+    <w:p>
+      <w:pPr>
+        <w:spacing w:after="0" w:line="240" w:lineRule="auto"/>
+      </w:pPr>
+      <w:r>
+        <w:t xml:space="preserve">                var </w:t>
+      </w:r>
+      <w:proofErr w:type="spellStart"/>
+      <w:r>
+        <w:t>durationResult</w:t>
+      </w:r>
+      <w:proofErr w:type="spellEnd"/>
+      <w:r>
+        <w:t xml:space="preserve"> = </w:t>
+      </w:r>
+      <w:proofErr w:type="gramStart"/>
+      <w:r>
+        <w:t>await</w:t>
+      </w:r>
+      <w:proofErr w:type="gramEnd"/>
+      <w:r>
+        <w:t xml:space="preserve"> </w:t>
+      </w:r>
+      <w:proofErr w:type="spellStart"/>
+      <w:r>
+        <w:t>AttendanceService.GetAttendanceDurationAsync</w:t>
+      </w:r>
+      <w:proofErr w:type="spellEnd"/>
       <w:r>
         <w:t>(</w:t>
+      </w:r>
+      <w:proofErr w:type="spellStart"/>
+      <w:r>
+        <w:t>UserEmpNo</w:t>
+      </w:r>
+      <w:proofErr w:type="spellEnd"/>
+      <w:r>
+        <w:t xml:space="preserve">, </w:t>
+      </w:r>
+      <w:proofErr w:type="spellStart"/>
+      <w:proofErr w:type="gramStart"/>
+      <w:r>
+        <w:t>selectedDate</w:t>
+      </w:r>
+      <w:proofErr w:type="spellEnd"/>
+      <w:r>
+        <w:t>!.</w:t>
       </w:r>
       <w:proofErr w:type="spellStart"/>
       <w:proofErr w:type="gramEnd"/>
       <w:r>
-        <w:t>DateTime</w:t>
+        <w:t>Value.Date</w:t>
       </w:r>
       <w:proofErr w:type="spellEnd"/>
-      <w:r>
-        <w:t>? date)</w:t>
-      </w:r>
-    </w:p>
-    <w:p>
-      <w:pPr>
-        <w:spacing w:after="0" w:line="240" w:lineRule="auto"/>
-      </w:pPr>
-      <w:r>
-        <w:t>{</w:t>
-      </w:r>
-    </w:p>
-    <w:p>
-      <w:pPr>
-        <w:spacing w:after="0" w:line="240" w:lineRule="auto"/>
-      </w:pPr>
-      <w:r>
-        <w:t xml:space="preserve">    // Set the overlay message</w:t>
-      </w:r>
-    </w:p>
-    <w:p>
-      <w:pPr>
-        <w:spacing w:after="0" w:line="240" w:lineRule="auto"/>
-      </w:pPr>
-      <w:r>
-        <w:t xml:space="preserve">    </w:t>
+      <w:proofErr w:type="gramStart"/>
+      <w:r>
+        <w:t>);</w:t>
+      </w:r>
+      <w:proofErr w:type="gramEnd"/>
+    </w:p>
+    <w:p>
+      <w:pPr>
+        <w:spacing w:after="0" w:line="240" w:lineRule="auto"/>
+      </w:pPr>
+      <w:r>
+        <w:lastRenderedPageBreak/>
+        <w:t xml:space="preserve">                if (</w:t>
       </w:r>
       <w:proofErr w:type="spellStart"/>
       <w:r>
-        <w:t>overlayMessage</w:t>
+        <w:t>durationResult.Success</w:t>
       </w:r>
       <w:proofErr w:type="spellEnd"/>
       <w:r>
-        <w:t xml:space="preserve"> = "Loading attendance details, please wait...";</w:t>
-      </w:r>
-    </w:p>
-    <w:p>
-      <w:pPr>
-        <w:spacing w:after="0" w:line="240" w:lineRule="auto"/>
-      </w:pPr>
-      <w:r>
-        <w:t xml:space="preserve">    </w:t>
-      </w:r>
-    </w:p>
-    <w:p>
-      <w:pPr>
-        <w:spacing w:after="0" w:line="240" w:lineRule="auto"/>
-      </w:pPr>
-      <w:r>
-        <w:t xml:space="preserve">    _ = </w:t>
+        <w:t>)</w:t>
+      </w:r>
+    </w:p>
+    <w:p>
+      <w:pPr>
+        <w:spacing w:after="0" w:line="240" w:lineRule="auto"/>
+      </w:pPr>
+      <w:r>
+        <w:t xml:space="preserve">                    _</w:t>
+      </w:r>
+      <w:proofErr w:type="spellStart"/>
+      <w:r>
+        <w:t>attendanceDuration</w:t>
+      </w:r>
+      <w:proofErr w:type="spellEnd"/>
+      <w:r>
+        <w:t xml:space="preserve"> = </w:t>
       </w:r>
       <w:proofErr w:type="spellStart"/>
       <w:proofErr w:type="gramStart"/>
       <w:r>
-        <w:t>GetAttendanceDetail</w:t>
+        <w:t>durationResult</w:t>
       </w:r>
       <w:proofErr w:type="spellEnd"/>
       <w:r>
+        <w:t>!.Value;</w:t>
+      </w:r>
+      <w:proofErr w:type="gramEnd"/>
+    </w:p>
+    <w:p>
+      <w:pPr>
+        <w:spacing w:after="0" w:line="240" w:lineRule="auto"/>
+      </w:pPr>
+      <w:r>
+        <w:t xml:space="preserve">                else</w:t>
+      </w:r>
+    </w:p>
+    <w:p>
+      <w:pPr>
+        <w:spacing w:after="0" w:line="240" w:lineRule="auto"/>
+      </w:pPr>
+      <w:r>
+        <w:t xml:space="preserve">                    _</w:t>
+      </w:r>
+      <w:proofErr w:type="spellStart"/>
+      <w:r>
+        <w:t>errorMessage.Append</w:t>
+      </w:r>
+      <w:proofErr w:type="spellEnd"/>
+      <w:r>
         <w:t>(</w:t>
       </w:r>
-      <w:proofErr w:type="gramEnd"/>
-      <w:r>
-        <w:t>async () =&gt;</w:t>
-      </w:r>
-    </w:p>
-    <w:p>
-      <w:pPr>
-        <w:spacing w:after="0" w:line="240" w:lineRule="auto"/>
-      </w:pPr>
-      <w:r>
-        <w:t xml:space="preserve">    {</w:t>
-      </w:r>
-    </w:p>
-    <w:p>
-      <w:pPr>
-        <w:spacing w:after="0" w:line="240" w:lineRule="auto"/>
-      </w:pPr>
-      <w:r>
-        <w:t xml:space="preserve">        //_</w:t>
-      </w:r>
       <w:proofErr w:type="spellStart"/>
       <w:r>
-        <w:t>isRunning</w:t>
+        <w:t>durationResult.Error</w:t>
       </w:r>
       <w:proofErr w:type="spellEnd"/>
       <w:r>
-        <w:t xml:space="preserve"> = false;</w:t>
-      </w:r>
-    </w:p>
-    <w:p>
-      <w:pPr>
-        <w:spacing w:after="0" w:line="240" w:lineRule="auto"/>
-      </w:pPr>
-      <w:r>
-        <w:t xml:space="preserve">        </w:t>
-      </w:r>
-    </w:p>
-    <w:p>
-      <w:pPr>
-        <w:spacing w:after="0" w:line="240" w:lineRule="auto"/>
-      </w:pPr>
-      <w:r>
-        <w:t xml:space="preserve">        // Shows the spinner overlay</w:t>
-      </w:r>
-    </w:p>
-    <w:p>
-      <w:pPr>
-        <w:spacing w:after="0" w:line="240" w:lineRule="auto"/>
-      </w:pPr>
-      <w:r>
-        <w:t xml:space="preserve">        await </w:t>
+        <w:t>);</w:t>
+      </w:r>
+    </w:p>
+    <w:p>
+      <w:pPr>
+        <w:spacing w:after="0" w:line="240" w:lineRule="auto"/>
+      </w:pPr>
+      <w:r>
+        <w:t xml:space="preserve">                #endregion</w:t>
+      </w:r>
+    </w:p>
+    <w:p>
+      <w:pPr>
+        <w:spacing w:after="0" w:line="240" w:lineRule="auto"/>
+      </w:pPr>
+    </w:p>
+    <w:p>
+      <w:pPr>
+        <w:spacing w:after="0" w:line="240" w:lineRule="auto"/>
+      </w:pPr>
+      <w:r>
+        <w:t xml:space="preserve">                #region Populate the raw swipe chips</w:t>
+      </w:r>
+    </w:p>
+    <w:p>
+      <w:pPr>
+        <w:spacing w:after="0" w:line="240" w:lineRule="auto"/>
+      </w:pPr>
+      <w:r>
+        <w:t xml:space="preserve">                if (_</w:t>
       </w:r>
       <w:proofErr w:type="spellStart"/>
       <w:proofErr w:type="gramStart"/>
       <w:r>
-        <w:t>InvokeAsync</w:t>
+        <w:t>attendanceDetail.SwipeLogList</w:t>
       </w:r>
       <w:proofErr w:type="spellEnd"/>
       <w:r>
-        <w:t>(</w:t>
-      </w:r>
-      <w:proofErr w:type="spellStart"/>
+        <w:t xml:space="preserve"> !</w:t>
+      </w:r>
       <w:proofErr w:type="gramEnd"/>
       <w:r>
-        <w:t>StateHasChanged</w:t>
-      </w:r>
-      <w:proofErr w:type="spellEnd"/>
-      <w:r>
-        <w:t>);</w:t>
-      </w:r>
-    </w:p>
-    <w:p>
-      <w:pPr>
-        <w:spacing w:after="0" w:line="240" w:lineRule="auto"/>
-      </w:pPr>
-    </w:p>
-    <w:p>
-      <w:pPr>
-        <w:spacing w:after="0" w:line="240" w:lineRule="auto"/>
-      </w:pPr>
-      <w:r>
-        <w:t xml:space="preserve">    }, date);</w:t>
-      </w:r>
-    </w:p>
-    <w:p>
-      <w:pPr>
-        <w:spacing w:after="0" w:line="240" w:lineRule="auto"/>
-      </w:pPr>
-      <w:r>
-        <w:t>}</w:t>
-      </w:r>
-    </w:p>
-    <w:p>
-      <w:pPr>
-        <w:spacing w:after="0" w:line="240" w:lineRule="auto"/>
-      </w:pPr>
-    </w:p>
-    <w:p>
-      <w:pPr>
-        <w:spacing w:after="0" w:line="240" w:lineRule="auto"/>
-      </w:pPr>
-      <w:r>
-        <w:t xml:space="preserve">private async Task </w:t>
+        <w:t>= null &amp;&amp; _</w:t>
       </w:r>
       <w:proofErr w:type="spellStart"/>
       <w:proofErr w:type="gramStart"/>
       <w:r>
-        <w:t>GetAttendanceDetail</w:t>
+        <w:t>attendanceDetail.SwipeLogList.Any</w:t>
       </w:r>
       <w:proofErr w:type="spellEnd"/>
+      <w:proofErr w:type="gramEnd"/>
+      <w:r>
+        <w:t>())</w:t>
+      </w:r>
+    </w:p>
+    <w:p>
+      <w:pPr>
+        <w:spacing w:after="0" w:line="240" w:lineRule="auto"/>
+      </w:pPr>
+      <w:r>
+        <w:t xml:space="preserve">                    _attendanceChips.AddRange(_</w:t>
+      </w:r>
+      <w:proofErr w:type="gramStart"/>
+      <w:r>
+        <w:t>attendanceDetail.SwipeLogList.ToList</w:t>
+      </w:r>
+      <w:proofErr w:type="gramEnd"/>
+      <w:r>
+        <w:t>()</w:t>
+      </w:r>
+      <w:proofErr w:type="gramStart"/>
+      <w:r>
+        <w:t>);</w:t>
+      </w:r>
+      <w:proofErr w:type="gramEnd"/>
+    </w:p>
+    <w:p>
+      <w:pPr>
+        <w:spacing w:after="0" w:line="240" w:lineRule="auto"/>
+      </w:pPr>
+      <w:r>
+        <w:t xml:space="preserve">                #endregion</w:t>
+      </w:r>
+    </w:p>
+    <w:p>
+      <w:pPr>
+        <w:spacing w:after="0" w:line="240" w:lineRule="auto"/>
+      </w:pPr>
+      <w:r>
+        <w:t xml:space="preserve">            }</w:t>
+      </w:r>
+    </w:p>
+    <w:p>
+      <w:pPr>
+        <w:spacing w:after="0" w:line="240" w:lineRule="auto"/>
+      </w:pPr>
+      <w:r>
+        <w:t xml:space="preserve">        }</w:t>
+      </w:r>
+    </w:p>
+    <w:p>
+      <w:pPr>
+        <w:spacing w:after="0" w:line="240" w:lineRule="auto"/>
+      </w:pPr>
+      <w:r>
+        <w:t xml:space="preserve">        else</w:t>
+      </w:r>
+    </w:p>
+    <w:p>
+      <w:pPr>
+        <w:spacing w:after="0" w:line="240" w:lineRule="auto"/>
+      </w:pPr>
+      <w:r>
+        <w:t xml:space="preserve">            _</w:t>
+      </w:r>
+      <w:proofErr w:type="spellStart"/>
+      <w:r>
+        <w:t>errorMessage.Append</w:t>
+      </w:r>
+      <w:proofErr w:type="spellEnd"/>
       <w:r>
         <w:t>(</w:t>
       </w:r>
+      <w:proofErr w:type="spellStart"/>
+      <w:r>
+        <w:t>attendanceResult.Error</w:t>
+      </w:r>
+      <w:proofErr w:type="spellEnd"/>
+      <w:r>
+        <w:t>);</w:t>
+      </w:r>
+    </w:p>
+    <w:p>
+      <w:pPr>
+        <w:spacing w:after="0" w:line="240" w:lineRule="auto"/>
+      </w:pPr>
+    </w:p>
+    <w:p>
+      <w:pPr>
+        <w:spacing w:after="0" w:line="240" w:lineRule="auto"/>
+      </w:pPr>
+      <w:r>
+        <w:t xml:space="preserve">        if (</w:t>
+      </w:r>
+      <w:proofErr w:type="gramStart"/>
+      <w:r>
+        <w:t>callback !</w:t>
+      </w:r>
       <w:proofErr w:type="gramEnd"/>
       <w:r>
-        <w:t xml:space="preserve">Func&lt;Task&gt; callback, </w:t>
-      </w:r>
-      <w:proofErr w:type="spellStart"/>
-      <w:r>
-        <w:t>DateTime</w:t>
-      </w:r>
-      <w:proofErr w:type="spellEnd"/>
-      <w:r>
-        <w:t xml:space="preserve">? </w:t>
-      </w:r>
-      <w:proofErr w:type="spellStart"/>
-      <w:r>
-        <w:t>selectedDate</w:t>
-      </w:r>
-      <w:proofErr w:type="spellEnd"/>
-      <w:r>
-        <w:t>)</w:t>
-      </w:r>
-    </w:p>
-    <w:p>
-      <w:pPr>
-        <w:spacing w:after="0" w:line="240" w:lineRule="auto"/>
-      </w:pPr>
-      <w:r>
-        <w:t>{</w:t>
-      </w:r>
-    </w:p>
-    <w:p>
-      <w:pPr>
-        <w:spacing w:after="0" w:line="240" w:lineRule="auto"/>
-      </w:pPr>
-      <w:r>
-        <w:t xml:space="preserve">    try</w:t>
-      </w:r>
-    </w:p>
-    <w:p>
-      <w:pPr>
-        <w:spacing w:after="0" w:line="240" w:lineRule="auto"/>
-      </w:pPr>
-      <w:r>
-        <w:t xml:space="preserve">    {</w:t>
-      </w:r>
-    </w:p>
-    <w:p>
-      <w:pPr>
-        <w:spacing w:after="0" w:line="240" w:lineRule="auto"/>
-      </w:pPr>
-      <w:r>
-        <w:t xml:space="preserve">        _</w:t>
-      </w:r>
-      <w:proofErr w:type="spellStart"/>
-      <w:r>
-        <w:t>selectedDate</w:t>
-      </w:r>
-      <w:proofErr w:type="spellEnd"/>
-      <w:r>
-        <w:t xml:space="preserve"> = </w:t>
-      </w:r>
-      <w:proofErr w:type="spellStart"/>
-      <w:r>
-        <w:t>selectedDate</w:t>
-      </w:r>
-      <w:proofErr w:type="spellEnd"/>
-      <w:r>
-        <w:t>;</w:t>
-      </w:r>
-    </w:p>
-    <w:p>
-      <w:pPr>
-        <w:spacing w:after="0" w:line="240" w:lineRule="auto"/>
-      </w:pPr>
-    </w:p>
-    <w:p>
-      <w:pPr>
-        <w:spacing w:after="0" w:line="240" w:lineRule="auto"/>
-      </w:pPr>
-      <w:r>
-        <w:t xml:space="preserve">        // Wait for 1 second then gives control back to the runtime</w:t>
-      </w:r>
-    </w:p>
-    <w:p>
-      <w:pPr>
-        <w:spacing w:after="0" w:line="240" w:lineRule="auto"/>
-      </w:pPr>
-      <w:r>
-        <w:t xml:space="preserve">        //await </w:t>
-      </w:r>
-      <w:proofErr w:type="spellStart"/>
-      <w:r>
-        <w:t>Task.Delay</w:t>
-      </w:r>
-      <w:proofErr w:type="spellEnd"/>
-      <w:r>
-        <w:t>(500);</w:t>
-      </w:r>
-    </w:p>
-    <w:p>
-      <w:pPr>
-        <w:spacing w:after="0" w:line="240" w:lineRule="auto"/>
-      </w:pPr>
-    </w:p>
-    <w:p>
-      <w:pPr>
-        <w:spacing w:after="0" w:line="240" w:lineRule="auto"/>
-      </w:pPr>
-      <w:r>
-        <w:t xml:space="preserve">        // Reset collections</w:t>
-      </w:r>
-    </w:p>
-    <w:p>
-      <w:pPr>
-        <w:spacing w:after="0" w:line="240" w:lineRule="auto"/>
-      </w:pPr>
-      <w:r>
-        <w:t xml:space="preserve">        _</w:t>
-      </w:r>
-      <w:proofErr w:type="spellStart"/>
-      <w:r>
-        <w:t>errorMessage.Clear</w:t>
-      </w:r>
-      <w:proofErr w:type="spellEnd"/>
-      <w:r>
-        <w:t>();</w:t>
-      </w:r>
-    </w:p>
-    <w:p>
-      <w:pPr>
-        <w:spacing w:after="0" w:line="240" w:lineRule="auto"/>
-      </w:pPr>
-      <w:r>
-        <w:t xml:space="preserve">        _</w:t>
-      </w:r>
-      <w:proofErr w:type="spellStart"/>
-      <w:r>
-        <w:t>attendanceChips.Clear</w:t>
-      </w:r>
-      <w:proofErr w:type="spellEnd"/>
-      <w:r>
-        <w:t>();</w:t>
-      </w:r>
-    </w:p>
-    <w:p>
-      <w:pPr>
-        <w:spacing w:after="0" w:line="240" w:lineRule="auto"/>
-      </w:pPr>
-    </w:p>
-    <w:p>
-      <w:pPr>
-        <w:spacing w:after="0" w:line="240" w:lineRule="auto"/>
-      </w:pPr>
-      <w:r>
-        <w:t xml:space="preserve">        var </w:t>
-      </w:r>
-      <w:proofErr w:type="spellStart"/>
-      <w:r>
-        <w:t>attendanceResult</w:t>
-      </w:r>
-      <w:proofErr w:type="spellEnd"/>
-      <w:r>
-        <w:t xml:space="preserve"> = await </w:t>
-      </w:r>
-      <w:proofErr w:type="spellStart"/>
-      <w:r>
-        <w:t>AttendanceService.GetAttendanceDetailAsync</w:t>
-      </w:r>
-      <w:proofErr w:type="spellEnd"/>
-      <w:r>
-        <w:t>(</w:t>
-      </w:r>
-      <w:proofErr w:type="spellStart"/>
-      <w:r>
-        <w:t>UserEmpNo</w:t>
-      </w:r>
-      <w:proofErr w:type="spellEnd"/>
-      <w:r>
-        <w:t xml:space="preserve">, </w:t>
+        <w:t>= null)</w:t>
+      </w:r>
+    </w:p>
+    <w:p>
+      <w:pPr>
+        <w:spacing w:after="0" w:line="240" w:lineRule="auto"/>
+      </w:pPr>
+      <w:r>
+        <w:t xml:space="preserve">        {</w:t>
+      </w:r>
+    </w:p>
+    <w:p>
+      <w:pPr>
+        <w:spacing w:after="0" w:line="240" w:lineRule="auto"/>
+      </w:pPr>
+      <w:r>
+        <w:t xml:space="preserve">            // Hide the spinner overlay</w:t>
+      </w:r>
+    </w:p>
+    <w:p>
+      <w:pPr>
+        <w:spacing w:after="0" w:line="240" w:lineRule="auto"/>
+      </w:pPr>
+      <w:r>
+        <w:t xml:space="preserve">            await </w:t>
       </w:r>
       <w:proofErr w:type="spellStart"/>
       <w:proofErr w:type="gramStart"/>
       <w:r>
-        <w:t>selectedDate</w:t>
+        <w:t>callback.Invoke</w:t>
       </w:r>
       <w:proofErr w:type="spellEnd"/>
-      <w:r>
-        <w:t>!.</w:t>
+      <w:proofErr w:type="gramEnd"/>
+      <w:r>
+        <w:t>(</w:t>
+      </w:r>
+      <w:proofErr w:type="gramStart"/>
+      <w:r>
+        <w:t>);</w:t>
+      </w:r>
+      <w:proofErr w:type="gramEnd"/>
+    </w:p>
+    <w:p>
+      <w:pPr>
+        <w:spacing w:after="0" w:line="240" w:lineRule="auto"/>
+      </w:pPr>
+      <w:r>
+        <w:t xml:space="preserve">        }</w:t>
+      </w:r>
+    </w:p>
+    <w:p>
+      <w:pPr>
+        <w:spacing w:after="0" w:line="240" w:lineRule="auto"/>
+      </w:pPr>
+      <w:r>
+        <w:t xml:space="preserve">    }</w:t>
+      </w:r>
+    </w:p>
+    <w:p>
+      <w:pPr>
+        <w:spacing w:after="0" w:line="240" w:lineRule="auto"/>
+      </w:pPr>
+      <w:r>
+        <w:t xml:space="preserve">    catch (Exception ex)</w:t>
+      </w:r>
+    </w:p>
+    <w:p>
+      <w:pPr>
+        <w:spacing w:after="0" w:line="240" w:lineRule="auto"/>
+      </w:pPr>
+      <w:r>
+        <w:t xml:space="preserve">    {</w:t>
+      </w:r>
+    </w:p>
+    <w:p>
+      <w:pPr>
+        <w:spacing w:after="0" w:line="240" w:lineRule="auto"/>
+      </w:pPr>
+      <w:r>
+        <w:t xml:space="preserve">        // Set the error message</w:t>
+      </w:r>
+    </w:p>
+    <w:p>
+      <w:pPr>
+        <w:spacing w:after="0" w:line="240" w:lineRule="auto"/>
+      </w:pPr>
+      <w:r>
+        <w:t xml:space="preserve">        _</w:t>
       </w:r>
       <w:proofErr w:type="spellStart"/>
-      <w:proofErr w:type="gramEnd"/>
-      <w:r>
-        <w:t>Value.Date</w:t>
+      <w:r>
+        <w:t>errorMessage.Append</w:t>
       </w:r>
       <w:proofErr w:type="spellEnd"/>
       <w:r>
-        <w:t>);</w:t>
-      </w:r>
-    </w:p>
-    <w:p>
-      <w:pPr>
-        <w:spacing w:after="0" w:line="240" w:lineRule="auto"/>
-      </w:pPr>
-      <w:r>
-        <w:t xml:space="preserve">        if (</w:t>
-      </w:r>
-      <w:proofErr w:type="spellStart"/>
-      <w:r>
-        <w:t>attendanceResult.Success</w:t>
-      </w:r>
-      <w:proofErr w:type="spellEnd"/>
-      <w:r>
-        <w:t>)</w:t>
-      </w:r>
-    </w:p>
-    <w:p>
-      <w:pPr>
-        <w:spacing w:after="0" w:line="240" w:lineRule="auto"/>
-      </w:pPr>
-      <w:r>
-        <w:t xml:space="preserve">        {</w:t>
-      </w:r>
-    </w:p>
-    <w:p>
-      <w:pPr>
-        <w:spacing w:after="0" w:line="240" w:lineRule="auto"/>
-      </w:pPr>
-      <w:r>
-        <w:t xml:space="preserve">            _</w:t>
-      </w:r>
-      <w:proofErr w:type="spellStart"/>
-      <w:r>
-        <w:t>attendanceDetail</w:t>
-      </w:r>
-      <w:proofErr w:type="spellEnd"/>
-      <w:r>
-        <w:t xml:space="preserve"> = new </w:t>
+        <w:t>(</w:t>
       </w:r>
       <w:proofErr w:type="spellStart"/>
       <w:proofErr w:type="gramStart"/>
       <w:r>
-        <w:t>AttendanceDetailDTO</w:t>
-      </w:r>
-      <w:proofErr w:type="spellEnd"/>
-      <w:r>
-        <w:t>(</w:t>
-      </w:r>
-      <w:proofErr w:type="gramEnd"/>
-      <w:r>
-        <w:t>);</w:t>
-      </w:r>
-    </w:p>
-    <w:p>
-      <w:pPr>
-        <w:spacing w:after="0" w:line="240" w:lineRule="auto"/>
-      </w:pPr>
-      <w:r>
-        <w:t xml:space="preserve">            _</w:t>
-      </w:r>
-      <w:proofErr w:type="spellStart"/>
-      <w:r>
-        <w:t>attendanceDetail</w:t>
-      </w:r>
-      <w:proofErr w:type="spellEnd"/>
-      <w:r>
-        <w:t xml:space="preserve"> = </w:t>
-      </w:r>
-      <w:proofErr w:type="spellStart"/>
-      <w:proofErr w:type="gramStart"/>
-      <w:r>
-        <w:t>attendanceResult</w:t>
-      </w:r>
-      <w:proofErr w:type="spellEnd"/>
-      <w:r>
-        <w:t>!.</w:t>
-      </w:r>
-      <w:proofErr w:type="gramEnd"/>
-      <w:r>
-        <w:t>Value;</w:t>
-      </w:r>
-    </w:p>
-    <w:p>
-      <w:pPr>
-        <w:spacing w:after="0" w:line="240" w:lineRule="auto"/>
-      </w:pPr>
-    </w:p>
-    <w:p>
-      <w:pPr>
-        <w:spacing w:after="0" w:line="240" w:lineRule="auto"/>
-      </w:pPr>
-      <w:r>
-        <w:t xml:space="preserve">            if (_</w:t>
-      </w:r>
-      <w:proofErr w:type="spellStart"/>
-      <w:proofErr w:type="gramStart"/>
-      <w:r>
-        <w:t>attendanceDetail</w:t>
-      </w:r>
-      <w:proofErr w:type="spellEnd"/>
-      <w:r>
-        <w:t xml:space="preserve"> !</w:t>
-      </w:r>
-      <w:proofErr w:type="gramEnd"/>
-      <w:r>
-        <w:t>= null)</w:t>
-      </w:r>
-    </w:p>
-    <w:p>
-      <w:pPr>
-        <w:spacing w:after="0" w:line="240" w:lineRule="auto"/>
-      </w:pPr>
-      <w:r>
-        <w:t xml:space="preserve">            {</w:t>
-      </w:r>
-    </w:p>
-    <w:p>
-      <w:pPr>
-        <w:spacing w:after="0" w:line="240" w:lineRule="auto"/>
-      </w:pPr>
-      <w:r>
-        <w:t xml:space="preserve">                #region Get the First Time </w:t>
-      </w:r>
-      <w:proofErr w:type="gramStart"/>
-      <w:r>
-        <w:t>In</w:t>
-      </w:r>
-      <w:proofErr w:type="gramEnd"/>
-      <w:r>
-        <w:t xml:space="preserve"> and Last Time Out</w:t>
-      </w:r>
-    </w:p>
-    <w:p>
-      <w:pPr>
-        <w:spacing w:after="0" w:line="240" w:lineRule="auto"/>
-      </w:pPr>
-      <w:r>
-        <w:t xml:space="preserve">                if (_</w:t>
-      </w:r>
-      <w:proofErr w:type="spellStart"/>
-      <w:proofErr w:type="gramStart"/>
-      <w:r>
-        <w:t>attendanceDetail.FirstTimeIn.HasValue</w:t>
+        <w:t>ex.Message.ToString</w:t>
       </w:r>
       <w:proofErr w:type="spellEnd"/>
       <w:proofErr w:type="gramEnd"/>
       <w:r>
-        <w:t>)</w:t>
-      </w:r>
-    </w:p>
-    <w:p>
-      <w:pPr>
-        <w:spacing w:after="0" w:line="240" w:lineRule="auto"/>
-      </w:pPr>
-      <w:r>
-        <w:t xml:space="preserve">                    _</w:t>
-      </w:r>
-      <w:proofErr w:type="spellStart"/>
-      <w:r>
-        <w:t>firstTimeIn</w:t>
-      </w:r>
-      <w:proofErr w:type="spellEnd"/>
-      <w:r>
-        <w:t xml:space="preserve"> = $"{_attendanceDetail.FirstTimeIn:</w:t>
+        <w:t>()</w:t>
       </w:r>
       <w:proofErr w:type="gramStart"/>
       <w:r>
-        <w:t>dd}{GetOrdinal(</w:t>
+        <w:t>);</w:t>
       </w:r>
       <w:proofErr w:type="gramEnd"/>
-      <w:r>
-        <w:t>_</w:t>
-      </w:r>
-      <w:proofErr w:type="gramStart"/>
-      <w:r>
-        <w:t>attendanceDetail.FirstTimeIn.Value.Day</w:t>
-      </w:r>
-      <w:proofErr w:type="gramEnd"/>
-      <w:r>
-        <w:t>)} {_</w:t>
-      </w:r>
-      <w:proofErr w:type="spellStart"/>
-      <w:proofErr w:type="gramStart"/>
-      <w:r>
-        <w:t>attendanceDetail.FirstTimeIn:MMM</w:t>
-      </w:r>
-      <w:proofErr w:type="spellEnd"/>
-      <w:proofErr w:type="gramEnd"/>
-      <w:r>
-        <w:t xml:space="preserve"> </w:t>
-      </w:r>
-      <w:proofErr w:type="spellStart"/>
-      <w:r>
-        <w:t>yyyy</w:t>
-      </w:r>
-      <w:proofErr w:type="spellEnd"/>
-      <w:r>
-        <w:t xml:space="preserve"> </w:t>
-      </w:r>
-      <w:proofErr w:type="spellStart"/>
-      <w:r>
-        <w:t>hh:</w:t>
-      </w:r>
-      <w:proofErr w:type="gramStart"/>
-      <w:r>
-        <w:t>mm:ss</w:t>
-      </w:r>
-      <w:proofErr w:type="spellEnd"/>
-      <w:proofErr w:type="gramEnd"/>
-      <w:r>
-        <w:t xml:space="preserve"> </w:t>
-      </w:r>
-      <w:proofErr w:type="spellStart"/>
-      <w:r>
-        <w:t>tt</w:t>
-      </w:r>
-      <w:proofErr w:type="spellEnd"/>
-      <w:r>
-        <w:t>}";</w:t>
-      </w:r>
-    </w:p>
-    <w:p>
-      <w:pPr>
-        <w:spacing w:after="0" w:line="240" w:lineRule="auto"/>
-      </w:pPr>
-      <w:r>
-        <w:t xml:space="preserve">                else</w:t>
-      </w:r>
-    </w:p>
-    <w:p>
-      <w:pPr>
-        <w:spacing w:after="0" w:line="240" w:lineRule="auto"/>
-      </w:pPr>
-      <w:r>
-        <w:t xml:space="preserve">                    _</w:t>
-      </w:r>
-      <w:proofErr w:type="spellStart"/>
-      <w:r>
-        <w:t>firstTimeIn</w:t>
-      </w:r>
-      <w:proofErr w:type="spellEnd"/>
-      <w:r>
-        <w:t xml:space="preserve"> = </w:t>
-      </w:r>
-      <w:proofErr w:type="spellStart"/>
-      <w:proofErr w:type="gramStart"/>
-      <w:r>
-        <w:t>string.Empty</w:t>
-      </w:r>
-      <w:proofErr w:type="spellEnd"/>
-      <w:proofErr w:type="gramEnd"/>
-      <w:r>
-        <w:t>;</w:t>
-      </w:r>
-    </w:p>
-    <w:p>
-      <w:pPr>
-        <w:spacing w:after="0" w:line="240" w:lineRule="auto"/>
-      </w:pPr>
-    </w:p>
-    <w:p>
-      <w:pPr>
-        <w:spacing w:after="0" w:line="240" w:lineRule="auto"/>
-      </w:pPr>
-      <w:r>
-        <w:t xml:space="preserve">                if (_</w:t>
-      </w:r>
-      <w:proofErr w:type="spellStart"/>
-      <w:proofErr w:type="gramStart"/>
-      <w:r>
-        <w:t>attendanceDetail.LastTimeOut.HasValue</w:t>
-      </w:r>
-      <w:proofErr w:type="spellEnd"/>
-      <w:proofErr w:type="gramEnd"/>
-      <w:r>
-        <w:t>)</w:t>
-      </w:r>
-    </w:p>
-    <w:p>
-      <w:pPr>
-        <w:spacing w:after="0" w:line="240" w:lineRule="auto"/>
-      </w:pPr>
-      <w:r>
-        <w:t xml:space="preserve">                    _</w:t>
-      </w:r>
-      <w:proofErr w:type="spellStart"/>
-      <w:r>
-        <w:t>lastTimeOut</w:t>
-      </w:r>
-      <w:proofErr w:type="spellEnd"/>
-      <w:r>
-        <w:t xml:space="preserve"> = $"{_attendanceDetail.LastTimeOut:</w:t>
-      </w:r>
-      <w:proofErr w:type="gramStart"/>
-      <w:r>
-        <w:t>dd}{GetOrdinal(</w:t>
-      </w:r>
-      <w:proofErr w:type="gramEnd"/>
-      <w:r>
-        <w:t>_</w:t>
-      </w:r>
-      <w:proofErr w:type="gramStart"/>
-      <w:r>
-        <w:t>attendanceDetail.LastTimeOut.Value.Day</w:t>
-      </w:r>
-      <w:proofErr w:type="gramEnd"/>
-      <w:r>
-        <w:t>)} {_</w:t>
-      </w:r>
-      <w:proofErr w:type="spellStart"/>
-      <w:proofErr w:type="gramStart"/>
-      <w:r>
-        <w:t>attendanceDetail.LastTimeOut:MMM</w:t>
-      </w:r>
-      <w:proofErr w:type="spellEnd"/>
-      <w:proofErr w:type="gramEnd"/>
-      <w:r>
-        <w:t xml:space="preserve"> </w:t>
-      </w:r>
-      <w:proofErr w:type="spellStart"/>
-      <w:r>
-        <w:t>yyyy</w:t>
-      </w:r>
-      <w:proofErr w:type="spellEnd"/>
-      <w:r>
-        <w:t xml:space="preserve"> </w:t>
-      </w:r>
-      <w:proofErr w:type="spellStart"/>
-      <w:r>
-        <w:t>hh:</w:t>
-      </w:r>
-      <w:proofErr w:type="gramStart"/>
-      <w:r>
-        <w:t>mm:ss</w:t>
-      </w:r>
-      <w:proofErr w:type="spellEnd"/>
-      <w:proofErr w:type="gramEnd"/>
-      <w:r>
-        <w:t xml:space="preserve"> </w:t>
-      </w:r>
-      <w:proofErr w:type="spellStart"/>
-      <w:r>
-        <w:t>tt</w:t>
-      </w:r>
-      <w:proofErr w:type="spellEnd"/>
-      <w:r>
-        <w:t>}";</w:t>
-      </w:r>
-    </w:p>
-    <w:p>
-      <w:pPr>
-        <w:spacing w:after="0" w:line="240" w:lineRule="auto"/>
-      </w:pPr>
-      <w:r>
-        <w:t xml:space="preserve">                else</w:t>
-      </w:r>
-    </w:p>
-    <w:p>
-      <w:pPr>
-        <w:spacing w:after="0" w:line="240" w:lineRule="auto"/>
-      </w:pPr>
-      <w:r>
-        <w:t xml:space="preserve">                    _</w:t>
-      </w:r>
-      <w:proofErr w:type="spellStart"/>
-      <w:r>
-        <w:t>lastTimeOut</w:t>
-      </w:r>
-      <w:proofErr w:type="spellEnd"/>
-      <w:r>
-        <w:t xml:space="preserve"> = </w:t>
-      </w:r>
-      <w:proofErr w:type="spellStart"/>
-      <w:proofErr w:type="gramStart"/>
-      <w:r>
-        <w:t>string.Empty</w:t>
-      </w:r>
-      <w:proofErr w:type="spellEnd"/>
-      <w:proofErr w:type="gramEnd"/>
-      <w:r>
-        <w:t>;</w:t>
-      </w:r>
-    </w:p>
-    <w:p>
-      <w:pPr>
-        <w:spacing w:after="0" w:line="240" w:lineRule="auto"/>
-      </w:pPr>
-    </w:p>
-    <w:p>
-      <w:pPr>
-        <w:spacing w:after="0" w:line="240" w:lineRule="auto"/>
-      </w:pPr>
-      <w:r>
-        <w:t xml:space="preserve">                _</w:t>
-      </w:r>
-      <w:proofErr w:type="spellStart"/>
-      <w:r>
-        <w:t>isPunchedIn</w:t>
-      </w:r>
-      <w:proofErr w:type="spellEnd"/>
-      <w:r>
-        <w:t xml:space="preserve"> = _</w:t>
-      </w:r>
-      <w:proofErr w:type="spellStart"/>
-      <w:r>
-        <w:t>attendanceDetail.SwipeType</w:t>
-      </w:r>
-      <w:proofErr w:type="spellEnd"/>
-      <w:r>
-        <w:t xml:space="preserve"> == "IN</w:t>
-      </w:r>
-      <w:proofErr w:type="gramStart"/>
-      <w:r>
-        <w:t>" ?</w:t>
-      </w:r>
-      <w:proofErr w:type="gramEnd"/>
-      <w:r>
-        <w:t xml:space="preserve"> </w:t>
-      </w:r>
-      <w:proofErr w:type="gramStart"/>
-      <w:r>
-        <w:t>true :</w:t>
-      </w:r>
-      <w:proofErr w:type="gramEnd"/>
-      <w:r>
-        <w:t xml:space="preserve"> false;</w:t>
-      </w:r>
-    </w:p>
-    <w:p>
-      <w:pPr>
-        <w:spacing w:after="0" w:line="240" w:lineRule="auto"/>
-      </w:pPr>
-      <w:r>
-        <w:t xml:space="preserve">                #endregion</w:t>
-      </w:r>
-    </w:p>
-    <w:p>
-      <w:pPr>
-        <w:spacing w:after="0" w:line="240" w:lineRule="auto"/>
-      </w:pPr>
-    </w:p>
-    <w:p>
-      <w:pPr>
-        <w:spacing w:after="0" w:line="240" w:lineRule="auto"/>
-      </w:pPr>
-      <w:r>
-        <w:t xml:space="preserve">                #region Get Attendance Duration</w:t>
-      </w:r>
-    </w:p>
-    <w:p>
-      <w:pPr>
-        <w:spacing w:after="0" w:line="240" w:lineRule="auto"/>
-      </w:pPr>
-      <w:r>
-        <w:t xml:space="preserve">                var </w:t>
-      </w:r>
-      <w:proofErr w:type="spellStart"/>
-      <w:r>
-        <w:t>durationResult</w:t>
-      </w:r>
-      <w:proofErr w:type="spellEnd"/>
-      <w:r>
-        <w:t xml:space="preserve"> = await </w:t>
-      </w:r>
-      <w:proofErr w:type="spellStart"/>
-      <w:r>
-        <w:t>AttendanceService.GetAttendanceDurationAsync</w:t>
-      </w:r>
-      <w:proofErr w:type="spellEnd"/>
-      <w:r>
-        <w:t>(</w:t>
-      </w:r>
-      <w:proofErr w:type="spellStart"/>
-      <w:r>
-        <w:t>UserEmpNo</w:t>
-      </w:r>
-      <w:proofErr w:type="spellEnd"/>
-      <w:r>
-        <w:t xml:space="preserve">, </w:t>
-      </w:r>
-      <w:proofErr w:type="spellStart"/>
-      <w:proofErr w:type="gramStart"/>
-      <w:r>
-        <w:t>selectedDate</w:t>
-      </w:r>
-      <w:proofErr w:type="spellEnd"/>
-      <w:r>
-        <w:t>!.</w:t>
-      </w:r>
-      <w:proofErr w:type="spellStart"/>
-      <w:proofErr w:type="gramEnd"/>
-      <w:r>
-        <w:t>Value.Date</w:t>
-      </w:r>
-      <w:proofErr w:type="spellEnd"/>
-      <w:r>
-        <w:t>);</w:t>
-      </w:r>
-    </w:p>
-    <w:p>
-      <w:pPr>
-        <w:spacing w:after="0" w:line="240" w:lineRule="auto"/>
-      </w:pPr>
-      <w:r>
-        <w:lastRenderedPageBreak/>
-        <w:t xml:space="preserve">                if (</w:t>
-      </w:r>
-      <w:proofErr w:type="spellStart"/>
-      <w:r>
-        <w:t>durationResult.Success</w:t>
-      </w:r>
-      <w:proofErr w:type="spellEnd"/>
-      <w:r>
-        <w:t>)</w:t>
-      </w:r>
-    </w:p>
-    <w:p>
-      <w:pPr>
-        <w:spacing w:after="0" w:line="240" w:lineRule="auto"/>
-      </w:pPr>
-      <w:r>
-        <w:t xml:space="preserve">                    _</w:t>
-      </w:r>
-      <w:proofErr w:type="spellStart"/>
-      <w:r>
-        <w:t>attendanceDuration</w:t>
-      </w:r>
-      <w:proofErr w:type="spellEnd"/>
-      <w:r>
-        <w:t xml:space="preserve"> = </w:t>
-      </w:r>
-      <w:proofErr w:type="spellStart"/>
-      <w:proofErr w:type="gramStart"/>
-      <w:r>
-        <w:t>durationResult</w:t>
-      </w:r>
-      <w:proofErr w:type="spellEnd"/>
-      <w:r>
-        <w:t>!.</w:t>
-      </w:r>
-      <w:proofErr w:type="gramEnd"/>
-      <w:r>
-        <w:t>Value;</w:t>
-      </w:r>
-    </w:p>
-    <w:p>
-      <w:pPr>
-        <w:spacing w:after="0" w:line="240" w:lineRule="auto"/>
-      </w:pPr>
-      <w:r>
-        <w:t xml:space="preserve">                else</w:t>
-      </w:r>
-    </w:p>
-    <w:p>
-      <w:pPr>
-        <w:spacing w:after="0" w:line="240" w:lineRule="auto"/>
-      </w:pPr>
-      <w:r>
-        <w:t xml:space="preserve">                    _</w:t>
-      </w:r>
-      <w:proofErr w:type="spellStart"/>
-      <w:r>
-        <w:t>errorMessage.Append</w:t>
-      </w:r>
-      <w:proofErr w:type="spellEnd"/>
-      <w:r>
-        <w:t>(</w:t>
-      </w:r>
-      <w:proofErr w:type="spellStart"/>
-      <w:r>
-        <w:t>durationResult.Error</w:t>
-      </w:r>
-      <w:proofErr w:type="spellEnd"/>
-      <w:r>
-        <w:t>);</w:t>
-      </w:r>
-    </w:p>
-    <w:p>
-      <w:pPr>
-        <w:spacing w:after="0" w:line="240" w:lineRule="auto"/>
-      </w:pPr>
-      <w:r>
-        <w:t xml:space="preserve">                #endregion</w:t>
-      </w:r>
-    </w:p>
-    <w:p>
-      <w:pPr>
-        <w:spacing w:after="0" w:line="240" w:lineRule="auto"/>
-      </w:pPr>
-    </w:p>
-    <w:p>
-      <w:pPr>
-        <w:spacing w:after="0" w:line="240" w:lineRule="auto"/>
-      </w:pPr>
-      <w:r>
-        <w:t xml:space="preserve">                #region Populate the raw swipe chips</w:t>
-      </w:r>
-    </w:p>
-    <w:p>
-      <w:pPr>
-        <w:spacing w:after="0" w:line="240" w:lineRule="auto"/>
-      </w:pPr>
-      <w:r>
-        <w:t xml:space="preserve">                if (_</w:t>
-      </w:r>
-      <w:proofErr w:type="spellStart"/>
-      <w:proofErr w:type="gramStart"/>
-      <w:r>
-        <w:t>attendanceDetail.SwipeLogList</w:t>
-      </w:r>
-      <w:proofErr w:type="spellEnd"/>
-      <w:r>
-        <w:t xml:space="preserve"> !</w:t>
-      </w:r>
-      <w:proofErr w:type="gramEnd"/>
-      <w:r>
-        <w:t>= null &amp;&amp; _</w:t>
-      </w:r>
-      <w:proofErr w:type="spellStart"/>
-      <w:proofErr w:type="gramStart"/>
-      <w:r>
-        <w:t>attendanceDetail.SwipeLogList.Any</w:t>
-      </w:r>
-      <w:proofErr w:type="spellEnd"/>
-      <w:proofErr w:type="gramEnd"/>
-      <w:r>
-        <w:t>())</w:t>
-      </w:r>
-    </w:p>
-    <w:p>
-      <w:pPr>
-        <w:spacing w:after="0" w:line="240" w:lineRule="auto"/>
-      </w:pPr>
-      <w:r>
-        <w:t xml:space="preserve">                    _attendanceChips.AddRange(_</w:t>
-      </w:r>
-      <w:proofErr w:type="gramStart"/>
-      <w:r>
-        <w:t>attendanceDetail.SwipeLogList.ToList</w:t>
-      </w:r>
-      <w:proofErr w:type="gramEnd"/>
-      <w:r>
-        <w:t>());</w:t>
-      </w:r>
-    </w:p>
-    <w:p>
-      <w:pPr>
-        <w:spacing w:after="0" w:line="240" w:lineRule="auto"/>
-      </w:pPr>
-      <w:r>
-        <w:t xml:space="preserve">                #endregion</w:t>
-      </w:r>
-    </w:p>
-    <w:p>
-      <w:pPr>
-        <w:spacing w:after="0" w:line="240" w:lineRule="auto"/>
-      </w:pPr>
-      <w:r>
-        <w:t xml:space="preserve">            }</w:t>
-      </w:r>
-    </w:p>
-    <w:p>
-      <w:pPr>
-        <w:spacing w:after="0" w:line="240" w:lineRule="auto"/>
-      </w:pPr>
-      <w:r>
-        <w:t xml:space="preserve">        }</w:t>
-      </w:r>
-    </w:p>
-    <w:p>
-      <w:pPr>
-        <w:spacing w:after="0" w:line="240" w:lineRule="auto"/>
-      </w:pPr>
-      <w:r>
-        <w:t xml:space="preserve">        else</w:t>
-      </w:r>
-    </w:p>
-    <w:p>
-      <w:pPr>
-        <w:spacing w:after="0" w:line="240" w:lineRule="auto"/>
-      </w:pPr>
-      <w:r>
-        <w:t xml:space="preserve">            _</w:t>
-      </w:r>
-      <w:proofErr w:type="spellStart"/>
-      <w:r>
-        <w:t>errorMessage.Append</w:t>
-      </w:r>
-      <w:proofErr w:type="spellEnd"/>
-      <w:r>
-        <w:t>(</w:t>
-      </w:r>
-      <w:proofErr w:type="spellStart"/>
-      <w:r>
-        <w:t>attendanceResult.Error</w:t>
-      </w:r>
-      <w:proofErr w:type="spellEnd"/>
-      <w:r>
-        <w:t>);</w:t>
-      </w:r>
-    </w:p>
-    <w:p>
-      <w:pPr>
-        <w:spacing w:after="0" w:line="240" w:lineRule="auto"/>
-      </w:pPr>
-    </w:p>
-    <w:p>
-      <w:pPr>
-        <w:spacing w:after="0" w:line="240" w:lineRule="auto"/>
-      </w:pPr>
-      <w:r>
-        <w:t xml:space="preserve">        if (</w:t>
-      </w:r>
-      <w:proofErr w:type="gramStart"/>
-      <w:r>
-        <w:t>callback !</w:t>
-      </w:r>
-      <w:proofErr w:type="gramEnd"/>
-      <w:r>
-        <w:t>= null)</w:t>
-      </w:r>
-    </w:p>
-    <w:p>
-      <w:pPr>
-        <w:spacing w:after="0" w:line="240" w:lineRule="auto"/>
-      </w:pPr>
-      <w:r>
-        <w:t xml:space="preserve">        {</w:t>
-      </w:r>
-    </w:p>
-    <w:p>
-      <w:pPr>
-        <w:spacing w:after="0" w:line="240" w:lineRule="auto"/>
-      </w:pPr>
-      <w:r>
-        <w:t xml:space="preserve">            // Hide the spinner overlay</w:t>
-      </w:r>
-    </w:p>
-    <w:p>
-      <w:pPr>
-        <w:spacing w:after="0" w:line="240" w:lineRule="auto"/>
-      </w:pPr>
-      <w:r>
-        <w:t xml:space="preserve">            await </w:t>
-      </w:r>
-      <w:proofErr w:type="spellStart"/>
-      <w:proofErr w:type="gramStart"/>
-      <w:r>
-        <w:t>callback.Invoke</w:t>
-      </w:r>
-      <w:proofErr w:type="spellEnd"/>
-      <w:proofErr w:type="gramEnd"/>
-      <w:r>
-        <w:t>();</w:t>
-      </w:r>
-    </w:p>
-    <w:p>
-      <w:pPr>
-        <w:spacing w:after="0" w:line="240" w:lineRule="auto"/>
-      </w:pPr>
-      <w:r>
-        <w:t xml:space="preserve">        }</w:t>
-      </w:r>
-    </w:p>
-    <w:p>
-      <w:pPr>
-        <w:spacing w:after="0" w:line="240" w:lineRule="auto"/>
-      </w:pPr>
-      <w:r>
-        <w:t xml:space="preserve">    }</w:t>
-      </w:r>
-    </w:p>
-    <w:p>
-      <w:pPr>
-        <w:spacing w:after="0" w:line="240" w:lineRule="auto"/>
-      </w:pPr>
-      <w:r>
-        <w:t xml:space="preserve">    catch (Exception ex)</w:t>
-      </w:r>
-    </w:p>
-    <w:p>
-      <w:pPr>
-        <w:spacing w:after="0" w:line="240" w:lineRule="auto"/>
-      </w:pPr>
-      <w:r>
-        <w:t xml:space="preserve">    {</w:t>
-      </w:r>
-    </w:p>
-    <w:p>
-      <w:pPr>
-        <w:spacing w:after="0" w:line="240" w:lineRule="auto"/>
-      </w:pPr>
-      <w:r>
-        <w:t xml:space="preserve">        // Set the error message</w:t>
-      </w:r>
-    </w:p>
-    <w:p>
-      <w:pPr>
-        <w:spacing w:after="0" w:line="240" w:lineRule="auto"/>
-      </w:pPr>
-      <w:r>
-        <w:t xml:space="preserve">        _</w:t>
-      </w:r>
-      <w:proofErr w:type="spellStart"/>
-      <w:r>
-        <w:t>errorMessage.Append</w:t>
-      </w:r>
-      <w:proofErr w:type="spellEnd"/>
-      <w:r>
-        <w:t>(</w:t>
-      </w:r>
-      <w:proofErr w:type="spellStart"/>
-      <w:proofErr w:type="gramStart"/>
-      <w:r>
-        <w:t>ex.Message.ToString</w:t>
-      </w:r>
-      <w:proofErr w:type="spellEnd"/>
-      <w:proofErr w:type="gramEnd"/>
-      <w:r>
-        <w:t>());</w:t>
-      </w:r>
     </w:p>
     <w:p>
       <w:pPr>
@@ -28788,13 +28815,7 @@
         <w:spacing w:after="0" w:line="240" w:lineRule="auto"/>
       </w:pPr>
       <w:r>
-        <w:t xml:space="preserve">Note that I am using </w:t>
-      </w:r>
-      <w:r>
-        <w:t>.NET 8.0</w:t>
-      </w:r>
-      <w:r>
-        <w:t xml:space="preserve"> and </w:t>
+        <w:t xml:space="preserve">Note that I am using .NET 8.0 and </w:t>
       </w:r>
       <w:proofErr w:type="spellStart"/>
       <w:r>
@@ -29086,16 +29107,66 @@
         <w:spacing w:after="0" w:line="240" w:lineRule="auto"/>
       </w:pPr>
       <w:r>
-        <w:t xml:space="preserve">            Icon="@</w:t>
+        <w:t xml:space="preserve">            Icon</w:t>
+      </w:r>
+      <w:proofErr w:type="gramStart"/>
+      <w:r>
+        <w:t>="@</w:t>
+      </w:r>
+      <w:proofErr w:type="spellStart"/>
+      <w:r>
+        <w:t>Icons.Material.Filled.Circle</w:t>
+      </w:r>
+      <w:proofErr w:type="spellEnd"/>
+      <w:proofErr w:type="gramEnd"/>
+      <w:r>
+        <w:t>"</w:t>
+      </w:r>
+    </w:p>
+    <w:p>
+      <w:pPr>
+        <w:spacing w:after="0" w:line="240" w:lineRule="auto"/>
+      </w:pPr>
+      <w:r>
+        <w:t xml:space="preserve">            Color</w:t>
+      </w:r>
+      <w:proofErr w:type="gramStart"/>
+      <w:r>
+        <w:t>="@</w:t>
+      </w:r>
+      <w:proofErr w:type="spellStart"/>
+      <w:proofErr w:type="gramEnd"/>
+      <w:r>
+        <w:t>GetLegendColor</w:t>
+      </w:r>
+      <w:proofErr w:type="spellEnd"/>
+      <w:r>
+        <w:t>(</w:t>
       </w:r>
       <w:proofErr w:type="spellStart"/>
       <w:proofErr w:type="gramStart"/>
       <w:r>
-        <w:t>Icons.Material.Filled.Circle</w:t>
+        <w:t>legend.UDCCode</w:t>
       </w:r>
       <w:proofErr w:type="spellEnd"/>
       <w:proofErr w:type="gramEnd"/>
       <w:r>
+        <w:t>)"</w:t>
+      </w:r>
+    </w:p>
+    <w:p>
+      <w:pPr>
+        <w:spacing w:after="0" w:line="240" w:lineRule="auto"/>
+      </w:pPr>
+      <w:r>
+        <w:t xml:space="preserve">            Size="</w:t>
+      </w:r>
+      <w:proofErr w:type="spellStart"/>
+      <w:r>
+        <w:t>Size.Small</w:t>
+      </w:r>
+      <w:proofErr w:type="spellEnd"/>
+      <w:r>
         <w:t>"</w:t>
       </w:r>
     </w:p>
@@ -29104,152 +29175,410 @@
         <w:spacing w:after="0" w:line="240" w:lineRule="auto"/>
       </w:pPr>
       <w:r>
-        <w:t xml:space="preserve">            Color="@</w:t>
+        <w:t xml:space="preserve">            Variant="</w:t>
       </w:r>
       <w:proofErr w:type="spellStart"/>
       <w:r>
-        <w:t>GetLegendColor</w:t>
+        <w:t>Variant.Text</w:t>
       </w:r>
       <w:proofErr w:type="spellEnd"/>
       <w:r>
-        <w:t>(</w:t>
+        <w:t>"&gt;</w:t>
+      </w:r>
+    </w:p>
+    <w:p>
+      <w:pPr>
+        <w:spacing w:after="0" w:line="240" w:lineRule="auto"/>
+      </w:pPr>
+      <w:r>
+        <w:t xml:space="preserve">            @</w:t>
+      </w:r>
+      <w:proofErr w:type="gramStart"/>
+      <w:r>
+        <w:t>legend.UDCDesc</w:t>
+      </w:r>
+      <w:proofErr w:type="gramEnd"/>
+      <w:r>
+        <w:t>1</w:t>
+      </w:r>
+    </w:p>
+    <w:p>
+      <w:pPr>
+        <w:spacing w:after="0" w:line="240" w:lineRule="auto"/>
+      </w:pPr>
+      <w:r>
+        <w:t xml:space="preserve">        &lt;/</w:t>
+      </w:r>
+      <w:proofErr w:type="spellStart"/>
+      <w:r>
+        <w:t>MudChip</w:t>
+      </w:r>
+      <w:proofErr w:type="spellEnd"/>
+      <w:r>
+        <w:t>&gt;</w:t>
+      </w:r>
+    </w:p>
+    <w:p>
+      <w:pPr>
+        <w:spacing w:after="0" w:line="240" w:lineRule="auto"/>
+      </w:pPr>
+      <w:r>
+        <w:t xml:space="preserve">    }</w:t>
+      </w:r>
+    </w:p>
+    <w:p>
+      <w:pPr>
+        <w:spacing w:after="0" w:line="240" w:lineRule="auto"/>
+      </w:pPr>
+      <w:r>
+        <w:t>&lt;/</w:t>
+      </w:r>
+      <w:proofErr w:type="spellStart"/>
+      <w:r>
+        <w:t>MudChipSet</w:t>
+      </w:r>
+      <w:proofErr w:type="spellEnd"/>
+      <w:r>
+        <w:t>&gt;</w:t>
+      </w:r>
+    </w:p>
+    <w:p>
+      <w:pPr>
+        <w:spacing w:after="0" w:line="240" w:lineRule="auto"/>
+      </w:pPr>
+    </w:p>
+    <w:p>
+      <w:pPr>
+        <w:spacing w:after="0" w:line="240" w:lineRule="auto"/>
+      </w:pPr>
+      <w:r>
+        <w:t>Error</w:t>
+      </w:r>
+      <w:r>
+        <w:tab/>
+        <w:t>CS1503</w:t>
+      </w:r>
+      <w:r>
+        <w:tab/>
+        <w:t>Argument 7: cannot convert from '</w:t>
       </w:r>
       <w:proofErr w:type="spellStart"/>
       <w:proofErr w:type="gramStart"/>
       <w:r>
-        <w:t>legend.UDCCode</w:t>
+        <w:t>MudBlazor.Utilities.MudColor</w:t>
       </w:r>
       <w:proofErr w:type="spellEnd"/>
       <w:proofErr w:type="gramEnd"/>
       <w:r>
-        <w:t>)"</w:t>
-      </w:r>
-    </w:p>
-    <w:p>
-      <w:pPr>
-        <w:spacing w:after="0" w:line="240" w:lineRule="auto"/>
-      </w:pPr>
-      <w:r>
-        <w:t xml:space="preserve">            Size="</w:t>
+        <w:t>' to '</w:t>
       </w:r>
       <w:proofErr w:type="spellStart"/>
       <w:r>
-        <w:t>Size.Small</w:t>
+        <w:t>MudBlazor.Color</w:t>
       </w:r>
       <w:proofErr w:type="spellEnd"/>
       <w:r>
-        <w:t>"</w:t>
-      </w:r>
-    </w:p>
-    <w:p>
-      <w:pPr>
-        <w:spacing w:after="0" w:line="240" w:lineRule="auto"/>
-      </w:pPr>
-      <w:r>
-        <w:t xml:space="preserve">            Variant="</w:t>
+        <w:t>?'</w:t>
+      </w:r>
+    </w:p>
+    <w:p>
+      <w:pPr>
+        <w:spacing w:after="0" w:line="240" w:lineRule="auto"/>
+      </w:pPr>
+    </w:p>
+    <w:p>
+      <w:pPr>
+        <w:spacing w:after="0" w:line="240" w:lineRule="auto"/>
+        <w:rPr>
+          <w:b/>
+          <w:bCs/>
+          <w:color w:val="EE0000"/>
+          <w:u w:val="single"/>
+        </w:rPr>
+      </w:pPr>
+      <w:r>
+        <w:rPr>
+          <w:b/>
+          <w:bCs/>
+          <w:color w:val="EE0000"/>
+          <w:u w:val="single"/>
+        </w:rPr>
+        <w:t>Prompt #23:</w:t>
+      </w:r>
+    </w:p>
+    <w:p>
+      <w:pPr>
+        <w:spacing w:after="0" w:line="240" w:lineRule="auto"/>
+      </w:pPr>
+      <w:r>
+        <w:t>Convert the following Blazor code into C# code-behind:</w:t>
+      </w:r>
+    </w:p>
+    <w:p>
+      <w:pPr>
+        <w:spacing w:after="0" w:line="240" w:lineRule="auto"/>
+      </w:pPr>
+    </w:p>
+    <w:p>
+      <w:pPr>
+        <w:spacing w:after="0" w:line="240" w:lineRule="auto"/>
+      </w:pPr>
+      <w:r>
+        <w:t>@code {</w:t>
+      </w:r>
+      <w:r>
+        <w:br/>
+        <w:t xml:space="preserve">private </w:t>
       </w:r>
       <w:proofErr w:type="spellStart"/>
       <w:r>
-        <w:t>Variant.Text</w:t>
+        <w:t>RenderFragment</w:t>
       </w:r>
       <w:proofErr w:type="spellEnd"/>
       <w:r>
-        <w:t>"&gt;</w:t>
-      </w:r>
-    </w:p>
-    <w:p>
-      <w:pPr>
-        <w:spacing w:after="0" w:line="240" w:lineRule="auto"/>
-      </w:pPr>
-      <w:r>
-        <w:t xml:space="preserve">            @</w:t>
-      </w:r>
-      <w:proofErr w:type="gramStart"/>
-      <w:r>
-        <w:t>legend.UDCDesc</w:t>
-      </w:r>
-      <w:proofErr w:type="gramEnd"/>
-      <w:r>
-        <w:t>1</w:t>
-      </w:r>
-    </w:p>
-    <w:p>
-      <w:pPr>
-        <w:spacing w:after="0" w:line="240" w:lineRule="auto"/>
-      </w:pPr>
-      <w:r>
-        <w:t xml:space="preserve">        &lt;/</w:t>
+        <w:t>&lt;</w:t>
       </w:r>
       <w:proofErr w:type="spellStart"/>
       <w:r>
-        <w:t>MudChip</w:t>
+        <w:t>DateTime</w:t>
       </w:r>
       <w:proofErr w:type="spellEnd"/>
       <w:r>
-        <w:t>&gt;</w:t>
-      </w:r>
-    </w:p>
-    <w:p>
-      <w:pPr>
-        <w:spacing w:after="0" w:line="240" w:lineRule="auto"/>
-      </w:pPr>
-      <w:r>
-        <w:t xml:space="preserve">    }</w:t>
-      </w:r>
-    </w:p>
-    <w:p>
-      <w:pPr>
-        <w:spacing w:after="0" w:line="240" w:lineRule="auto"/>
-      </w:pPr>
-      <w:r>
-        <w:t>&lt;/</w:t>
+        <w:t xml:space="preserve">&gt; </w:t>
       </w:r>
       <w:proofErr w:type="spellStart"/>
       <w:r>
-        <w:t>MudChipSet</w:t>
+        <w:t>CalendarDayTemplate</w:t>
       </w:r>
       <w:proofErr w:type="spellEnd"/>
       <w:r>
-        <w:t>&gt;</w:t>
-      </w:r>
-    </w:p>
-    <w:p>
-      <w:pPr>
-        <w:spacing w:after="0" w:line="240" w:lineRule="auto"/>
-      </w:pPr>
-    </w:p>
-    <w:p>
-      <w:pPr>
-        <w:spacing w:after="0" w:line="240" w:lineRule="auto"/>
-      </w:pPr>
-      <w:r>
-        <w:t>Error</w:t>
-      </w:r>
-      <w:r>
-        <w:tab/>
-        <w:t>CS1503</w:t>
-      </w:r>
-      <w:r>
-        <w:tab/>
-        <w:t>Argument 7: cannot convert from '</w:t>
+        <w:t xml:space="preserve"> =&gt; (day) =&gt;</w:t>
+      </w:r>
+      <w:r>
+        <w:br/>
+        <w:t>{</w:t>
+      </w:r>
+      <w:r>
+        <w:br/>
+        <w:t>string color = _</w:t>
+      </w:r>
+      <w:proofErr w:type="spellStart"/>
+      <w:r>
+        <w:t>calendarColors.ContainsKey</w:t>
+      </w:r>
+      <w:proofErr w:type="spellEnd"/>
+      <w:r>
+        <w:t>(</w:t>
       </w:r>
       <w:proofErr w:type="spellStart"/>
       <w:proofErr w:type="gramStart"/>
       <w:r>
-        <w:t>MudBlazor.Utilities.MudColor</w:t>
+        <w:t>day.Date</w:t>
       </w:r>
       <w:proofErr w:type="spellEnd"/>
       <w:proofErr w:type="gramEnd"/>
       <w:r>
-        <w:t>' to '</w:t>
+        <w:t>)</w:t>
+      </w:r>
+      <w:r>
+        <w:br/>
+        <w:t>? _</w:t>
       </w:r>
       <w:proofErr w:type="spellStart"/>
       <w:r>
-        <w:t>MudBlazor.Color</w:t>
+        <w:t>calendarColors</w:t>
       </w:r>
       <w:proofErr w:type="spellEnd"/>
       <w:r>
-        <w:t>?'</w:t>
+        <w:t>[</w:t>
+      </w:r>
+      <w:proofErr w:type="spellStart"/>
+      <w:proofErr w:type="gramStart"/>
+      <w:r>
+        <w:t>day.Date</w:t>
+      </w:r>
+      <w:proofErr w:type="spellEnd"/>
+      <w:proofErr w:type="gramEnd"/>
+      <w:r>
+        <w:t>]</w:t>
+      </w:r>
+      <w:r>
+        <w:br/>
+        <w:t>: "transparent";</w:t>
+      </w:r>
+      <w:r>
+        <w:br/>
+      </w:r>
+      <w:r>
+        <w:br/>
+        <w:t xml:space="preserve">bool </w:t>
+      </w:r>
+      <w:proofErr w:type="spellStart"/>
+      <w:r>
+        <w:t>isToday</w:t>
+      </w:r>
+      <w:proofErr w:type="spellEnd"/>
+      <w:r>
+        <w:t xml:space="preserve"> = </w:t>
+      </w:r>
+      <w:proofErr w:type="spellStart"/>
+      <w:proofErr w:type="gramStart"/>
+      <w:r>
+        <w:t>day.Date</w:t>
+      </w:r>
+      <w:proofErr w:type="spellEnd"/>
+      <w:proofErr w:type="gramEnd"/>
+      <w:r>
+        <w:t xml:space="preserve"> == </w:t>
+      </w:r>
+      <w:proofErr w:type="spellStart"/>
+      <w:proofErr w:type="gramStart"/>
+      <w:r>
+        <w:t>DateTime.Today.Date</w:t>
+      </w:r>
+      <w:proofErr w:type="spellEnd"/>
+      <w:proofErr w:type="gramEnd"/>
+      <w:r>
+        <w:t>;</w:t>
+      </w:r>
+      <w:r>
+        <w:br/>
+      </w:r>
+      <w:r>
+        <w:br/>
+        <w:t>&lt;</w:t>
+      </w:r>
+      <w:proofErr w:type="spellStart"/>
+      <w:r>
+        <w:t>MudPaper</w:t>
+      </w:r>
+      <w:proofErr w:type="spellEnd"/>
+      <w:r>
+        <w:t xml:space="preserve"> </w:t>
+      </w:r>
+      <w:r>
+        <w:br/>
+        <w:t>Style=$"height:38</w:t>
+      </w:r>
+      <w:proofErr w:type="gramStart"/>
+      <w:r>
+        <w:t>px;width</w:t>
+      </w:r>
+      <w:proofErr w:type="gramEnd"/>
+      <w:r>
+        <w:t>:38</w:t>
+      </w:r>
+      <w:proofErr w:type="gramStart"/>
+      <w:r>
+        <w:t>px;border</w:t>
+      </w:r>
+      <w:proofErr w:type="gramEnd"/>
+      <w:r>
+        <w:t>-radius:6px;</w:t>
+      </w:r>
+      <w:r>
+        <w:br/>
+        <w:t>background-</w:t>
+      </w:r>
+      <w:proofErr w:type="gramStart"/>
+      <w:r>
+        <w:t>color:{</w:t>
+      </w:r>
+      <w:proofErr w:type="gramEnd"/>
+      <w:r>
+        <w:t>color};</w:t>
+      </w:r>
+      <w:r>
+        <w:br/>
+        <w:t>border: {(</w:t>
+      </w:r>
+      <w:proofErr w:type="spellStart"/>
+      <w:proofErr w:type="gramStart"/>
+      <w:r>
+        <w:t>isToday</w:t>
+      </w:r>
+      <w:proofErr w:type="spellEnd"/>
+      <w:r>
+        <w:t xml:space="preserve"> ?</w:t>
+      </w:r>
+      <w:proofErr w:type="gramEnd"/>
+      <w:r>
+        <w:t xml:space="preserve"> "2px solid black</w:t>
+      </w:r>
+      <w:proofErr w:type="gramStart"/>
+      <w:r>
+        <w:t>" :</w:t>
+      </w:r>
+      <w:proofErr w:type="gramEnd"/>
+      <w:r>
+        <w:t xml:space="preserve"> "1px solid #ccc</w:t>
+      </w:r>
+      <w:proofErr w:type="gramStart"/>
+      <w:r>
+        <w:t>")}</w:t>
+      </w:r>
+      <w:proofErr w:type="gramEnd"/>
+      <w:r>
+        <w:t>;</w:t>
+      </w:r>
+      <w:r>
+        <w:br/>
+      </w:r>
+      <w:proofErr w:type="spellStart"/>
+      <w:proofErr w:type="gramStart"/>
+      <w:r>
+        <w:lastRenderedPageBreak/>
+        <w:t>display:flex</w:t>
+      </w:r>
+      <w:proofErr w:type="gramEnd"/>
+      <w:r>
+        <w:t>;align-</w:t>
+      </w:r>
+      <w:proofErr w:type="gramStart"/>
+      <w:r>
+        <w:t>items:center</w:t>
+      </w:r>
+      <w:proofErr w:type="gramEnd"/>
+      <w:r>
+        <w:t>;justify-</w:t>
+      </w:r>
+      <w:proofErr w:type="gramStart"/>
+      <w:r>
+        <w:t>content:center</w:t>
+      </w:r>
+      <w:proofErr w:type="spellEnd"/>
+      <w:proofErr w:type="gramEnd"/>
+      <w:r>
+        <w:t>;"&gt;</w:t>
+      </w:r>
+      <w:r>
+        <w:br/>
+        <w:t>@</w:t>
+      </w:r>
+      <w:proofErr w:type="gramStart"/>
+      <w:r>
+        <w:t>day.Day</w:t>
+      </w:r>
+      <w:proofErr w:type="gramEnd"/>
+      <w:r>
+        <w:br/>
+        <w:t>&lt;/</w:t>
+      </w:r>
+      <w:proofErr w:type="spellStart"/>
+      <w:r>
+        <w:t>MudPaper</w:t>
+      </w:r>
+      <w:proofErr w:type="spellEnd"/>
+      <w:r>
+        <w:t>&gt;;</w:t>
+      </w:r>
+      <w:r>
+        <w:br/>
+        <w:t>};</w:t>
+      </w:r>
+      <w:r>
+        <w:br/>
+        <w:t>}</w:t>
       </w:r>
     </w:p>
     <w:sectPr>

</xml_diff>

<commit_message>
Need to find alternative method for mapping the LegendCode to the calendar days
</commit_message>
<xml_diff>
--- a/Documentation/AI Prompts/Vibe Coding - TNA Dashboard.docx
+++ b/Documentation/AI Prompts/Vibe Coding - TNA Dashboard.docx
@@ -21589,299 +21589,297 @@
         <w:rPr>
           <w:lang w:val="en-GB"/>
         </w:rPr>
+        <w:t>(</w:t>
+      </w:r>
+      <w:proofErr w:type="gramEnd"/>
+      <w:r>
+        <w:rPr>
+          <w:lang w:val="en-GB"/>
+        </w:rPr>
+        <w:t>);</w:t>
+      </w:r>
+    </w:p>
+    <w:p>
+      <w:pPr>
+        <w:spacing w:after="0" w:line="240" w:lineRule="auto"/>
+        <w:rPr>
+          <w:lang w:val="en-GB"/>
+        </w:rPr>
+      </w:pPr>
+    </w:p>
+    <w:p>
+      <w:pPr>
+        <w:spacing w:after="0" w:line="240" w:lineRule="auto"/>
+        <w:rPr>
+          <w:lang w:val="en-GB"/>
+        </w:rPr>
+      </w:pPr>
+      <w:r>
+        <w:rPr>
+          <w:lang w:val="en-GB"/>
+        </w:rPr>
+        <w:t xml:space="preserve">    try</w:t>
+      </w:r>
+    </w:p>
+    <w:p>
+      <w:pPr>
+        <w:spacing w:after="0" w:line="240" w:lineRule="auto"/>
+        <w:rPr>
+          <w:lang w:val="en-GB"/>
+        </w:rPr>
+      </w:pPr>
+      <w:r>
+        <w:rPr>
+          <w:lang w:val="en-GB"/>
+        </w:rPr>
+        <w:t xml:space="preserve">    {</w:t>
+      </w:r>
+    </w:p>
+    <w:p>
+      <w:pPr>
+        <w:spacing w:after="0" w:line="240" w:lineRule="auto"/>
+        <w:rPr>
+          <w:lang w:val="en-GB"/>
+        </w:rPr>
+      </w:pPr>
+      <w:r>
+        <w:rPr>
+          <w:lang w:val="en-GB"/>
+        </w:rPr>
+        <w:t xml:space="preserve">        var model = await _</w:t>
+      </w:r>
+      <w:proofErr w:type="spellStart"/>
+      <w:proofErr w:type="gramStart"/>
+      <w:r>
+        <w:rPr>
+          <w:lang w:val="en-GB"/>
+        </w:rPr>
+        <w:t>db.Set</w:t>
+      </w:r>
+      <w:proofErr w:type="spellEnd"/>
+      <w:proofErr w:type="gramEnd"/>
+      <w:r>
+        <w:rPr>
+          <w:lang w:val="en-GB"/>
+        </w:rPr>
+        <w:t>&lt;</w:t>
+      </w:r>
+      <w:proofErr w:type="spellStart"/>
+      <w:r>
+        <w:rPr>
+          <w:lang w:val="en-GB"/>
+        </w:rPr>
+        <w:t>AttendanceSummaryResult</w:t>
+      </w:r>
+      <w:proofErr w:type="spellEnd"/>
+      <w:proofErr w:type="gramStart"/>
+      <w:r>
+        <w:rPr>
+          <w:lang w:val="en-GB"/>
+        </w:rPr>
+        <w:t>&gt;(</w:t>
+      </w:r>
+      <w:proofErr w:type="gramEnd"/>
+      <w:r>
+        <w:rPr>
+          <w:lang w:val="en-GB"/>
+        </w:rPr>
+        <w:t>)</w:t>
+      </w:r>
+    </w:p>
+    <w:p>
+      <w:pPr>
+        <w:spacing w:after="0" w:line="240" w:lineRule="auto"/>
+        <w:rPr>
+          <w:lang w:val="en-GB"/>
+        </w:rPr>
+      </w:pPr>
+      <w:r>
+        <w:rPr>
+          <w:lang w:val="en-GB"/>
+        </w:rPr>
+        <w:t xml:space="preserve">            </w:t>
+      </w:r>
+      <w:proofErr w:type="gramStart"/>
+      <w:r>
+        <w:rPr>
+          <w:lang w:val="en-GB"/>
+        </w:rPr>
+        <w:t>.</w:t>
+      </w:r>
+      <w:proofErr w:type="spellStart"/>
+      <w:r>
+        <w:rPr>
+          <w:lang w:val="en-GB"/>
+        </w:rPr>
+        <w:t>FromSqlRaw</w:t>
+      </w:r>
+      <w:proofErr w:type="spellEnd"/>
+      <w:proofErr w:type="gramEnd"/>
+      <w:r>
+        <w:rPr>
+          <w:lang w:val="en-GB"/>
+        </w:rPr>
+        <w:t xml:space="preserve">("EXEC </w:t>
+      </w:r>
+      <w:proofErr w:type="spellStart"/>
+      <w:proofErr w:type="gramStart"/>
+      <w:r>
+        <w:rPr>
+          <w:lang w:val="en-GB"/>
+        </w:rPr>
+        <w:t>kenuser.Pr</w:t>
+      </w:r>
+      <w:proofErr w:type="gramEnd"/>
+      <w:r>
+        <w:rPr>
+          <w:lang w:val="en-GB"/>
+        </w:rPr>
+        <w:t>_GetAttendanceSummary</w:t>
+      </w:r>
+      <w:proofErr w:type="spellEnd"/>
+      <w:r>
+        <w:rPr>
+          <w:lang w:val="en-GB"/>
+        </w:rPr>
+        <w:t xml:space="preserve"> @empNo = {0}, @startDate = {1}, @endDate = {2}",</w:t>
+      </w:r>
+    </w:p>
+    <w:p>
+      <w:pPr>
+        <w:spacing w:after="0" w:line="240" w:lineRule="auto"/>
+        <w:rPr>
+          <w:lang w:val="en-GB"/>
+        </w:rPr>
+      </w:pPr>
+      <w:r>
+        <w:rPr>
+          <w:lang w:val="en-GB"/>
+        </w:rPr>
+        <w:t xml:space="preserve">            </w:t>
+      </w:r>
+      <w:proofErr w:type="spellStart"/>
+      <w:r>
+        <w:rPr>
+          <w:lang w:val="en-GB"/>
+        </w:rPr>
+        <w:t>empNo</w:t>
+      </w:r>
+      <w:proofErr w:type="spellEnd"/>
+      <w:r>
+        <w:rPr>
+          <w:lang w:val="en-GB"/>
+        </w:rPr>
+        <w:t xml:space="preserve">, </w:t>
+      </w:r>
+      <w:proofErr w:type="spellStart"/>
+      <w:proofErr w:type="gramStart"/>
+      <w:r>
+        <w:rPr>
+          <w:lang w:val="en-GB"/>
+        </w:rPr>
+        <w:t>startDate</w:t>
+      </w:r>
+      <w:proofErr w:type="spellEnd"/>
+      <w:r>
+        <w:rPr>
+          <w:lang w:val="en-GB"/>
+        </w:rPr>
+        <w:t>!,</w:t>
+      </w:r>
+      <w:proofErr w:type="gramEnd"/>
+      <w:r>
+        <w:rPr>
+          <w:lang w:val="en-GB"/>
+        </w:rPr>
+        <w:t xml:space="preserve"> </w:t>
+      </w:r>
+      <w:proofErr w:type="spellStart"/>
+      <w:r>
+        <w:rPr>
+          <w:lang w:val="en-GB"/>
+        </w:rPr>
+        <w:t>endDate</w:t>
+      </w:r>
+      <w:proofErr w:type="spellEnd"/>
+      <w:r>
+        <w:rPr>
+          <w:lang w:val="en-GB"/>
+        </w:rPr>
+        <w:t>!)</w:t>
+      </w:r>
+    </w:p>
+    <w:p>
+      <w:pPr>
+        <w:spacing w:after="0" w:line="240" w:lineRule="auto"/>
+        <w:rPr>
+          <w:lang w:val="en-GB"/>
+        </w:rPr>
+      </w:pPr>
+      <w:r>
+        <w:rPr>
+          <w:lang w:val="en-GB"/>
+        </w:rPr>
+        <w:t xml:space="preserve">            </w:t>
+      </w:r>
+      <w:proofErr w:type="gramStart"/>
+      <w:r>
+        <w:rPr>
+          <w:lang w:val="en-GB"/>
+        </w:rPr>
+        <w:t>.</w:t>
+      </w:r>
+      <w:proofErr w:type="spellStart"/>
+      <w:r>
+        <w:rPr>
+          <w:lang w:val="en-GB"/>
+        </w:rPr>
+        <w:t>AsNoTracking</w:t>
+      </w:r>
+      <w:proofErr w:type="spellEnd"/>
+      <w:proofErr w:type="gramEnd"/>
+      <w:r>
+        <w:rPr>
+          <w:lang w:val="en-GB"/>
+        </w:rPr>
+        <w:t>()</w:t>
+      </w:r>
+    </w:p>
+    <w:p>
+      <w:pPr>
+        <w:spacing w:after="0" w:line="240" w:lineRule="auto"/>
+        <w:rPr>
+          <w:lang w:val="en-GB"/>
+        </w:rPr>
+      </w:pPr>
+      <w:r>
+        <w:rPr>
+          <w:lang w:val="en-GB"/>
+        </w:rPr>
+        <w:t xml:space="preserve">            </w:t>
+      </w:r>
+      <w:proofErr w:type="gramStart"/>
+      <w:r>
+        <w:rPr>
+          <w:lang w:val="en-GB"/>
+        </w:rPr>
+        <w:t>.</w:t>
+      </w:r>
+      <w:proofErr w:type="spellStart"/>
+      <w:r>
+        <w:rPr>
+          <w:lang w:val="en-GB"/>
+        </w:rPr>
+        <w:t>ToListAsync</w:t>
+      </w:r>
+      <w:proofErr w:type="spellEnd"/>
+      <w:proofErr w:type="gramEnd"/>
+      <w:r>
+        <w:rPr>
+          <w:lang w:val="en-GB"/>
+        </w:rPr>
         <w:t>();</w:t>
       </w:r>
-      <w:proofErr w:type="gramEnd"/>
-    </w:p>
-    <w:p>
-      <w:pPr>
-        <w:spacing w:after="0" w:line="240" w:lineRule="auto"/>
-        <w:rPr>
-          <w:lang w:val="en-GB"/>
-        </w:rPr>
-      </w:pPr>
-    </w:p>
-    <w:p>
-      <w:pPr>
-        <w:spacing w:after="0" w:line="240" w:lineRule="auto"/>
-        <w:rPr>
-          <w:lang w:val="en-GB"/>
-        </w:rPr>
-      </w:pPr>
-      <w:r>
-        <w:rPr>
-          <w:lang w:val="en-GB"/>
-        </w:rPr>
-        <w:t xml:space="preserve">    try</w:t>
-      </w:r>
-    </w:p>
-    <w:p>
-      <w:pPr>
-        <w:spacing w:after="0" w:line="240" w:lineRule="auto"/>
-        <w:rPr>
-          <w:lang w:val="en-GB"/>
-        </w:rPr>
-      </w:pPr>
-      <w:r>
-        <w:rPr>
-          <w:lang w:val="en-GB"/>
-        </w:rPr>
-        <w:t xml:space="preserve">    {</w:t>
-      </w:r>
-    </w:p>
-    <w:p>
-      <w:pPr>
-        <w:spacing w:after="0" w:line="240" w:lineRule="auto"/>
-        <w:rPr>
-          <w:lang w:val="en-GB"/>
-        </w:rPr>
-      </w:pPr>
-      <w:r>
-        <w:rPr>
-          <w:lang w:val="en-GB"/>
-        </w:rPr>
-        <w:t xml:space="preserve">        var model = await _</w:t>
-      </w:r>
-      <w:proofErr w:type="spellStart"/>
-      <w:proofErr w:type="gramStart"/>
-      <w:r>
-        <w:rPr>
-          <w:lang w:val="en-GB"/>
-        </w:rPr>
-        <w:t>db.Set</w:t>
-      </w:r>
-      <w:proofErr w:type="spellEnd"/>
-      <w:proofErr w:type="gramEnd"/>
-      <w:r>
-        <w:rPr>
-          <w:lang w:val="en-GB"/>
-        </w:rPr>
-        <w:t>&lt;</w:t>
-      </w:r>
-      <w:proofErr w:type="spellStart"/>
-      <w:r>
-        <w:rPr>
-          <w:lang w:val="en-GB"/>
-        </w:rPr>
-        <w:t>AttendanceSummaryResult</w:t>
-      </w:r>
-      <w:proofErr w:type="spellEnd"/>
-      <w:proofErr w:type="gramStart"/>
-      <w:r>
-        <w:rPr>
-          <w:lang w:val="en-GB"/>
-        </w:rPr>
-        <w:t>&gt;(</w:t>
-      </w:r>
-      <w:proofErr w:type="gramEnd"/>
-      <w:r>
-        <w:rPr>
-          <w:lang w:val="en-GB"/>
-        </w:rPr>
-        <w:t>)</w:t>
-      </w:r>
-    </w:p>
-    <w:p>
-      <w:pPr>
-        <w:spacing w:after="0" w:line="240" w:lineRule="auto"/>
-        <w:rPr>
-          <w:lang w:val="en-GB"/>
-        </w:rPr>
-      </w:pPr>
-      <w:r>
-        <w:rPr>
-          <w:lang w:val="en-GB"/>
-        </w:rPr>
-        <w:t xml:space="preserve">            </w:t>
-      </w:r>
-      <w:proofErr w:type="gramStart"/>
-      <w:r>
-        <w:rPr>
-          <w:lang w:val="en-GB"/>
-        </w:rPr>
-        <w:t>.</w:t>
-      </w:r>
-      <w:proofErr w:type="spellStart"/>
-      <w:r>
-        <w:rPr>
-          <w:lang w:val="en-GB"/>
-        </w:rPr>
-        <w:t>FromSqlRaw</w:t>
-      </w:r>
-      <w:proofErr w:type="spellEnd"/>
-      <w:proofErr w:type="gramEnd"/>
-      <w:r>
-        <w:rPr>
-          <w:lang w:val="en-GB"/>
-        </w:rPr>
-        <w:t xml:space="preserve">("EXEC </w:t>
-      </w:r>
-      <w:proofErr w:type="spellStart"/>
-      <w:proofErr w:type="gramStart"/>
-      <w:r>
-        <w:rPr>
-          <w:lang w:val="en-GB"/>
-        </w:rPr>
-        <w:t>kenuser.Pr</w:t>
-      </w:r>
-      <w:proofErr w:type="gramEnd"/>
-      <w:r>
-        <w:rPr>
-          <w:lang w:val="en-GB"/>
-        </w:rPr>
-        <w:t>_GetAttendanceSummary</w:t>
-      </w:r>
-      <w:proofErr w:type="spellEnd"/>
-      <w:r>
-        <w:rPr>
-          <w:lang w:val="en-GB"/>
-        </w:rPr>
-        <w:t xml:space="preserve"> @empNo = {0}, @startDate = {1}, @endDate = {2}",</w:t>
-      </w:r>
-    </w:p>
-    <w:p>
-      <w:pPr>
-        <w:spacing w:after="0" w:line="240" w:lineRule="auto"/>
-        <w:rPr>
-          <w:lang w:val="en-GB"/>
-        </w:rPr>
-      </w:pPr>
-      <w:r>
-        <w:rPr>
-          <w:lang w:val="en-GB"/>
-        </w:rPr>
-        <w:t xml:space="preserve">            </w:t>
-      </w:r>
-      <w:proofErr w:type="spellStart"/>
-      <w:r>
-        <w:rPr>
-          <w:lang w:val="en-GB"/>
-        </w:rPr>
-        <w:t>empNo</w:t>
-      </w:r>
-      <w:proofErr w:type="spellEnd"/>
-      <w:r>
-        <w:rPr>
-          <w:lang w:val="en-GB"/>
-        </w:rPr>
-        <w:t xml:space="preserve">, </w:t>
-      </w:r>
-      <w:proofErr w:type="spellStart"/>
-      <w:proofErr w:type="gramStart"/>
-      <w:r>
-        <w:rPr>
-          <w:lang w:val="en-GB"/>
-        </w:rPr>
-        <w:t>startDate</w:t>
-      </w:r>
-      <w:proofErr w:type="spellEnd"/>
-      <w:r>
-        <w:rPr>
-          <w:lang w:val="en-GB"/>
-        </w:rPr>
-        <w:t>!,</w:t>
-      </w:r>
-      <w:proofErr w:type="gramEnd"/>
-      <w:r>
-        <w:rPr>
-          <w:lang w:val="en-GB"/>
-        </w:rPr>
-        <w:t xml:space="preserve"> </w:t>
-      </w:r>
-      <w:proofErr w:type="spellStart"/>
-      <w:r>
-        <w:rPr>
-          <w:lang w:val="en-GB"/>
-        </w:rPr>
-        <w:t>endDate</w:t>
-      </w:r>
-      <w:proofErr w:type="spellEnd"/>
-      <w:r>
-        <w:rPr>
-          <w:lang w:val="en-GB"/>
-        </w:rPr>
-        <w:t>!)</w:t>
-      </w:r>
-    </w:p>
-    <w:p>
-      <w:pPr>
-        <w:spacing w:after="0" w:line="240" w:lineRule="auto"/>
-        <w:rPr>
-          <w:lang w:val="en-GB"/>
-        </w:rPr>
-      </w:pPr>
-      <w:r>
-        <w:rPr>
-          <w:lang w:val="en-GB"/>
-        </w:rPr>
-        <w:t xml:space="preserve">            </w:t>
-      </w:r>
-      <w:proofErr w:type="gramStart"/>
-      <w:r>
-        <w:rPr>
-          <w:lang w:val="en-GB"/>
-        </w:rPr>
-        <w:t>.</w:t>
-      </w:r>
-      <w:proofErr w:type="spellStart"/>
-      <w:r>
-        <w:rPr>
-          <w:lang w:val="en-GB"/>
-        </w:rPr>
-        <w:t>AsNoTracking</w:t>
-      </w:r>
-      <w:proofErr w:type="spellEnd"/>
-      <w:proofErr w:type="gramEnd"/>
-      <w:r>
-        <w:rPr>
-          <w:lang w:val="en-GB"/>
-        </w:rPr>
-        <w:t>()</w:t>
-      </w:r>
-    </w:p>
-    <w:p>
-      <w:pPr>
-        <w:spacing w:after="0" w:line="240" w:lineRule="auto"/>
-        <w:rPr>
-          <w:lang w:val="en-GB"/>
-        </w:rPr>
-      </w:pPr>
-      <w:r>
-        <w:rPr>
-          <w:lang w:val="en-GB"/>
-        </w:rPr>
-        <w:t xml:space="preserve">            </w:t>
-      </w:r>
-      <w:proofErr w:type="gramStart"/>
-      <w:r>
-        <w:rPr>
-          <w:lang w:val="en-GB"/>
-        </w:rPr>
-        <w:t>.</w:t>
-      </w:r>
-      <w:proofErr w:type="spellStart"/>
-      <w:r>
-        <w:rPr>
-          <w:lang w:val="en-GB"/>
-        </w:rPr>
-        <w:t>ToListAsync</w:t>
-      </w:r>
-      <w:proofErr w:type="spellEnd"/>
-      <w:proofErr w:type="gramEnd"/>
-      <w:r>
-        <w:rPr>
-          <w:lang w:val="en-GB"/>
-        </w:rPr>
-        <w:t>(</w:t>
-      </w:r>
-      <w:proofErr w:type="gramStart"/>
-      <w:r>
-        <w:rPr>
-          <w:lang w:val="en-GB"/>
-        </w:rPr>
-        <w:t>);</w:t>
-      </w:r>
-      <w:proofErr w:type="gramEnd"/>
     </w:p>
     <w:p>
       <w:pPr>
@@ -23191,16 +23189,8 @@
         <w:rPr>
           <w:lang w:val="en-GB"/>
         </w:rPr>
-        <w:t>}"</w:t>
-      </w:r>
-      <w:proofErr w:type="gramStart"/>
-      <w:r>
-        <w:rPr>
-          <w:lang w:val="en-GB"/>
-        </w:rPr>
-        <w:t>);</w:t>
-      </w:r>
-      <w:proofErr w:type="gramEnd"/>
+        <w:t>}");</w:t>
+      </w:r>
     </w:p>
     <w:p>
       <w:pPr>
@@ -27165,11 +27155,11 @@
         </w:rPr>
         <w:t>Icon</w:t>
       </w:r>
+      <w:r>
+        <w:t>="@</w:t>
+      </w:r>
+      <w:proofErr w:type="spellStart"/>
       <w:proofErr w:type="gramStart"/>
-      <w:r>
-        <w:t>="@</w:t>
-      </w:r>
-      <w:proofErr w:type="spellStart"/>
       <w:r>
         <w:t>Icons.Material.Filled.Circle</w:t>
       </w:r>
@@ -27195,12 +27185,10 @@
         <w:t>IconColor</w:t>
       </w:r>
       <w:proofErr w:type="spellEnd"/>
-      <w:proofErr w:type="gramStart"/>
       <w:r>
         <w:t>="@</w:t>
       </w:r>
       <w:proofErr w:type="spellStart"/>
-      <w:proofErr w:type="gramEnd"/>
       <w:r>
         <w:t>GetLegendColor</w:t>
       </w:r>
@@ -27631,755 +27619,732 @@
         <w:t>StateHasChanged</w:t>
       </w:r>
       <w:proofErr w:type="spellEnd"/>
+      <w:r>
+        <w:t>);</w:t>
+      </w:r>
+    </w:p>
+    <w:p>
+      <w:pPr>
+        <w:spacing w:after="0" w:line="240" w:lineRule="auto"/>
+      </w:pPr>
+    </w:p>
+    <w:p>
+      <w:pPr>
+        <w:spacing w:after="0" w:line="240" w:lineRule="auto"/>
+      </w:pPr>
+      <w:r>
+        <w:t xml:space="preserve">    }, date);</w:t>
+      </w:r>
+    </w:p>
+    <w:p>
+      <w:pPr>
+        <w:spacing w:after="0" w:line="240" w:lineRule="auto"/>
+      </w:pPr>
+      <w:r>
+        <w:t>}</w:t>
+      </w:r>
+    </w:p>
+    <w:p>
+      <w:pPr>
+        <w:spacing w:after="0" w:line="240" w:lineRule="auto"/>
+      </w:pPr>
+    </w:p>
+    <w:p>
+      <w:pPr>
+        <w:spacing w:after="0" w:line="240" w:lineRule="auto"/>
+      </w:pPr>
+      <w:r>
+        <w:t xml:space="preserve">private async Task </w:t>
+      </w:r>
+      <w:proofErr w:type="spellStart"/>
       <w:proofErr w:type="gramStart"/>
       <w:r>
+        <w:t>GetAttendanceDetail</w:t>
+      </w:r>
+      <w:proofErr w:type="spellEnd"/>
+      <w:r>
+        <w:t>(</w:t>
+      </w:r>
+      <w:proofErr w:type="gramEnd"/>
+      <w:r>
+        <w:t xml:space="preserve">Func&lt;Task&gt; callback, </w:t>
+      </w:r>
+      <w:proofErr w:type="spellStart"/>
+      <w:r>
+        <w:t>DateTime</w:t>
+      </w:r>
+      <w:proofErr w:type="spellEnd"/>
+      <w:r>
+        <w:t xml:space="preserve">? </w:t>
+      </w:r>
+      <w:proofErr w:type="spellStart"/>
+      <w:r>
+        <w:t>selectedDate</w:t>
+      </w:r>
+      <w:proofErr w:type="spellEnd"/>
+      <w:r>
+        <w:t>)</w:t>
+      </w:r>
+    </w:p>
+    <w:p>
+      <w:pPr>
+        <w:spacing w:after="0" w:line="240" w:lineRule="auto"/>
+      </w:pPr>
+      <w:r>
+        <w:t>{</w:t>
+      </w:r>
+    </w:p>
+    <w:p>
+      <w:pPr>
+        <w:spacing w:after="0" w:line="240" w:lineRule="auto"/>
+      </w:pPr>
+      <w:r>
+        <w:t xml:space="preserve">    try</w:t>
+      </w:r>
+    </w:p>
+    <w:p>
+      <w:pPr>
+        <w:spacing w:after="0" w:line="240" w:lineRule="auto"/>
+      </w:pPr>
+      <w:r>
+        <w:t xml:space="preserve">    {</w:t>
+      </w:r>
+    </w:p>
+    <w:p>
+      <w:pPr>
+        <w:spacing w:after="0" w:line="240" w:lineRule="auto"/>
+      </w:pPr>
+      <w:r>
+        <w:t xml:space="preserve">        _</w:t>
+      </w:r>
+      <w:proofErr w:type="spellStart"/>
+      <w:r>
+        <w:t>selectedDate</w:t>
+      </w:r>
+      <w:proofErr w:type="spellEnd"/>
+      <w:r>
+        <w:t xml:space="preserve"> = </w:t>
+      </w:r>
+      <w:proofErr w:type="spellStart"/>
+      <w:r>
+        <w:t>selectedDate</w:t>
+      </w:r>
+      <w:proofErr w:type="spellEnd"/>
+      <w:r>
+        <w:t>;</w:t>
+      </w:r>
+    </w:p>
+    <w:p>
+      <w:pPr>
+        <w:spacing w:after="0" w:line="240" w:lineRule="auto"/>
+      </w:pPr>
+    </w:p>
+    <w:p>
+      <w:pPr>
+        <w:spacing w:after="0" w:line="240" w:lineRule="auto"/>
+      </w:pPr>
+      <w:r>
+        <w:t xml:space="preserve">        // Wait for 1 second then gives control back to the runtime</w:t>
+      </w:r>
+    </w:p>
+    <w:p>
+      <w:pPr>
+        <w:spacing w:after="0" w:line="240" w:lineRule="auto"/>
+      </w:pPr>
+      <w:r>
+        <w:t xml:space="preserve">        //await </w:t>
+      </w:r>
+      <w:proofErr w:type="spellStart"/>
+      <w:r>
+        <w:t>Task.Delay</w:t>
+      </w:r>
+      <w:proofErr w:type="spellEnd"/>
+      <w:r>
+        <w:t>(500);</w:t>
+      </w:r>
+    </w:p>
+    <w:p>
+      <w:pPr>
+        <w:spacing w:after="0" w:line="240" w:lineRule="auto"/>
+      </w:pPr>
+    </w:p>
+    <w:p>
+      <w:pPr>
+        <w:spacing w:after="0" w:line="240" w:lineRule="auto"/>
+      </w:pPr>
+      <w:r>
+        <w:t xml:space="preserve">        // Reset collections</w:t>
+      </w:r>
+    </w:p>
+    <w:p>
+      <w:pPr>
+        <w:spacing w:after="0" w:line="240" w:lineRule="auto"/>
+      </w:pPr>
+      <w:r>
+        <w:t xml:space="preserve">        _</w:t>
+      </w:r>
+      <w:proofErr w:type="spellStart"/>
+      <w:r>
+        <w:t>errorMessage.Clear</w:t>
+      </w:r>
+      <w:proofErr w:type="spellEnd"/>
+      <w:r>
+        <w:t>();</w:t>
+      </w:r>
+    </w:p>
+    <w:p>
+      <w:pPr>
+        <w:spacing w:after="0" w:line="240" w:lineRule="auto"/>
+      </w:pPr>
+      <w:r>
+        <w:t xml:space="preserve">        _</w:t>
+      </w:r>
+      <w:proofErr w:type="spellStart"/>
+      <w:r>
+        <w:t>attendanceChips.Clear</w:t>
+      </w:r>
+      <w:proofErr w:type="spellEnd"/>
+      <w:r>
+        <w:t>();</w:t>
+      </w:r>
+    </w:p>
+    <w:p>
+      <w:pPr>
+        <w:spacing w:after="0" w:line="240" w:lineRule="auto"/>
+      </w:pPr>
+    </w:p>
+    <w:p>
+      <w:pPr>
+        <w:spacing w:after="0" w:line="240" w:lineRule="auto"/>
+      </w:pPr>
+      <w:r>
+        <w:t xml:space="preserve">        var </w:t>
+      </w:r>
+      <w:proofErr w:type="spellStart"/>
+      <w:r>
+        <w:t>attendanceResult</w:t>
+      </w:r>
+      <w:proofErr w:type="spellEnd"/>
+      <w:r>
+        <w:t xml:space="preserve"> = await </w:t>
+      </w:r>
+      <w:proofErr w:type="spellStart"/>
+      <w:r>
+        <w:t>AttendanceService.GetAttendanceDetailAsync</w:t>
+      </w:r>
+      <w:proofErr w:type="spellEnd"/>
+      <w:r>
+        <w:t>(</w:t>
+      </w:r>
+      <w:proofErr w:type="spellStart"/>
+      <w:r>
+        <w:t>UserEmpNo</w:t>
+      </w:r>
+      <w:proofErr w:type="spellEnd"/>
+      <w:r>
+        <w:t xml:space="preserve">, </w:t>
+      </w:r>
+      <w:proofErr w:type="spellStart"/>
+      <w:proofErr w:type="gramStart"/>
+      <w:r>
+        <w:t>selectedDate</w:t>
+      </w:r>
+      <w:proofErr w:type="spellEnd"/>
+      <w:r>
+        <w:t>!.</w:t>
+      </w:r>
+      <w:proofErr w:type="spellStart"/>
+      <w:proofErr w:type="gramEnd"/>
+      <w:r>
+        <w:t>Value.Date</w:t>
+      </w:r>
+      <w:proofErr w:type="spellEnd"/>
+      <w:r>
         <w:t>);</w:t>
       </w:r>
+    </w:p>
+    <w:p>
+      <w:pPr>
+        <w:spacing w:after="0" w:line="240" w:lineRule="auto"/>
+      </w:pPr>
+      <w:r>
+        <w:t xml:space="preserve">        if (</w:t>
+      </w:r>
+      <w:proofErr w:type="spellStart"/>
+      <w:r>
+        <w:t>attendanceResult.Success</w:t>
+      </w:r>
+      <w:proofErr w:type="spellEnd"/>
+      <w:r>
+        <w:t>)</w:t>
+      </w:r>
+    </w:p>
+    <w:p>
+      <w:pPr>
+        <w:spacing w:after="0" w:line="240" w:lineRule="auto"/>
+      </w:pPr>
+      <w:r>
+        <w:t xml:space="preserve">        {</w:t>
+      </w:r>
+    </w:p>
+    <w:p>
+      <w:pPr>
+        <w:spacing w:after="0" w:line="240" w:lineRule="auto"/>
+      </w:pPr>
+      <w:r>
+        <w:t xml:space="preserve">            _</w:t>
+      </w:r>
+      <w:proofErr w:type="spellStart"/>
+      <w:r>
+        <w:t>attendanceDetail</w:t>
+      </w:r>
+      <w:proofErr w:type="spellEnd"/>
+      <w:r>
+        <w:t xml:space="preserve"> = new </w:t>
+      </w:r>
+      <w:proofErr w:type="spellStart"/>
+      <w:proofErr w:type="gramStart"/>
+      <w:r>
+        <w:t>AttendanceDetailDTO</w:t>
+      </w:r>
+      <w:proofErr w:type="spellEnd"/>
+      <w:r>
+        <w:t>(</w:t>
+      </w:r>
       <w:proofErr w:type="gramEnd"/>
-    </w:p>
-    <w:p>
-      <w:pPr>
-        <w:spacing w:after="0" w:line="240" w:lineRule="auto"/>
-      </w:pPr>
-    </w:p>
-    <w:p>
-      <w:pPr>
-        <w:spacing w:after="0" w:line="240" w:lineRule="auto"/>
-      </w:pPr>
-      <w:r>
-        <w:t xml:space="preserve">    }, date);</w:t>
-      </w:r>
-    </w:p>
-    <w:p>
-      <w:pPr>
-        <w:spacing w:after="0" w:line="240" w:lineRule="auto"/>
-      </w:pPr>
-      <w:r>
-        <w:t>}</w:t>
-      </w:r>
-    </w:p>
-    <w:p>
-      <w:pPr>
-        <w:spacing w:after="0" w:line="240" w:lineRule="auto"/>
-      </w:pPr>
-    </w:p>
-    <w:p>
-      <w:pPr>
-        <w:spacing w:after="0" w:line="240" w:lineRule="auto"/>
-      </w:pPr>
-      <w:r>
-        <w:t xml:space="preserve">private async Task </w:t>
+      <w:r>
+        <w:t>);</w:t>
+      </w:r>
+    </w:p>
+    <w:p>
+      <w:pPr>
+        <w:spacing w:after="0" w:line="240" w:lineRule="auto"/>
+      </w:pPr>
+      <w:r>
+        <w:t xml:space="preserve">            _</w:t>
+      </w:r>
+      <w:proofErr w:type="spellStart"/>
+      <w:r>
+        <w:t>attendanceDetail</w:t>
+      </w:r>
+      <w:proofErr w:type="spellEnd"/>
+      <w:r>
+        <w:t xml:space="preserve"> = </w:t>
       </w:r>
       <w:proofErr w:type="spellStart"/>
       <w:proofErr w:type="gramStart"/>
       <w:r>
-        <w:t>GetAttendanceDetail</w:t>
+        <w:t>attendanceResult</w:t>
+      </w:r>
+      <w:proofErr w:type="spellEnd"/>
+      <w:r>
+        <w:t>!.</w:t>
+      </w:r>
+      <w:proofErr w:type="gramEnd"/>
+      <w:r>
+        <w:t>Value;</w:t>
+      </w:r>
+    </w:p>
+    <w:p>
+      <w:pPr>
+        <w:spacing w:after="0" w:line="240" w:lineRule="auto"/>
+      </w:pPr>
+    </w:p>
+    <w:p>
+      <w:pPr>
+        <w:spacing w:after="0" w:line="240" w:lineRule="auto"/>
+      </w:pPr>
+      <w:r>
+        <w:t xml:space="preserve">            if (_</w:t>
+      </w:r>
+      <w:proofErr w:type="spellStart"/>
+      <w:proofErr w:type="gramStart"/>
+      <w:r>
+        <w:t>attendanceDetail</w:t>
+      </w:r>
+      <w:proofErr w:type="spellEnd"/>
+      <w:r>
+        <w:t xml:space="preserve"> !</w:t>
+      </w:r>
+      <w:proofErr w:type="gramEnd"/>
+      <w:r>
+        <w:t>= null)</w:t>
+      </w:r>
+    </w:p>
+    <w:p>
+      <w:pPr>
+        <w:spacing w:after="0" w:line="240" w:lineRule="auto"/>
+      </w:pPr>
+      <w:r>
+        <w:t xml:space="preserve">            {</w:t>
+      </w:r>
+    </w:p>
+    <w:p>
+      <w:pPr>
+        <w:spacing w:after="0" w:line="240" w:lineRule="auto"/>
+      </w:pPr>
+      <w:r>
+        <w:t xml:space="preserve">                #region Get the First Time </w:t>
+      </w:r>
+      <w:proofErr w:type="gramStart"/>
+      <w:r>
+        <w:t>In</w:t>
+      </w:r>
+      <w:proofErr w:type="gramEnd"/>
+      <w:r>
+        <w:t xml:space="preserve"> and Last Time Out</w:t>
+      </w:r>
+    </w:p>
+    <w:p>
+      <w:pPr>
+        <w:spacing w:after="0" w:line="240" w:lineRule="auto"/>
+      </w:pPr>
+      <w:r>
+        <w:t xml:space="preserve">                if (_</w:t>
+      </w:r>
+      <w:proofErr w:type="spellStart"/>
+      <w:proofErr w:type="gramStart"/>
+      <w:r>
+        <w:t>attendanceDetail.FirstTimeIn.HasValue</w:t>
+      </w:r>
+      <w:proofErr w:type="spellEnd"/>
+      <w:proofErr w:type="gramEnd"/>
+      <w:r>
+        <w:t>)</w:t>
+      </w:r>
+    </w:p>
+    <w:p>
+      <w:pPr>
+        <w:spacing w:after="0" w:line="240" w:lineRule="auto"/>
+      </w:pPr>
+      <w:r>
+        <w:t xml:space="preserve">                    _</w:t>
+      </w:r>
+      <w:proofErr w:type="spellStart"/>
+      <w:r>
+        <w:t>firstTimeIn</w:t>
+      </w:r>
+      <w:proofErr w:type="spellEnd"/>
+      <w:r>
+        <w:t xml:space="preserve"> = $"{_attendanceDetail.FirstTimeIn:</w:t>
+      </w:r>
+      <w:proofErr w:type="gramStart"/>
+      <w:r>
+        <w:t>dd}{GetOrdinal(</w:t>
+      </w:r>
+      <w:proofErr w:type="gramEnd"/>
+      <w:r>
+        <w:t>_</w:t>
+      </w:r>
+      <w:proofErr w:type="gramStart"/>
+      <w:r>
+        <w:t>attendanceDetail.FirstTimeIn.Value.Day</w:t>
+      </w:r>
+      <w:proofErr w:type="gramEnd"/>
+      <w:r>
+        <w:t>)} {_</w:t>
+      </w:r>
+      <w:proofErr w:type="spellStart"/>
+      <w:proofErr w:type="gramStart"/>
+      <w:r>
+        <w:t>attendanceDetail.FirstTimeIn:MMM</w:t>
+      </w:r>
+      <w:proofErr w:type="spellEnd"/>
+      <w:proofErr w:type="gramEnd"/>
+      <w:r>
+        <w:t xml:space="preserve"> </w:t>
+      </w:r>
+      <w:proofErr w:type="spellStart"/>
+      <w:r>
+        <w:t>yyyy</w:t>
+      </w:r>
+      <w:proofErr w:type="spellEnd"/>
+      <w:r>
+        <w:t xml:space="preserve"> </w:t>
+      </w:r>
+      <w:proofErr w:type="spellStart"/>
+      <w:r>
+        <w:t>hh:</w:t>
+      </w:r>
+      <w:proofErr w:type="gramStart"/>
+      <w:r>
+        <w:t>mm:ss</w:t>
+      </w:r>
+      <w:proofErr w:type="spellEnd"/>
+      <w:proofErr w:type="gramEnd"/>
+      <w:r>
+        <w:t xml:space="preserve"> tt}";</w:t>
+      </w:r>
+    </w:p>
+    <w:p>
+      <w:pPr>
+        <w:spacing w:after="0" w:line="240" w:lineRule="auto"/>
+      </w:pPr>
+      <w:r>
+        <w:t xml:space="preserve">                else</w:t>
+      </w:r>
+    </w:p>
+    <w:p>
+      <w:pPr>
+        <w:spacing w:after="0" w:line="240" w:lineRule="auto"/>
+      </w:pPr>
+      <w:r>
+        <w:t xml:space="preserve">                    _</w:t>
+      </w:r>
+      <w:proofErr w:type="spellStart"/>
+      <w:r>
+        <w:t>firstTimeIn</w:t>
+      </w:r>
+      <w:proofErr w:type="spellEnd"/>
+      <w:r>
+        <w:t xml:space="preserve"> = </w:t>
+      </w:r>
+      <w:proofErr w:type="spellStart"/>
+      <w:proofErr w:type="gramStart"/>
+      <w:r>
+        <w:t>string.Empty</w:t>
+      </w:r>
+      <w:proofErr w:type="spellEnd"/>
+      <w:proofErr w:type="gramEnd"/>
+      <w:r>
+        <w:t>;</w:t>
+      </w:r>
+    </w:p>
+    <w:p>
+      <w:pPr>
+        <w:spacing w:after="0" w:line="240" w:lineRule="auto"/>
+      </w:pPr>
+    </w:p>
+    <w:p>
+      <w:pPr>
+        <w:spacing w:after="0" w:line="240" w:lineRule="auto"/>
+      </w:pPr>
+      <w:r>
+        <w:t xml:space="preserve">                if (_</w:t>
+      </w:r>
+      <w:proofErr w:type="spellStart"/>
+      <w:proofErr w:type="gramStart"/>
+      <w:r>
+        <w:t>attendanceDetail.LastTimeOut.HasValue</w:t>
+      </w:r>
+      <w:proofErr w:type="spellEnd"/>
+      <w:proofErr w:type="gramEnd"/>
+      <w:r>
+        <w:t>)</w:t>
+      </w:r>
+    </w:p>
+    <w:p>
+      <w:pPr>
+        <w:spacing w:after="0" w:line="240" w:lineRule="auto"/>
+      </w:pPr>
+      <w:r>
+        <w:t xml:space="preserve">                    _</w:t>
+      </w:r>
+      <w:proofErr w:type="spellStart"/>
+      <w:r>
+        <w:t>lastTimeOut</w:t>
+      </w:r>
+      <w:proofErr w:type="spellEnd"/>
+      <w:r>
+        <w:t xml:space="preserve"> = $"{_attendanceDetail.LastTimeOut:</w:t>
+      </w:r>
+      <w:proofErr w:type="gramStart"/>
+      <w:r>
+        <w:t>dd}{GetOrdinal(</w:t>
+      </w:r>
+      <w:proofErr w:type="gramEnd"/>
+      <w:r>
+        <w:t>_</w:t>
+      </w:r>
+      <w:proofErr w:type="gramStart"/>
+      <w:r>
+        <w:t>attendanceDetail.LastTimeOut.Value.Day</w:t>
+      </w:r>
+      <w:proofErr w:type="gramEnd"/>
+      <w:r>
+        <w:t>)} {_</w:t>
+      </w:r>
+      <w:proofErr w:type="spellStart"/>
+      <w:proofErr w:type="gramStart"/>
+      <w:r>
+        <w:t>attendanceDetail.LastTimeOut:MMM</w:t>
+      </w:r>
+      <w:proofErr w:type="spellEnd"/>
+      <w:proofErr w:type="gramEnd"/>
+      <w:r>
+        <w:t xml:space="preserve"> </w:t>
+      </w:r>
+      <w:proofErr w:type="spellStart"/>
+      <w:r>
+        <w:t>yyyy</w:t>
+      </w:r>
+      <w:proofErr w:type="spellEnd"/>
+      <w:r>
+        <w:t xml:space="preserve"> </w:t>
+      </w:r>
+      <w:proofErr w:type="spellStart"/>
+      <w:r>
+        <w:t>hh:</w:t>
+      </w:r>
+      <w:proofErr w:type="gramStart"/>
+      <w:r>
+        <w:t>mm:ss</w:t>
+      </w:r>
+      <w:proofErr w:type="spellEnd"/>
+      <w:proofErr w:type="gramEnd"/>
+      <w:r>
+        <w:t xml:space="preserve"> tt}";</w:t>
+      </w:r>
+    </w:p>
+    <w:p>
+      <w:pPr>
+        <w:spacing w:after="0" w:line="240" w:lineRule="auto"/>
+      </w:pPr>
+      <w:r>
+        <w:t xml:space="preserve">                else</w:t>
+      </w:r>
+    </w:p>
+    <w:p>
+      <w:pPr>
+        <w:spacing w:after="0" w:line="240" w:lineRule="auto"/>
+      </w:pPr>
+      <w:r>
+        <w:t xml:space="preserve">                    _</w:t>
+      </w:r>
+      <w:proofErr w:type="spellStart"/>
+      <w:r>
+        <w:t>lastTimeOut</w:t>
+      </w:r>
+      <w:proofErr w:type="spellEnd"/>
+      <w:r>
+        <w:t xml:space="preserve"> = </w:t>
+      </w:r>
+      <w:proofErr w:type="spellStart"/>
+      <w:proofErr w:type="gramStart"/>
+      <w:r>
+        <w:t>string.Empty</w:t>
+      </w:r>
+      <w:proofErr w:type="spellEnd"/>
+      <w:proofErr w:type="gramEnd"/>
+      <w:r>
+        <w:t>;</w:t>
+      </w:r>
+    </w:p>
+    <w:p>
+      <w:pPr>
+        <w:spacing w:after="0" w:line="240" w:lineRule="auto"/>
+      </w:pPr>
+    </w:p>
+    <w:p>
+      <w:pPr>
+        <w:spacing w:after="0" w:line="240" w:lineRule="auto"/>
+      </w:pPr>
+      <w:r>
+        <w:t xml:space="preserve">                _</w:t>
+      </w:r>
+      <w:proofErr w:type="spellStart"/>
+      <w:r>
+        <w:t>isPunchedIn</w:t>
+      </w:r>
+      <w:proofErr w:type="spellEnd"/>
+      <w:r>
+        <w:t xml:space="preserve"> = _</w:t>
+      </w:r>
+      <w:proofErr w:type="spellStart"/>
+      <w:r>
+        <w:t>attendanceDetail.SwipeType</w:t>
+      </w:r>
+      <w:proofErr w:type="spellEnd"/>
+      <w:r>
+        <w:t xml:space="preserve"> == "IN</w:t>
+      </w:r>
+      <w:proofErr w:type="gramStart"/>
+      <w:r>
+        <w:t>" ?</w:t>
+      </w:r>
+      <w:proofErr w:type="gramEnd"/>
+      <w:r>
+        <w:t xml:space="preserve"> </w:t>
+      </w:r>
+      <w:proofErr w:type="gramStart"/>
+      <w:r>
+        <w:t>true :</w:t>
+      </w:r>
+      <w:proofErr w:type="gramEnd"/>
+      <w:r>
+        <w:t xml:space="preserve"> false;</w:t>
+      </w:r>
+    </w:p>
+    <w:p>
+      <w:pPr>
+        <w:spacing w:after="0" w:line="240" w:lineRule="auto"/>
+      </w:pPr>
+      <w:r>
+        <w:t xml:space="preserve">                #endregion</w:t>
+      </w:r>
+    </w:p>
+    <w:p>
+      <w:pPr>
+        <w:spacing w:after="0" w:line="240" w:lineRule="auto"/>
+      </w:pPr>
+    </w:p>
+    <w:p>
+      <w:pPr>
+        <w:spacing w:after="0" w:line="240" w:lineRule="auto"/>
+      </w:pPr>
+      <w:r>
+        <w:t xml:space="preserve">                #region Get Attendance Duration</w:t>
+      </w:r>
+    </w:p>
+    <w:p>
+      <w:pPr>
+        <w:spacing w:after="0" w:line="240" w:lineRule="auto"/>
+      </w:pPr>
+      <w:r>
+        <w:t xml:space="preserve">                var </w:t>
+      </w:r>
+      <w:proofErr w:type="spellStart"/>
+      <w:r>
+        <w:t>durationResult</w:t>
+      </w:r>
+      <w:proofErr w:type="spellEnd"/>
+      <w:r>
+        <w:t xml:space="preserve"> = await </w:t>
+      </w:r>
+      <w:proofErr w:type="spellStart"/>
+      <w:r>
+        <w:t>AttendanceService.GetAttendanceDurationAsync</w:t>
       </w:r>
       <w:proofErr w:type="spellEnd"/>
       <w:r>
         <w:t>(</w:t>
       </w:r>
+      <w:proofErr w:type="spellStart"/>
+      <w:r>
+        <w:t>UserEmpNo</w:t>
+      </w:r>
+      <w:proofErr w:type="spellEnd"/>
+      <w:r>
+        <w:t xml:space="preserve">, </w:t>
+      </w:r>
+      <w:proofErr w:type="spellStart"/>
+      <w:proofErr w:type="gramStart"/>
+      <w:r>
+        <w:t>selectedDate</w:t>
+      </w:r>
+      <w:proofErr w:type="spellEnd"/>
+      <w:r>
+        <w:t>!.</w:t>
+      </w:r>
+      <w:proofErr w:type="spellStart"/>
       <w:proofErr w:type="gramEnd"/>
       <w:r>
-        <w:t xml:space="preserve">Func&lt;Task&gt; callback, </w:t>
-      </w:r>
-      <w:proofErr w:type="spellStart"/>
-      <w:r>
-        <w:t>DateTime</w:t>
-      </w:r>
-      <w:proofErr w:type="spellEnd"/>
-      <w:r>
-        <w:t xml:space="preserve">? </w:t>
-      </w:r>
-      <w:proofErr w:type="spellStart"/>
-      <w:r>
-        <w:t>selectedDate</w:t>
-      </w:r>
-      <w:proofErr w:type="spellEnd"/>
-      <w:r>
-        <w:t>)</w:t>
-      </w:r>
-    </w:p>
-    <w:p>
-      <w:pPr>
-        <w:spacing w:after="0" w:line="240" w:lineRule="auto"/>
-      </w:pPr>
-      <w:r>
-        <w:t>{</w:t>
-      </w:r>
-    </w:p>
-    <w:p>
-      <w:pPr>
-        <w:spacing w:after="0" w:line="240" w:lineRule="auto"/>
-      </w:pPr>
-      <w:r>
-        <w:t xml:space="preserve">    try</w:t>
-      </w:r>
-    </w:p>
-    <w:p>
-      <w:pPr>
-        <w:spacing w:after="0" w:line="240" w:lineRule="auto"/>
-      </w:pPr>
-      <w:r>
-        <w:t xml:space="preserve">    {</w:t>
-      </w:r>
-    </w:p>
-    <w:p>
-      <w:pPr>
-        <w:spacing w:after="0" w:line="240" w:lineRule="auto"/>
-      </w:pPr>
-      <w:r>
-        <w:t xml:space="preserve">        _</w:t>
-      </w:r>
-      <w:proofErr w:type="spellStart"/>
-      <w:r>
-        <w:t>selectedDate</w:t>
-      </w:r>
-      <w:proofErr w:type="spellEnd"/>
-      <w:r>
-        <w:t xml:space="preserve"> = </w:t>
-      </w:r>
-      <w:proofErr w:type="spellStart"/>
-      <w:r>
-        <w:t>selectedDate</w:t>
-      </w:r>
-      <w:proofErr w:type="spellEnd"/>
-      <w:r>
-        <w:t>;</w:t>
-      </w:r>
-    </w:p>
-    <w:p>
-      <w:pPr>
-        <w:spacing w:after="0" w:line="240" w:lineRule="auto"/>
-      </w:pPr>
-    </w:p>
-    <w:p>
-      <w:pPr>
-        <w:spacing w:after="0" w:line="240" w:lineRule="auto"/>
-      </w:pPr>
-      <w:r>
-        <w:t xml:space="preserve">        // Wait for 1 second then gives control back to the runtime</w:t>
-      </w:r>
-    </w:p>
-    <w:p>
-      <w:pPr>
-        <w:spacing w:after="0" w:line="240" w:lineRule="auto"/>
-      </w:pPr>
-      <w:r>
-        <w:t xml:space="preserve">        //await </w:t>
-      </w:r>
-      <w:proofErr w:type="spellStart"/>
-      <w:r>
-        <w:t>Task.Delay</w:t>
-      </w:r>
-      <w:proofErr w:type="spellEnd"/>
-      <w:r>
-        <w:t>(500);</w:t>
-      </w:r>
-    </w:p>
-    <w:p>
-      <w:pPr>
-        <w:spacing w:after="0" w:line="240" w:lineRule="auto"/>
-      </w:pPr>
-    </w:p>
-    <w:p>
-      <w:pPr>
-        <w:spacing w:after="0" w:line="240" w:lineRule="auto"/>
-      </w:pPr>
-      <w:r>
-        <w:t xml:space="preserve">        // Reset collections</w:t>
-      </w:r>
-    </w:p>
-    <w:p>
-      <w:pPr>
-        <w:spacing w:after="0" w:line="240" w:lineRule="auto"/>
-      </w:pPr>
-      <w:r>
-        <w:t xml:space="preserve">        _</w:t>
-      </w:r>
-      <w:proofErr w:type="spellStart"/>
-      <w:r>
-        <w:t>errorMessage.Clear</w:t>
-      </w:r>
-      <w:proofErr w:type="spellEnd"/>
-      <w:r>
-        <w:t>();</w:t>
-      </w:r>
-    </w:p>
-    <w:p>
-      <w:pPr>
-        <w:spacing w:after="0" w:line="240" w:lineRule="auto"/>
-      </w:pPr>
-      <w:r>
-        <w:t xml:space="preserve">        _</w:t>
-      </w:r>
-      <w:proofErr w:type="spellStart"/>
-      <w:r>
-        <w:t>attendanceChips.Clear</w:t>
-      </w:r>
-      <w:proofErr w:type="spellEnd"/>
-      <w:r>
-        <w:t>();</w:t>
-      </w:r>
-    </w:p>
-    <w:p>
-      <w:pPr>
-        <w:spacing w:after="0" w:line="240" w:lineRule="auto"/>
-      </w:pPr>
-    </w:p>
-    <w:p>
-      <w:pPr>
-        <w:spacing w:after="0" w:line="240" w:lineRule="auto"/>
-      </w:pPr>
-      <w:r>
-        <w:t xml:space="preserve">        var </w:t>
-      </w:r>
-      <w:proofErr w:type="spellStart"/>
-      <w:r>
-        <w:t>attendanceResult</w:t>
-      </w:r>
-      <w:proofErr w:type="spellEnd"/>
-      <w:r>
-        <w:t xml:space="preserve"> = await </w:t>
-      </w:r>
-      <w:proofErr w:type="spellStart"/>
-      <w:r>
-        <w:t>AttendanceService.GetAttendanceDetailAsync</w:t>
-      </w:r>
-      <w:proofErr w:type="spellEnd"/>
-      <w:r>
-        <w:t>(</w:t>
-      </w:r>
-      <w:proofErr w:type="spellStart"/>
-      <w:r>
-        <w:t>UserEmpNo</w:t>
-      </w:r>
-      <w:proofErr w:type="spellEnd"/>
-      <w:r>
-        <w:t xml:space="preserve">, </w:t>
-      </w:r>
-      <w:proofErr w:type="spellStart"/>
-      <w:proofErr w:type="gramStart"/>
-      <w:r>
-        <w:t>selectedDate</w:t>
-      </w:r>
-      <w:proofErr w:type="spellEnd"/>
-      <w:r>
-        <w:t>!.</w:t>
-      </w:r>
-      <w:proofErr w:type="spellStart"/>
-      <w:proofErr w:type="gramEnd"/>
-      <w:r>
         <w:t>Value.Date</w:t>
       </w:r>
       <w:proofErr w:type="spellEnd"/>
-      <w:proofErr w:type="gramStart"/>
       <w:r>
         <w:t>);</w:t>
       </w:r>
-      <w:proofErr w:type="gramEnd"/>
-    </w:p>
-    <w:p>
-      <w:pPr>
-        <w:spacing w:after="0" w:line="240" w:lineRule="auto"/>
-      </w:pPr>
-      <w:r>
-        <w:t xml:space="preserve">        if (</w:t>
-      </w:r>
-      <w:proofErr w:type="spellStart"/>
-      <w:r>
-        <w:t>attendanceResult.Success</w:t>
-      </w:r>
-      <w:proofErr w:type="spellEnd"/>
-      <w:r>
-        <w:t>)</w:t>
-      </w:r>
-    </w:p>
-    <w:p>
-      <w:pPr>
-        <w:spacing w:after="0" w:line="240" w:lineRule="auto"/>
-      </w:pPr>
-      <w:r>
-        <w:t xml:space="preserve">        {</w:t>
-      </w:r>
-    </w:p>
-    <w:p>
-      <w:pPr>
-        <w:spacing w:after="0" w:line="240" w:lineRule="auto"/>
-      </w:pPr>
-      <w:r>
-        <w:t xml:space="preserve">            _</w:t>
-      </w:r>
-      <w:proofErr w:type="spellStart"/>
-      <w:r>
-        <w:t>attendanceDetail</w:t>
-      </w:r>
-      <w:proofErr w:type="spellEnd"/>
-      <w:r>
-        <w:t xml:space="preserve"> = new </w:t>
-      </w:r>
-      <w:proofErr w:type="spellStart"/>
-      <w:proofErr w:type="gramStart"/>
-      <w:r>
-        <w:t>AttendanceDetailDTO</w:t>
-      </w:r>
-      <w:proofErr w:type="spellEnd"/>
-      <w:r>
-        <w:t>();</w:t>
-      </w:r>
-      <w:proofErr w:type="gramEnd"/>
-    </w:p>
-    <w:p>
-      <w:pPr>
-        <w:spacing w:after="0" w:line="240" w:lineRule="auto"/>
-      </w:pPr>
-      <w:r>
-        <w:t xml:space="preserve">            _</w:t>
-      </w:r>
-      <w:proofErr w:type="spellStart"/>
-      <w:r>
-        <w:t>attendanceDetail</w:t>
-      </w:r>
-      <w:proofErr w:type="spellEnd"/>
-      <w:r>
-        <w:t xml:space="preserve"> = </w:t>
-      </w:r>
-      <w:proofErr w:type="spellStart"/>
-      <w:proofErr w:type="gramStart"/>
-      <w:r>
-        <w:t>attendanceResult</w:t>
-      </w:r>
-      <w:proofErr w:type="spellEnd"/>
-      <w:r>
-        <w:t>!.Value;</w:t>
-      </w:r>
-      <w:proofErr w:type="gramEnd"/>
-    </w:p>
-    <w:p>
-      <w:pPr>
-        <w:spacing w:after="0" w:line="240" w:lineRule="auto"/>
-      </w:pPr>
-    </w:p>
-    <w:p>
-      <w:pPr>
-        <w:spacing w:after="0" w:line="240" w:lineRule="auto"/>
-      </w:pPr>
-      <w:r>
-        <w:t xml:space="preserve">            if (_</w:t>
-      </w:r>
-      <w:proofErr w:type="spellStart"/>
-      <w:proofErr w:type="gramStart"/>
-      <w:r>
-        <w:t>attendanceDetail</w:t>
-      </w:r>
-      <w:proofErr w:type="spellEnd"/>
-      <w:r>
-        <w:t xml:space="preserve"> !</w:t>
-      </w:r>
-      <w:proofErr w:type="gramEnd"/>
-      <w:r>
-        <w:t>= null)</w:t>
-      </w:r>
-    </w:p>
-    <w:p>
-      <w:pPr>
-        <w:spacing w:after="0" w:line="240" w:lineRule="auto"/>
-      </w:pPr>
-      <w:r>
-        <w:t xml:space="preserve">            {</w:t>
-      </w:r>
-    </w:p>
-    <w:p>
-      <w:pPr>
-        <w:spacing w:after="0" w:line="240" w:lineRule="auto"/>
-      </w:pPr>
-      <w:r>
-        <w:t xml:space="preserve">                #region Get the First Time </w:t>
-      </w:r>
-      <w:proofErr w:type="gramStart"/>
-      <w:r>
-        <w:t>In</w:t>
-      </w:r>
-      <w:proofErr w:type="gramEnd"/>
-      <w:r>
-        <w:t xml:space="preserve"> and Last Time Out</w:t>
-      </w:r>
-    </w:p>
-    <w:p>
-      <w:pPr>
-        <w:spacing w:after="0" w:line="240" w:lineRule="auto"/>
-      </w:pPr>
-      <w:r>
-        <w:t xml:space="preserve">                if (_</w:t>
-      </w:r>
-      <w:proofErr w:type="spellStart"/>
-      <w:proofErr w:type="gramStart"/>
-      <w:r>
-        <w:t>attendanceDetail.FirstTimeIn.HasValue</w:t>
-      </w:r>
-      <w:proofErr w:type="spellEnd"/>
-      <w:proofErr w:type="gramEnd"/>
-      <w:r>
-        <w:t>)</w:t>
-      </w:r>
-    </w:p>
-    <w:p>
-      <w:pPr>
-        <w:spacing w:after="0" w:line="240" w:lineRule="auto"/>
-      </w:pPr>
-      <w:r>
-        <w:t xml:space="preserve">                    _</w:t>
-      </w:r>
-      <w:proofErr w:type="spellStart"/>
-      <w:r>
-        <w:t>firstTimeIn</w:t>
-      </w:r>
-      <w:proofErr w:type="spellEnd"/>
-      <w:r>
-        <w:t xml:space="preserve"> = $"{_attendanceDetail.FirstTimeIn:</w:t>
-      </w:r>
-      <w:proofErr w:type="gramStart"/>
-      <w:r>
-        <w:t>dd}{GetOrdinal(</w:t>
-      </w:r>
-      <w:proofErr w:type="gramEnd"/>
-      <w:r>
-        <w:t>_</w:t>
-      </w:r>
-      <w:proofErr w:type="gramStart"/>
-      <w:r>
-        <w:t>attendanceDetail.FirstTimeIn.Value.Day</w:t>
-      </w:r>
-      <w:proofErr w:type="gramEnd"/>
-      <w:r>
-        <w:t>)} {_</w:t>
-      </w:r>
-      <w:proofErr w:type="spellStart"/>
-      <w:proofErr w:type="gramStart"/>
-      <w:r>
-        <w:t>attendanceDetail.FirstTimeIn:MMM</w:t>
-      </w:r>
-      <w:proofErr w:type="spellEnd"/>
-      <w:proofErr w:type="gramEnd"/>
-      <w:r>
-        <w:t xml:space="preserve"> </w:t>
-      </w:r>
-      <w:proofErr w:type="spellStart"/>
-      <w:r>
-        <w:t>yyyy</w:t>
-      </w:r>
-      <w:proofErr w:type="spellEnd"/>
-      <w:r>
-        <w:t xml:space="preserve"> </w:t>
-      </w:r>
-      <w:proofErr w:type="spellStart"/>
-      <w:r>
-        <w:t>hh:</w:t>
-      </w:r>
-      <w:proofErr w:type="gramStart"/>
-      <w:r>
-        <w:t>mm:ss</w:t>
-      </w:r>
-      <w:proofErr w:type="spellEnd"/>
-      <w:proofErr w:type="gramEnd"/>
-      <w:r>
-        <w:t xml:space="preserve"> tt}</w:t>
-      </w:r>
-      <w:proofErr w:type="gramStart"/>
-      <w:r>
-        <w:t>";</w:t>
-      </w:r>
-      <w:proofErr w:type="gramEnd"/>
-    </w:p>
-    <w:p>
-      <w:pPr>
-        <w:spacing w:after="0" w:line="240" w:lineRule="auto"/>
-      </w:pPr>
-      <w:r>
-        <w:t xml:space="preserve">                else</w:t>
-      </w:r>
-    </w:p>
-    <w:p>
-      <w:pPr>
-        <w:spacing w:after="0" w:line="240" w:lineRule="auto"/>
-      </w:pPr>
-      <w:r>
-        <w:t xml:space="preserve">                    _</w:t>
-      </w:r>
-      <w:proofErr w:type="spellStart"/>
-      <w:r>
-        <w:t>firstTimeIn</w:t>
-      </w:r>
-      <w:proofErr w:type="spellEnd"/>
-      <w:r>
-        <w:t xml:space="preserve"> = </w:t>
-      </w:r>
-      <w:proofErr w:type="spellStart"/>
-      <w:proofErr w:type="gramStart"/>
-      <w:r>
-        <w:t>string.Empty</w:t>
-      </w:r>
-      <w:proofErr w:type="spellEnd"/>
-      <w:proofErr w:type="gramEnd"/>
-      <w:r>
-        <w:t>;</w:t>
-      </w:r>
-    </w:p>
-    <w:p>
-      <w:pPr>
-        <w:spacing w:after="0" w:line="240" w:lineRule="auto"/>
-      </w:pPr>
-    </w:p>
-    <w:p>
-      <w:pPr>
-        <w:spacing w:after="0" w:line="240" w:lineRule="auto"/>
-      </w:pPr>
-      <w:r>
-        <w:t xml:space="preserve">                if (_</w:t>
-      </w:r>
-      <w:proofErr w:type="spellStart"/>
-      <w:proofErr w:type="gramStart"/>
-      <w:r>
-        <w:t>attendanceDetail.LastTimeOut.HasValue</w:t>
-      </w:r>
-      <w:proofErr w:type="spellEnd"/>
-      <w:proofErr w:type="gramEnd"/>
-      <w:r>
-        <w:t>)</w:t>
-      </w:r>
-    </w:p>
-    <w:p>
-      <w:pPr>
-        <w:spacing w:after="0" w:line="240" w:lineRule="auto"/>
-      </w:pPr>
-      <w:r>
-        <w:t xml:space="preserve">                    _</w:t>
-      </w:r>
-      <w:proofErr w:type="spellStart"/>
-      <w:r>
-        <w:t>lastTimeOut</w:t>
-      </w:r>
-      <w:proofErr w:type="spellEnd"/>
-      <w:r>
-        <w:t xml:space="preserve"> = $"{_attendanceDetail.LastTimeOut:</w:t>
-      </w:r>
-      <w:proofErr w:type="gramStart"/>
-      <w:r>
-        <w:t>dd}{GetOrdinal(</w:t>
-      </w:r>
-      <w:proofErr w:type="gramEnd"/>
-      <w:r>
-        <w:t>_</w:t>
-      </w:r>
-      <w:proofErr w:type="gramStart"/>
-      <w:r>
-        <w:t>attendanceDetail.LastTimeOut.Value.Day</w:t>
-      </w:r>
-      <w:proofErr w:type="gramEnd"/>
-      <w:r>
-        <w:t>)} {_</w:t>
-      </w:r>
-      <w:proofErr w:type="spellStart"/>
-      <w:proofErr w:type="gramStart"/>
-      <w:r>
-        <w:t>attendanceDetail.LastTimeOut:MMM</w:t>
-      </w:r>
-      <w:proofErr w:type="spellEnd"/>
-      <w:proofErr w:type="gramEnd"/>
-      <w:r>
-        <w:t xml:space="preserve"> </w:t>
-      </w:r>
-      <w:proofErr w:type="spellStart"/>
-      <w:r>
-        <w:t>yyyy</w:t>
-      </w:r>
-      <w:proofErr w:type="spellEnd"/>
-      <w:r>
-        <w:t xml:space="preserve"> </w:t>
-      </w:r>
-      <w:proofErr w:type="spellStart"/>
-      <w:r>
-        <w:t>hh:</w:t>
-      </w:r>
-      <w:proofErr w:type="gramStart"/>
-      <w:r>
-        <w:t>mm:ss</w:t>
-      </w:r>
-      <w:proofErr w:type="spellEnd"/>
-      <w:proofErr w:type="gramEnd"/>
-      <w:r>
-        <w:t xml:space="preserve"> tt}</w:t>
-      </w:r>
-      <w:proofErr w:type="gramStart"/>
-      <w:r>
-        <w:t>";</w:t>
-      </w:r>
-      <w:proofErr w:type="gramEnd"/>
-    </w:p>
-    <w:p>
-      <w:pPr>
-        <w:spacing w:after="0" w:line="240" w:lineRule="auto"/>
-      </w:pPr>
-      <w:r>
-        <w:t xml:space="preserve">                else</w:t>
-      </w:r>
-    </w:p>
-    <w:p>
-      <w:pPr>
-        <w:spacing w:after="0" w:line="240" w:lineRule="auto"/>
-      </w:pPr>
-      <w:r>
-        <w:t xml:space="preserve">                    _</w:t>
-      </w:r>
-      <w:proofErr w:type="spellStart"/>
-      <w:r>
-        <w:t>lastTimeOut</w:t>
-      </w:r>
-      <w:proofErr w:type="spellEnd"/>
-      <w:r>
-        <w:t xml:space="preserve"> = </w:t>
-      </w:r>
-      <w:proofErr w:type="spellStart"/>
-      <w:proofErr w:type="gramStart"/>
-      <w:r>
-        <w:t>string.Empty</w:t>
-      </w:r>
-      <w:proofErr w:type="spellEnd"/>
-      <w:proofErr w:type="gramEnd"/>
-      <w:r>
-        <w:t>;</w:t>
-      </w:r>
-    </w:p>
-    <w:p>
-      <w:pPr>
-        <w:spacing w:after="0" w:line="240" w:lineRule="auto"/>
-      </w:pPr>
-    </w:p>
-    <w:p>
-      <w:pPr>
-        <w:spacing w:after="0" w:line="240" w:lineRule="auto"/>
-      </w:pPr>
-      <w:r>
-        <w:t xml:space="preserve">                _</w:t>
-      </w:r>
-      <w:proofErr w:type="spellStart"/>
-      <w:r>
-        <w:t>isPunchedIn</w:t>
-      </w:r>
-      <w:proofErr w:type="spellEnd"/>
-      <w:r>
-        <w:t xml:space="preserve"> = _</w:t>
-      </w:r>
-      <w:proofErr w:type="spellStart"/>
-      <w:r>
-        <w:t>attendanceDetail.SwipeType</w:t>
-      </w:r>
-      <w:proofErr w:type="spellEnd"/>
-      <w:r>
-        <w:t xml:space="preserve"> == "IN</w:t>
-      </w:r>
-      <w:proofErr w:type="gramStart"/>
-      <w:r>
-        <w:t>" ?</w:t>
-      </w:r>
-      <w:proofErr w:type="gramEnd"/>
-      <w:r>
-        <w:t xml:space="preserve"> </w:t>
-      </w:r>
-      <w:proofErr w:type="gramStart"/>
-      <w:r>
-        <w:t>true :</w:t>
-      </w:r>
-      <w:proofErr w:type="gramEnd"/>
-      <w:r>
-        <w:t xml:space="preserve"> </w:t>
-      </w:r>
-      <w:proofErr w:type="gramStart"/>
-      <w:r>
-        <w:t>false;</w:t>
-      </w:r>
-      <w:proofErr w:type="gramEnd"/>
-    </w:p>
-    <w:p>
-      <w:pPr>
-        <w:spacing w:after="0" w:line="240" w:lineRule="auto"/>
-      </w:pPr>
-      <w:r>
-        <w:t xml:space="preserve">                #endregion</w:t>
-      </w:r>
-    </w:p>
-    <w:p>
-      <w:pPr>
-        <w:spacing w:after="0" w:line="240" w:lineRule="auto"/>
-      </w:pPr>
-    </w:p>
-    <w:p>
-      <w:pPr>
-        <w:spacing w:after="0" w:line="240" w:lineRule="auto"/>
-      </w:pPr>
-      <w:r>
-        <w:t xml:space="preserve">                #region Get Attendance Duration</w:t>
-      </w:r>
-    </w:p>
-    <w:p>
-      <w:pPr>
-        <w:spacing w:after="0" w:line="240" w:lineRule="auto"/>
-      </w:pPr>
-      <w:r>
-        <w:t xml:space="preserve">                var </w:t>
-      </w:r>
-      <w:proofErr w:type="spellStart"/>
-      <w:r>
-        <w:t>durationResult</w:t>
-      </w:r>
-      <w:proofErr w:type="spellEnd"/>
-      <w:r>
-        <w:t xml:space="preserve"> = </w:t>
-      </w:r>
-      <w:proofErr w:type="gramStart"/>
-      <w:r>
-        <w:t>await</w:t>
-      </w:r>
-      <w:proofErr w:type="gramEnd"/>
-      <w:r>
-        <w:t xml:space="preserve"> </w:t>
-      </w:r>
-      <w:proofErr w:type="spellStart"/>
-      <w:r>
-        <w:t>AttendanceService.GetAttendanceDurationAsync</w:t>
-      </w:r>
-      <w:proofErr w:type="spellEnd"/>
-      <w:r>
-        <w:t>(</w:t>
-      </w:r>
-      <w:proofErr w:type="spellStart"/>
-      <w:r>
-        <w:t>UserEmpNo</w:t>
-      </w:r>
-      <w:proofErr w:type="spellEnd"/>
-      <w:r>
-        <w:t xml:space="preserve">, </w:t>
-      </w:r>
-      <w:proofErr w:type="spellStart"/>
-      <w:proofErr w:type="gramStart"/>
-      <w:r>
-        <w:t>selectedDate</w:t>
-      </w:r>
-      <w:proofErr w:type="spellEnd"/>
-      <w:r>
-        <w:t>!.</w:t>
-      </w:r>
-      <w:proofErr w:type="spellStart"/>
-      <w:proofErr w:type="gramEnd"/>
-      <w:r>
-        <w:t>Value.Date</w:t>
-      </w:r>
-      <w:proofErr w:type="spellEnd"/>
-      <w:proofErr w:type="gramStart"/>
-      <w:r>
-        <w:t>);</w:t>
-      </w:r>
-      <w:proofErr w:type="gramEnd"/>
     </w:p>
     <w:p>
       <w:pPr>
@@ -28420,9 +28385,12 @@
       </w:r>
       <w:proofErr w:type="spellEnd"/>
       <w:r>
-        <w:t>!.Value;</w:t>
+        <w:t>!.</w:t>
       </w:r>
       <w:proofErr w:type="gramEnd"/>
+      <w:r>
+        <w:t>Value;</w:t>
+      </w:r>
     </w:p>
     <w:p>
       <w:pPr>
@@ -28521,28 +28489,118 @@
       </w:r>
       <w:proofErr w:type="gramEnd"/>
       <w:r>
-        <w:t>()</w:t>
+        <w:t>());</w:t>
+      </w:r>
+    </w:p>
+    <w:p>
+      <w:pPr>
+        <w:spacing w:after="0" w:line="240" w:lineRule="auto"/>
+      </w:pPr>
+      <w:r>
+        <w:t xml:space="preserve">                #endregion</w:t>
+      </w:r>
+    </w:p>
+    <w:p>
+      <w:pPr>
+        <w:spacing w:after="0" w:line="240" w:lineRule="auto"/>
+      </w:pPr>
+      <w:r>
+        <w:t xml:space="preserve">            }</w:t>
+      </w:r>
+    </w:p>
+    <w:p>
+      <w:pPr>
+        <w:spacing w:after="0" w:line="240" w:lineRule="auto"/>
+      </w:pPr>
+      <w:r>
+        <w:t xml:space="preserve">        }</w:t>
+      </w:r>
+    </w:p>
+    <w:p>
+      <w:pPr>
+        <w:spacing w:after="0" w:line="240" w:lineRule="auto"/>
+      </w:pPr>
+      <w:r>
+        <w:t xml:space="preserve">        else</w:t>
+      </w:r>
+    </w:p>
+    <w:p>
+      <w:pPr>
+        <w:spacing w:after="0" w:line="240" w:lineRule="auto"/>
+      </w:pPr>
+      <w:r>
+        <w:t xml:space="preserve">            _</w:t>
+      </w:r>
+      <w:proofErr w:type="spellStart"/>
+      <w:r>
+        <w:t>errorMessage.Append</w:t>
+      </w:r>
+      <w:proofErr w:type="spellEnd"/>
+      <w:r>
+        <w:t>(</w:t>
+      </w:r>
+      <w:proofErr w:type="spellStart"/>
+      <w:r>
+        <w:t>attendanceResult.Error</w:t>
+      </w:r>
+      <w:proofErr w:type="spellEnd"/>
+      <w:r>
+        <w:t>);</w:t>
+      </w:r>
+    </w:p>
+    <w:p>
+      <w:pPr>
+        <w:spacing w:after="0" w:line="240" w:lineRule="auto"/>
+      </w:pPr>
+    </w:p>
+    <w:p>
+      <w:pPr>
+        <w:spacing w:after="0" w:line="240" w:lineRule="auto"/>
+      </w:pPr>
+      <w:r>
+        <w:t xml:space="preserve">        if (</w:t>
       </w:r>
       <w:proofErr w:type="gramStart"/>
       <w:r>
-        <w:t>);</w:t>
+        <w:t>callback !</w:t>
       </w:r>
       <w:proofErr w:type="gramEnd"/>
-    </w:p>
-    <w:p>
-      <w:pPr>
-        <w:spacing w:after="0" w:line="240" w:lineRule="auto"/>
-      </w:pPr>
-      <w:r>
-        <w:t xml:space="preserve">                #endregion</w:t>
-      </w:r>
-    </w:p>
-    <w:p>
-      <w:pPr>
-        <w:spacing w:after="0" w:line="240" w:lineRule="auto"/>
-      </w:pPr>
-      <w:r>
-        <w:t xml:space="preserve">            }</w:t>
+      <w:r>
+        <w:t>= null)</w:t>
+      </w:r>
+    </w:p>
+    <w:p>
+      <w:pPr>
+        <w:spacing w:after="0" w:line="240" w:lineRule="auto"/>
+      </w:pPr>
+      <w:r>
+        <w:t xml:space="preserve">        {</w:t>
+      </w:r>
+    </w:p>
+    <w:p>
+      <w:pPr>
+        <w:spacing w:after="0" w:line="240" w:lineRule="auto"/>
+      </w:pPr>
+      <w:r>
+        <w:t xml:space="preserve">            // Hide the spinner overlay</w:t>
+      </w:r>
+    </w:p>
+    <w:p>
+      <w:pPr>
+        <w:spacing w:after="0" w:line="240" w:lineRule="auto"/>
+      </w:pPr>
+      <w:r>
+        <w:t xml:space="preserve">            await </w:t>
+      </w:r>
+      <w:proofErr w:type="spellStart"/>
+      <w:proofErr w:type="gramStart"/>
+      <w:r>
+        <w:t>callback.Invoke</w:t>
+      </w:r>
+      <w:proofErr w:type="spellEnd"/>
+      <w:proofErr w:type="gramEnd"/>
+      <w:r>
+        <w:t>();</w:t>
       </w:r>
     </w:p>
     <w:p>
@@ -28558,15 +28616,39 @@
         <w:spacing w:after="0" w:line="240" w:lineRule="auto"/>
       </w:pPr>
       <w:r>
-        <w:t xml:space="preserve">        else</w:t>
-      </w:r>
-    </w:p>
-    <w:p>
-      <w:pPr>
-        <w:spacing w:after="0" w:line="240" w:lineRule="auto"/>
-      </w:pPr>
-      <w:r>
-        <w:t xml:space="preserve">            _</w:t>
+        <w:t xml:space="preserve">    }</w:t>
+      </w:r>
+    </w:p>
+    <w:p>
+      <w:pPr>
+        <w:spacing w:after="0" w:line="240" w:lineRule="auto"/>
+      </w:pPr>
+      <w:r>
+        <w:t xml:space="preserve">    catch (Exception ex)</w:t>
+      </w:r>
+    </w:p>
+    <w:p>
+      <w:pPr>
+        <w:spacing w:after="0" w:line="240" w:lineRule="auto"/>
+      </w:pPr>
+      <w:r>
+        <w:t xml:space="preserve">    {</w:t>
+      </w:r>
+    </w:p>
+    <w:p>
+      <w:pPr>
+        <w:spacing w:after="0" w:line="240" w:lineRule="auto"/>
+      </w:pPr>
+      <w:r>
+        <w:t xml:space="preserve">        // Set the error message</w:t>
+      </w:r>
+    </w:p>
+    <w:p>
+      <w:pPr>
+        <w:spacing w:after="0" w:line="240" w:lineRule="auto"/>
+      </w:pPr>
+      <w:r>
+        <w:t xml:space="preserve">        _</w:t>
       </w:r>
       <w:proofErr w:type="spellStart"/>
       <w:r>
@@ -28577,144 +28659,15 @@
         <w:t>(</w:t>
       </w:r>
       <w:proofErr w:type="spellStart"/>
-      <w:r>
-        <w:t>attendanceResult.Error</w:t>
-      </w:r>
-      <w:proofErr w:type="spellEnd"/>
-      <w:r>
-        <w:t>);</w:t>
-      </w:r>
-    </w:p>
-    <w:p>
-      <w:pPr>
-        <w:spacing w:after="0" w:line="240" w:lineRule="auto"/>
-      </w:pPr>
-    </w:p>
-    <w:p>
-      <w:pPr>
-        <w:spacing w:after="0" w:line="240" w:lineRule="auto"/>
-      </w:pPr>
-      <w:r>
-        <w:t xml:space="preserve">        if (</w:t>
-      </w:r>
       <w:proofErr w:type="gramStart"/>
       <w:r>
-        <w:t>callback !</w:t>
-      </w:r>
+        <w:t>ex.Message.ToString</w:t>
+      </w:r>
+      <w:proofErr w:type="spellEnd"/>
       <w:proofErr w:type="gramEnd"/>
       <w:r>
-        <w:t>= null)</w:t>
-      </w:r>
-    </w:p>
-    <w:p>
-      <w:pPr>
-        <w:spacing w:after="0" w:line="240" w:lineRule="auto"/>
-      </w:pPr>
-      <w:r>
-        <w:t xml:space="preserve">        {</w:t>
-      </w:r>
-    </w:p>
-    <w:p>
-      <w:pPr>
-        <w:spacing w:after="0" w:line="240" w:lineRule="auto"/>
-      </w:pPr>
-      <w:r>
-        <w:t xml:space="preserve">            // Hide the spinner overlay</w:t>
-      </w:r>
-    </w:p>
-    <w:p>
-      <w:pPr>
-        <w:spacing w:after="0" w:line="240" w:lineRule="auto"/>
-      </w:pPr>
-      <w:r>
-        <w:t xml:space="preserve">            await </w:t>
-      </w:r>
-      <w:proofErr w:type="spellStart"/>
-      <w:proofErr w:type="gramStart"/>
-      <w:r>
-        <w:t>callback.Invoke</w:t>
-      </w:r>
-      <w:proofErr w:type="spellEnd"/>
-      <w:proofErr w:type="gramEnd"/>
-      <w:r>
-        <w:t>(</w:t>
-      </w:r>
-      <w:proofErr w:type="gramStart"/>
-      <w:r>
-        <w:t>);</w:t>
-      </w:r>
-      <w:proofErr w:type="gramEnd"/>
-    </w:p>
-    <w:p>
-      <w:pPr>
-        <w:spacing w:after="0" w:line="240" w:lineRule="auto"/>
-      </w:pPr>
-      <w:r>
-        <w:t xml:space="preserve">        }</w:t>
-      </w:r>
-    </w:p>
-    <w:p>
-      <w:pPr>
-        <w:spacing w:after="0" w:line="240" w:lineRule="auto"/>
-      </w:pPr>
-      <w:r>
-        <w:t xml:space="preserve">    }</w:t>
-      </w:r>
-    </w:p>
-    <w:p>
-      <w:pPr>
-        <w:spacing w:after="0" w:line="240" w:lineRule="auto"/>
-      </w:pPr>
-      <w:r>
-        <w:t xml:space="preserve">    catch (Exception ex)</w:t>
-      </w:r>
-    </w:p>
-    <w:p>
-      <w:pPr>
-        <w:spacing w:after="0" w:line="240" w:lineRule="auto"/>
-      </w:pPr>
-      <w:r>
-        <w:t xml:space="preserve">    {</w:t>
-      </w:r>
-    </w:p>
-    <w:p>
-      <w:pPr>
-        <w:spacing w:after="0" w:line="240" w:lineRule="auto"/>
-      </w:pPr>
-      <w:r>
-        <w:t xml:space="preserve">        // Set the error message</w:t>
-      </w:r>
-    </w:p>
-    <w:p>
-      <w:pPr>
-        <w:spacing w:after="0" w:line="240" w:lineRule="auto"/>
-      </w:pPr>
-      <w:r>
-        <w:t xml:space="preserve">        _</w:t>
-      </w:r>
-      <w:proofErr w:type="spellStart"/>
-      <w:r>
-        <w:t>errorMessage.Append</w:t>
-      </w:r>
-      <w:proofErr w:type="spellEnd"/>
-      <w:r>
-        <w:t>(</w:t>
-      </w:r>
-      <w:proofErr w:type="spellStart"/>
-      <w:proofErr w:type="gramStart"/>
-      <w:r>
-        <w:t>ex.Message.ToString</w:t>
-      </w:r>
-      <w:proofErr w:type="spellEnd"/>
-      <w:proofErr w:type="gramEnd"/>
-      <w:r>
-        <w:t>()</w:t>
-      </w:r>
-      <w:proofErr w:type="gramStart"/>
-      <w:r>
-        <w:t>);</w:t>
-      </w:r>
-      <w:proofErr w:type="gramEnd"/>
+        <w:t>());</w:t>
+      </w:r>
     </w:p>
     <w:p>
       <w:pPr>
@@ -29107,14 +29060,11 @@
         <w:spacing w:after="0" w:line="240" w:lineRule="auto"/>
       </w:pPr>
       <w:r>
-        <w:t xml:space="preserve">            Icon</w:t>
-      </w:r>
+        <w:t xml:space="preserve">            Icon="@</w:t>
+      </w:r>
+      <w:proofErr w:type="spellStart"/>
       <w:proofErr w:type="gramStart"/>
       <w:r>
-        <w:t>="@</w:t>
-      </w:r>
-      <w:proofErr w:type="spellStart"/>
-      <w:r>
         <w:t>Icons.Material.Filled.Circle</w:t>
       </w:r>
       <w:proofErr w:type="spellEnd"/>
@@ -29128,14 +29078,9 @@
         <w:spacing w:after="0" w:line="240" w:lineRule="auto"/>
       </w:pPr>
       <w:r>
-        <w:t xml:space="preserve">            Color</w:t>
-      </w:r>
-      <w:proofErr w:type="gramStart"/>
-      <w:r>
-        <w:t>="@</w:t>
-      </w:r>
-      <w:proofErr w:type="spellStart"/>
-      <w:proofErr w:type="gramEnd"/>
+        <w:t xml:space="preserve">            Color="@</w:t>
+      </w:r>
+      <w:proofErr w:type="spellStart"/>
       <w:r>
         <w:t>GetLegendColor</w:t>
       </w:r>
@@ -29511,15 +29456,7 @@
       </w:r>
       <w:proofErr w:type="gramEnd"/>
       <w:r>
-        <w:t xml:space="preserve"> "1px solid #ccc</w:t>
-      </w:r>
-      <w:proofErr w:type="gramStart"/>
-      <w:r>
-        <w:t>")}</w:t>
-      </w:r>
-      <w:proofErr w:type="gramEnd"/>
-      <w:r>
-        <w:t>;</w:t>
+        <w:t xml:space="preserve"> "1px solid #ccc")};</w:t>
       </w:r>
       <w:r>
         <w:br/>
@@ -29580,6 +29517,1183 @@
         <w:br/>
         <w:t>}</w:t>
       </w:r>
+    </w:p>
+    <w:p>
+      <w:pPr>
+        <w:spacing w:after="0" w:line="240" w:lineRule="auto"/>
+      </w:pPr>
+    </w:p>
+    <w:p>
+      <w:pPr>
+        <w:spacing w:after="0" w:line="240" w:lineRule="auto"/>
+        <w:rPr>
+          <w:b/>
+          <w:bCs/>
+          <w:color w:val="EE0000"/>
+          <w:u w:val="single"/>
+        </w:rPr>
+      </w:pPr>
+      <w:r>
+        <w:rPr>
+          <w:b/>
+          <w:bCs/>
+          <w:color w:val="EE0000"/>
+          <w:u w:val="single"/>
+        </w:rPr>
+        <w:t>Prompt #23:</w:t>
+      </w:r>
+    </w:p>
+    <w:p>
+      <w:pPr>
+        <w:spacing w:after="0" w:line="240" w:lineRule="auto"/>
+      </w:pPr>
+    </w:p>
+    <w:p>
+      <w:pPr>
+        <w:rPr>
+          <w:lang w:val="en-GB"/>
+        </w:rPr>
+      </w:pPr>
+      <w:r>
+        <w:t>The code below does not work since it doesn’t change the color of the calendar days based on the value of “</w:t>
+      </w:r>
+      <w:proofErr w:type="spellStart"/>
+      <w:r>
+        <w:t>LegendCode</w:t>
+      </w:r>
+      <w:proofErr w:type="spellEnd"/>
+      <w:r>
+        <w:t>”. Provide another method to map the “</w:t>
+      </w:r>
+      <w:proofErr w:type="spellStart"/>
+      <w:r>
+        <w:t>LegendCode</w:t>
+      </w:r>
+      <w:proofErr w:type="spellEnd"/>
+      <w:r>
+        <w:t xml:space="preserve">” to the calendar date. </w:t>
+      </w:r>
+      <w:r>
+        <w:rPr>
+          <w:lang w:val="en-GB"/>
+        </w:rPr>
+        <w:t xml:space="preserve">Note that I am using .NET 8.0 and </w:t>
+      </w:r>
+      <w:proofErr w:type="spellStart"/>
+      <w:r>
+        <w:rPr>
+          <w:lang w:val="en-GB"/>
+        </w:rPr>
+        <w:t>MudBlazor</w:t>
+      </w:r>
+      <w:proofErr w:type="spellEnd"/>
+      <w:r>
+        <w:rPr>
+          <w:lang w:val="en-GB"/>
+        </w:rPr>
+        <w:t xml:space="preserve"> ver. 8.8.0. </w:t>
+      </w:r>
+    </w:p>
+    <w:p>
+      <w:pPr>
+        <w:spacing w:after="0" w:line="240" w:lineRule="auto"/>
+      </w:pPr>
+    </w:p>
+    <w:p>
+      <w:pPr>
+        <w:spacing w:after="0" w:line="240" w:lineRule="auto"/>
+      </w:pPr>
+      <w:r>
+        <w:t>&lt;</w:t>
+      </w:r>
+      <w:proofErr w:type="spellStart"/>
+      <w:r>
+        <w:rPr>
+          <w:b/>
+          <w:bCs/>
+        </w:rPr>
+        <w:t>MudDatePicker</w:t>
+      </w:r>
+      <w:proofErr w:type="spellEnd"/>
+      <w:r>
+        <w:t xml:space="preserve"> </w:t>
+      </w:r>
+      <w:proofErr w:type="spellStart"/>
+      <w:r>
+        <w:rPr>
+          <w:b/>
+          <w:bCs/>
+        </w:rPr>
+        <w:t>PickerVariant</w:t>
+      </w:r>
+      <w:proofErr w:type="spellEnd"/>
+      <w:r>
+        <w:t>="</w:t>
+      </w:r>
+      <w:proofErr w:type="spellStart"/>
+      <w:r>
+        <w:t>PickerVariant.Static</w:t>
+      </w:r>
+      <w:proofErr w:type="spellEnd"/>
+      <w:r>
+        <w:t xml:space="preserve">" </w:t>
+      </w:r>
+    </w:p>
+    <w:p>
+      <w:pPr>
+        <w:spacing w:after="0" w:line="240" w:lineRule="auto"/>
+      </w:pPr>
+      <w:r>
+        <w:t xml:space="preserve">     @ref="_picker"</w:t>
+      </w:r>
+    </w:p>
+    <w:p>
+      <w:pPr>
+        <w:spacing w:after="0" w:line="240" w:lineRule="auto"/>
+      </w:pPr>
+      <w:r>
+        <w:t xml:space="preserve">     </w:t>
+      </w:r>
+      <w:r>
+        <w:rPr>
+          <w:b/>
+          <w:bCs/>
+        </w:rPr>
+        <w:t>Color</w:t>
+      </w:r>
+      <w:r>
+        <w:t>="</w:t>
+      </w:r>
+      <w:proofErr w:type="spellStart"/>
+      <w:r>
+        <w:t>Color.Dark</w:t>
+      </w:r>
+      <w:proofErr w:type="spellEnd"/>
+      <w:r>
+        <w:t xml:space="preserve">" </w:t>
+      </w:r>
+    </w:p>
+    <w:p>
+      <w:pPr>
+        <w:spacing w:after="0" w:line="240" w:lineRule="auto"/>
+      </w:pPr>
+      <w:r>
+        <w:t xml:space="preserve">     </w:t>
+      </w:r>
+      <w:r>
+        <w:rPr>
+          <w:b/>
+          <w:bCs/>
+        </w:rPr>
+        <w:t>Rounded</w:t>
+      </w:r>
+      <w:r>
+        <w:t>="true"</w:t>
+      </w:r>
+    </w:p>
+    <w:p>
+      <w:pPr>
+        <w:spacing w:after="0" w:line="240" w:lineRule="auto"/>
+      </w:pPr>
+      <w:r>
+        <w:t xml:space="preserve">     </w:t>
+      </w:r>
+      <w:r>
+        <w:rPr>
+          <w:b/>
+          <w:bCs/>
+        </w:rPr>
+        <w:t>Elevation</w:t>
+      </w:r>
+      <w:r>
+        <w:t>="0"</w:t>
+      </w:r>
+    </w:p>
+    <w:p>
+      <w:pPr>
+        <w:spacing w:after="0" w:line="240" w:lineRule="auto"/>
+      </w:pPr>
+      <w:r>
+        <w:t xml:space="preserve">     </w:t>
+      </w:r>
+      <w:r>
+        <w:rPr>
+          <w:b/>
+          <w:bCs/>
+        </w:rPr>
+        <w:t>Orientation</w:t>
+      </w:r>
+      <w:r>
+        <w:t>="@_</w:t>
+      </w:r>
+      <w:proofErr w:type="spellStart"/>
+      <w:r>
+        <w:t>calOrientation</w:t>
+      </w:r>
+      <w:proofErr w:type="spellEnd"/>
+      <w:r>
+        <w:t xml:space="preserve">" </w:t>
+      </w:r>
+    </w:p>
+    <w:p>
+      <w:pPr>
+        <w:spacing w:after="0" w:line="240" w:lineRule="auto"/>
+      </w:pPr>
+      <w:r>
+        <w:t xml:space="preserve">     </w:t>
+      </w:r>
+      <w:r>
+        <w:rPr>
+          <w:b/>
+          <w:bCs/>
+        </w:rPr>
+        <w:t>Date</w:t>
+      </w:r>
+      <w:r>
+        <w:t>="@_</w:t>
+      </w:r>
+      <w:proofErr w:type="spellStart"/>
+      <w:r>
+        <w:t>selectedDate</w:t>
+      </w:r>
+      <w:proofErr w:type="spellEnd"/>
+      <w:r>
+        <w:t>"</w:t>
+      </w:r>
+    </w:p>
+    <w:p>
+      <w:pPr>
+        <w:spacing w:after="0" w:line="240" w:lineRule="auto"/>
+      </w:pPr>
+      <w:r>
+        <w:t xml:space="preserve">     </w:t>
+      </w:r>
+      <w:proofErr w:type="spellStart"/>
+      <w:r>
+        <w:rPr>
+          <w:b/>
+          <w:bCs/>
+        </w:rPr>
+        <w:t>DateChanged</w:t>
+      </w:r>
+      <w:proofErr w:type="spellEnd"/>
+      <w:r>
+        <w:t>="</w:t>
+      </w:r>
+      <w:proofErr w:type="spellStart"/>
+      <w:r>
+        <w:t>OnDateChanged</w:t>
+      </w:r>
+      <w:proofErr w:type="spellEnd"/>
+      <w:r>
+        <w:t>"</w:t>
+      </w:r>
+    </w:p>
+    <w:p>
+      <w:pPr>
+        <w:spacing w:after="0" w:line="240" w:lineRule="auto"/>
+      </w:pPr>
+      <w:r>
+        <w:t xml:space="preserve">     </w:t>
+      </w:r>
+      <w:r>
+        <w:rPr>
+          <w:b/>
+          <w:bCs/>
+        </w:rPr>
+        <w:t>Style</w:t>
+      </w:r>
+      <w:r>
+        <w:t>="@_</w:t>
+      </w:r>
+      <w:proofErr w:type="spellStart"/>
+      <w:r>
+        <w:t>pickerStyle</w:t>
+      </w:r>
+      <w:proofErr w:type="spellEnd"/>
+      <w:r>
+        <w:t>"</w:t>
+      </w:r>
+    </w:p>
+    <w:p>
+      <w:pPr>
+        <w:spacing w:after="0" w:line="240" w:lineRule="auto"/>
+      </w:pPr>
+      <w:r>
+        <w:t xml:space="preserve">     </w:t>
+      </w:r>
+      <w:proofErr w:type="spellStart"/>
+      <w:r>
+        <w:t>PickerDayContent</w:t>
+      </w:r>
+      <w:proofErr w:type="spellEnd"/>
+      <w:r>
+        <w:t>="</w:t>
+      </w:r>
+      <w:proofErr w:type="spellStart"/>
+      <w:r>
+        <w:t>CalendarDayTemplate</w:t>
+      </w:r>
+      <w:proofErr w:type="spellEnd"/>
+      <w:r>
+        <w:t>"&gt;</w:t>
+      </w:r>
+    </w:p>
+    <w:p>
+      <w:pPr>
+        <w:spacing w:after="0" w:line="240" w:lineRule="auto"/>
+      </w:pPr>
+      <w:r>
+        <w:t xml:space="preserve"> &lt;/</w:t>
+      </w:r>
+      <w:proofErr w:type="spellStart"/>
+      <w:r>
+        <w:rPr>
+          <w:b/>
+          <w:bCs/>
+        </w:rPr>
+        <w:t>MudDatePicker</w:t>
+      </w:r>
+      <w:proofErr w:type="spellEnd"/>
+      <w:r>
+        <w:t>&gt;</w:t>
+      </w:r>
+    </w:p>
+    <w:p>
+      <w:pPr>
+        <w:spacing w:after="0" w:line="240" w:lineRule="auto"/>
+      </w:pPr>
+    </w:p>
+    <w:p>
+      <w:pPr>
+        <w:spacing w:after="0" w:line="240" w:lineRule="auto"/>
+      </w:pPr>
+      <w:r>
+        <w:t xml:space="preserve">private </w:t>
+      </w:r>
+      <w:proofErr w:type="spellStart"/>
+      <w:r>
+        <w:t>RenderFragment</w:t>
+      </w:r>
+      <w:proofErr w:type="spellEnd"/>
+      <w:r>
+        <w:t>&lt;</w:t>
+      </w:r>
+      <w:proofErr w:type="spellStart"/>
+      <w:r>
+        <w:t>DateTime</w:t>
+      </w:r>
+      <w:proofErr w:type="spellEnd"/>
+      <w:r>
+        <w:t xml:space="preserve">&gt; </w:t>
+      </w:r>
+      <w:proofErr w:type="spellStart"/>
+      <w:r>
+        <w:t>CalendarDayTemplate</w:t>
+      </w:r>
+      <w:proofErr w:type="spellEnd"/>
+      <w:r>
+        <w:t xml:space="preserve"> =&gt; (day) =&gt; (__builder) =&gt;</w:t>
+      </w:r>
+    </w:p>
+    <w:p>
+      <w:pPr>
+        <w:spacing w:after="0" w:line="240" w:lineRule="auto"/>
+      </w:pPr>
+      <w:r>
+        <w:t>{</w:t>
+      </w:r>
+    </w:p>
+    <w:p>
+      <w:pPr>
+        <w:spacing w:after="0" w:line="240" w:lineRule="auto"/>
+      </w:pPr>
+      <w:r>
+        <w:t xml:space="preserve">    string color = _</w:t>
+      </w:r>
+      <w:proofErr w:type="spellStart"/>
+      <w:r>
+        <w:t>calendarColors.ContainsKey</w:t>
+      </w:r>
+      <w:proofErr w:type="spellEnd"/>
+      <w:r>
+        <w:t>(</w:t>
+      </w:r>
+      <w:proofErr w:type="spellStart"/>
+      <w:proofErr w:type="gramStart"/>
+      <w:r>
+        <w:t>day.Date</w:t>
+      </w:r>
+      <w:proofErr w:type="spellEnd"/>
+      <w:proofErr w:type="gramEnd"/>
+      <w:r>
+        <w:t>)</w:t>
+      </w:r>
+    </w:p>
+    <w:p>
+      <w:pPr>
+        <w:spacing w:after="0" w:line="240" w:lineRule="auto"/>
+      </w:pPr>
+      <w:r>
+        <w:t xml:space="preserve">        ? _</w:t>
+      </w:r>
+      <w:proofErr w:type="spellStart"/>
+      <w:r>
+        <w:t>calendarColors</w:t>
+      </w:r>
+      <w:proofErr w:type="spellEnd"/>
+      <w:r>
+        <w:t>[</w:t>
+      </w:r>
+      <w:proofErr w:type="spellStart"/>
+      <w:proofErr w:type="gramStart"/>
+      <w:r>
+        <w:t>day.Date</w:t>
+      </w:r>
+      <w:proofErr w:type="spellEnd"/>
+      <w:proofErr w:type="gramEnd"/>
+      <w:r>
+        <w:t>]</w:t>
+      </w:r>
+    </w:p>
+    <w:p>
+      <w:pPr>
+        <w:spacing w:after="0" w:line="240" w:lineRule="auto"/>
+      </w:pPr>
+      <w:r>
+        <w:t xml:space="preserve">        : "transparent";</w:t>
+      </w:r>
+    </w:p>
+    <w:p>
+      <w:pPr>
+        <w:spacing w:after="0" w:line="240" w:lineRule="auto"/>
+      </w:pPr>
+    </w:p>
+    <w:p>
+      <w:pPr>
+        <w:spacing w:after="0" w:line="240" w:lineRule="auto"/>
+      </w:pPr>
+      <w:r>
+        <w:t xml:space="preserve">    bool </w:t>
+      </w:r>
+      <w:proofErr w:type="spellStart"/>
+      <w:r>
+        <w:t>isToday</w:t>
+      </w:r>
+      <w:proofErr w:type="spellEnd"/>
+      <w:r>
+        <w:t xml:space="preserve"> = </w:t>
+      </w:r>
+      <w:proofErr w:type="spellStart"/>
+      <w:proofErr w:type="gramStart"/>
+      <w:r>
+        <w:t>day.Date</w:t>
+      </w:r>
+      <w:proofErr w:type="spellEnd"/>
+      <w:proofErr w:type="gramEnd"/>
+      <w:r>
+        <w:t xml:space="preserve"> == </w:t>
+      </w:r>
+      <w:proofErr w:type="spellStart"/>
+      <w:proofErr w:type="gramStart"/>
+      <w:r>
+        <w:t>DateTime.Today.Date</w:t>
+      </w:r>
+      <w:proofErr w:type="spellEnd"/>
+      <w:proofErr w:type="gramEnd"/>
+      <w:r>
+        <w:t>;</w:t>
+      </w:r>
+    </w:p>
+    <w:p>
+      <w:pPr>
+        <w:spacing w:after="0" w:line="240" w:lineRule="auto"/>
+      </w:pPr>
+    </w:p>
+    <w:p>
+      <w:pPr>
+        <w:spacing w:after="0" w:line="240" w:lineRule="auto"/>
+      </w:pPr>
+      <w:r>
+        <w:t xml:space="preserve">    __</w:t>
+      </w:r>
+      <w:proofErr w:type="spellStart"/>
+      <w:proofErr w:type="gramStart"/>
+      <w:r>
+        <w:t>builder.OpenComponent</w:t>
+      </w:r>
+      <w:proofErr w:type="spellEnd"/>
+      <w:proofErr w:type="gramEnd"/>
+      <w:r>
+        <w:t>&lt;</w:t>
+      </w:r>
+      <w:proofErr w:type="spellStart"/>
+      <w:r>
+        <w:t>MudPaper</w:t>
+      </w:r>
+      <w:proofErr w:type="spellEnd"/>
+      <w:proofErr w:type="gramStart"/>
+      <w:r>
+        <w:t>&gt;(</w:t>
+      </w:r>
+      <w:proofErr w:type="gramEnd"/>
+      <w:r>
+        <w:t>0);</w:t>
+      </w:r>
+    </w:p>
+    <w:p>
+      <w:pPr>
+        <w:spacing w:after="0" w:line="240" w:lineRule="auto"/>
+      </w:pPr>
+      <w:r>
+        <w:t xml:space="preserve">    __</w:t>
+      </w:r>
+      <w:proofErr w:type="spellStart"/>
+      <w:proofErr w:type="gramStart"/>
+      <w:r>
+        <w:t>builder.AddAttribute</w:t>
+      </w:r>
+      <w:proofErr w:type="spellEnd"/>
+      <w:proofErr w:type="gramEnd"/>
+      <w:r>
+        <w:t>(1, "Style",</w:t>
+      </w:r>
+    </w:p>
+    <w:p>
+      <w:pPr>
+        <w:spacing w:after="0" w:line="240" w:lineRule="auto"/>
+      </w:pPr>
+      <w:r>
+        <w:t xml:space="preserve">        $"height:38</w:t>
+      </w:r>
+      <w:proofErr w:type="gramStart"/>
+      <w:r>
+        <w:t>px;width</w:t>
+      </w:r>
+      <w:proofErr w:type="gramEnd"/>
+      <w:r>
+        <w:t>:38</w:t>
+      </w:r>
+      <w:proofErr w:type="gramStart"/>
+      <w:r>
+        <w:t>px;border</w:t>
+      </w:r>
+      <w:proofErr w:type="gramEnd"/>
+      <w:r>
+        <w:t>-radius:6px;" +</w:t>
+      </w:r>
+    </w:p>
+    <w:p>
+      <w:pPr>
+        <w:spacing w:after="0" w:line="240" w:lineRule="auto"/>
+      </w:pPr>
+      <w:r>
+        <w:t xml:space="preserve">        $"background-</w:t>
+      </w:r>
+      <w:proofErr w:type="gramStart"/>
+      <w:r>
+        <w:t>color:{</w:t>
+      </w:r>
+      <w:proofErr w:type="gramEnd"/>
+      <w:r>
+        <w:t>color};" +</w:t>
+      </w:r>
+    </w:p>
+    <w:p>
+      <w:pPr>
+        <w:spacing w:after="0" w:line="240" w:lineRule="auto"/>
+      </w:pPr>
+      <w:r>
+        <w:t xml:space="preserve">        $"</w:t>
+      </w:r>
+      <w:proofErr w:type="gramStart"/>
+      <w:r>
+        <w:t>border:{</w:t>
+      </w:r>
+      <w:proofErr w:type="gramEnd"/>
+      <w:r>
+        <w:t>(</w:t>
+      </w:r>
+      <w:proofErr w:type="spellStart"/>
+      <w:proofErr w:type="gramStart"/>
+      <w:r>
+        <w:t>isToday</w:t>
+      </w:r>
+      <w:proofErr w:type="spellEnd"/>
+      <w:r>
+        <w:t xml:space="preserve"> ?</w:t>
+      </w:r>
+      <w:proofErr w:type="gramEnd"/>
+      <w:r>
+        <w:t xml:space="preserve"> "2px solid black</w:t>
+      </w:r>
+      <w:proofErr w:type="gramStart"/>
+      <w:r>
+        <w:t>" :</w:t>
+      </w:r>
+      <w:proofErr w:type="gramEnd"/>
+      <w:r>
+        <w:t xml:space="preserve"> "1px solid #ccc")};" +</w:t>
+      </w:r>
+    </w:p>
+    <w:p>
+      <w:pPr>
+        <w:spacing w:after="0" w:line="240" w:lineRule="auto"/>
+      </w:pPr>
+      <w:r>
+        <w:t xml:space="preserve">        $"</w:t>
+      </w:r>
+      <w:proofErr w:type="spellStart"/>
+      <w:proofErr w:type="gramStart"/>
+      <w:r>
+        <w:t>display:flex</w:t>
+      </w:r>
+      <w:proofErr w:type="gramEnd"/>
+      <w:r>
+        <w:t>;align-</w:t>
+      </w:r>
+      <w:proofErr w:type="gramStart"/>
+      <w:r>
+        <w:t>items:center</w:t>
+      </w:r>
+      <w:proofErr w:type="gramEnd"/>
+      <w:r>
+        <w:t>;justify-</w:t>
+      </w:r>
+      <w:proofErr w:type="gramStart"/>
+      <w:r>
+        <w:t>content:center</w:t>
+      </w:r>
+      <w:proofErr w:type="spellEnd"/>
+      <w:proofErr w:type="gramEnd"/>
+      <w:r>
+        <w:t>;");</w:t>
+      </w:r>
+    </w:p>
+    <w:p>
+      <w:pPr>
+        <w:spacing w:after="0" w:line="240" w:lineRule="auto"/>
+      </w:pPr>
+    </w:p>
+    <w:p>
+      <w:pPr>
+        <w:spacing w:after="0" w:line="240" w:lineRule="auto"/>
+      </w:pPr>
+      <w:r>
+        <w:t xml:space="preserve">    __</w:t>
+      </w:r>
+      <w:proofErr w:type="spellStart"/>
+      <w:proofErr w:type="gramStart"/>
+      <w:r>
+        <w:t>builder.AddAttribute</w:t>
+      </w:r>
+      <w:proofErr w:type="spellEnd"/>
+      <w:proofErr w:type="gramEnd"/>
+      <w:r>
+        <w:t>(2, "</w:t>
+      </w:r>
+      <w:proofErr w:type="spellStart"/>
+      <w:r>
+        <w:t>ChildContent</w:t>
+      </w:r>
+      <w:proofErr w:type="spellEnd"/>
+      <w:r>
+        <w:t>", (</w:t>
+      </w:r>
+      <w:proofErr w:type="spellStart"/>
+      <w:r>
+        <w:t>RenderFragment</w:t>
+      </w:r>
+      <w:proofErr w:type="spellEnd"/>
+      <w:r>
+        <w:t>)((__builder2) =&gt;</w:t>
+      </w:r>
+    </w:p>
+    <w:p>
+      <w:pPr>
+        <w:spacing w:after="0" w:line="240" w:lineRule="auto"/>
+      </w:pPr>
+      <w:r>
+        <w:t xml:space="preserve">    {</w:t>
+      </w:r>
+    </w:p>
+    <w:p>
+      <w:pPr>
+        <w:spacing w:after="0" w:line="240" w:lineRule="auto"/>
+      </w:pPr>
+      <w:r>
+        <w:t xml:space="preserve">        __builder2.AddContent(3, </w:t>
+      </w:r>
+      <w:proofErr w:type="spellStart"/>
+      <w:proofErr w:type="gramStart"/>
+      <w:r>
+        <w:t>day.Day</w:t>
+      </w:r>
+      <w:proofErr w:type="spellEnd"/>
+      <w:proofErr w:type="gramEnd"/>
+      <w:r>
+        <w:t>);</w:t>
+      </w:r>
+    </w:p>
+    <w:p>
+      <w:pPr>
+        <w:spacing w:after="0" w:line="240" w:lineRule="auto"/>
+      </w:pPr>
+      <w:r>
+        <w:t xml:space="preserve">    }));</w:t>
+      </w:r>
+    </w:p>
+    <w:p>
+      <w:pPr>
+        <w:spacing w:after="0" w:line="240" w:lineRule="auto"/>
+      </w:pPr>
+    </w:p>
+    <w:p>
+      <w:pPr>
+        <w:spacing w:after="0" w:line="240" w:lineRule="auto"/>
+      </w:pPr>
+      <w:r>
+        <w:t xml:space="preserve">    __</w:t>
+      </w:r>
+      <w:proofErr w:type="spellStart"/>
+      <w:proofErr w:type="gramStart"/>
+      <w:r>
+        <w:t>builder.CloseComponent</w:t>
+      </w:r>
+      <w:proofErr w:type="spellEnd"/>
+      <w:proofErr w:type="gramEnd"/>
+      <w:r>
+        <w:t>();</w:t>
+      </w:r>
+    </w:p>
+    <w:p>
+      <w:pPr>
+        <w:spacing w:after="0" w:line="240" w:lineRule="auto"/>
+      </w:pPr>
+      <w:r>
+        <w:t>};</w:t>
+      </w:r>
+    </w:p>
+    <w:p>
+      <w:pPr>
+        <w:spacing w:after="0" w:line="240" w:lineRule="auto"/>
+      </w:pPr>
+    </w:p>
+    <w:p>
+      <w:r>
+        <w:t xml:space="preserve">I am using a </w:t>
+      </w:r>
+      <w:proofErr w:type="spellStart"/>
+      <w:r>
+        <w:rPr>
+          <w:b/>
+          <w:bCs/>
+        </w:rPr>
+        <w:t>MudDatePicker</w:t>
+      </w:r>
+      <w:proofErr w:type="spellEnd"/>
+      <w:r>
+        <w:rPr>
+          <w:b/>
+          <w:bCs/>
+        </w:rPr>
+        <w:t xml:space="preserve"> </w:t>
+      </w:r>
+      <w:r>
+        <w:t xml:space="preserve">component to display a calendar. Tell me how to programmatically change the color of the days in the calendar using C# code-behind. Below is the Blazor code for rendering the calendar. </w:t>
+      </w:r>
+      <w:r>
+        <w:rPr>
+          <w:lang w:val="en-GB"/>
+        </w:rPr>
+        <w:t xml:space="preserve">Note that I am using .NET 8.0 and </w:t>
+      </w:r>
+      <w:proofErr w:type="spellStart"/>
+      <w:r>
+        <w:rPr>
+          <w:lang w:val="en-GB"/>
+        </w:rPr>
+        <w:t>MudBlazor</w:t>
+      </w:r>
+      <w:proofErr w:type="spellEnd"/>
+      <w:r>
+        <w:rPr>
+          <w:lang w:val="en-GB"/>
+        </w:rPr>
+        <w:t xml:space="preserve"> ver. 8.8.0. Provide production-ready </w:t>
+      </w:r>
+      <w:r>
+        <w:rPr>
+          <w:lang w:val="en-GB"/>
+        </w:rPr>
+        <w:t xml:space="preserve">C# code-behind code to </w:t>
+      </w:r>
+      <w:r>
+        <w:t>programmatically change the color of the days in the calendar</w:t>
+      </w:r>
+      <w:r>
+        <w:t xml:space="preserve"> control.</w:t>
+      </w:r>
+    </w:p>
+    <w:p>
+      <w:pPr>
+        <w:spacing w:after="0" w:line="240" w:lineRule="auto"/>
+      </w:pPr>
+    </w:p>
+    <w:p>
+      <w:pPr>
+        <w:spacing w:after="0" w:line="240" w:lineRule="auto"/>
+      </w:pPr>
+      <w:r>
+        <w:t>&lt;</w:t>
+      </w:r>
+      <w:proofErr w:type="spellStart"/>
+      <w:r>
+        <w:rPr>
+          <w:b/>
+          <w:bCs/>
+        </w:rPr>
+        <w:t>MudDatePicker</w:t>
+      </w:r>
+      <w:proofErr w:type="spellEnd"/>
+      <w:r>
+        <w:t xml:space="preserve"> </w:t>
+      </w:r>
+      <w:proofErr w:type="spellStart"/>
+      <w:r>
+        <w:rPr>
+          <w:b/>
+          <w:bCs/>
+        </w:rPr>
+        <w:t>PickerVariant</w:t>
+      </w:r>
+      <w:proofErr w:type="spellEnd"/>
+      <w:r>
+        <w:t>="</w:t>
+      </w:r>
+      <w:proofErr w:type="spellStart"/>
+      <w:r>
+        <w:t>PickerVariant.Static</w:t>
+      </w:r>
+      <w:proofErr w:type="spellEnd"/>
+      <w:r>
+        <w:t xml:space="preserve">" </w:t>
+      </w:r>
+    </w:p>
+    <w:p>
+      <w:pPr>
+        <w:spacing w:after="0" w:line="240" w:lineRule="auto"/>
+      </w:pPr>
+      <w:r>
+        <w:t xml:space="preserve">    </w:t>
+      </w:r>
+      <w:r>
+        <w:rPr>
+          <w:b/>
+          <w:bCs/>
+        </w:rPr>
+        <w:t>Color</w:t>
+      </w:r>
+      <w:r>
+        <w:t>="</w:t>
+      </w:r>
+      <w:proofErr w:type="spellStart"/>
+      <w:r>
+        <w:t>Color.Dark</w:t>
+      </w:r>
+      <w:proofErr w:type="spellEnd"/>
+      <w:r>
+        <w:t xml:space="preserve">" </w:t>
+      </w:r>
+    </w:p>
+    <w:p>
+      <w:pPr>
+        <w:spacing w:after="0" w:line="240" w:lineRule="auto"/>
+      </w:pPr>
+      <w:r>
+        <w:t xml:space="preserve">    </w:t>
+      </w:r>
+      <w:r>
+        <w:rPr>
+          <w:b/>
+          <w:bCs/>
+        </w:rPr>
+        <w:t>Rounded</w:t>
+      </w:r>
+      <w:r>
+        <w:t>="true"</w:t>
+      </w:r>
+    </w:p>
+    <w:p>
+      <w:pPr>
+        <w:spacing w:after="0" w:line="240" w:lineRule="auto"/>
+      </w:pPr>
+      <w:r>
+        <w:t xml:space="preserve">    </w:t>
+      </w:r>
+      <w:r>
+        <w:rPr>
+          <w:b/>
+          <w:bCs/>
+        </w:rPr>
+        <w:t>Elevation</w:t>
+      </w:r>
+      <w:r>
+        <w:t>="0"</w:t>
+      </w:r>
+    </w:p>
+    <w:p>
+      <w:pPr>
+        <w:spacing w:after="0" w:line="240" w:lineRule="auto"/>
+      </w:pPr>
+      <w:r>
+        <w:t xml:space="preserve">    </w:t>
+      </w:r>
+      <w:r>
+        <w:rPr>
+          <w:b/>
+          <w:bCs/>
+        </w:rPr>
+        <w:t>Orientation</w:t>
+      </w:r>
+      <w:r>
+        <w:t>="</w:t>
+      </w:r>
+      <w:r>
+        <w:rPr>
+          <w:rFonts w:ascii="Cascadia Mono" w:hAnsi="Cascadia Mono" w:cs="Cascadia Mono"/>
+          <w:color w:val="000000"/>
+          <w:kern w:val="0"/>
+          <w:sz w:val="19"/>
+          <w:szCs w:val="19"/>
+        </w:rPr>
+        <w:t xml:space="preserve"> </w:t>
+      </w:r>
+      <w:proofErr w:type="spellStart"/>
+      <w:r>
+        <w:t>Orientation.Portrait</w:t>
+      </w:r>
+      <w:proofErr w:type="spellEnd"/>
+      <w:r>
+        <w:t>" &gt;</w:t>
+      </w:r>
+    </w:p>
+    <w:p>
+      <w:pPr>
+        <w:spacing w:after="0" w:line="240" w:lineRule="auto"/>
+      </w:pPr>
+      <w:r>
+        <w:t>&lt;/</w:t>
+      </w:r>
+      <w:proofErr w:type="spellStart"/>
+      <w:r>
+        <w:rPr>
+          <w:b/>
+          <w:bCs/>
+        </w:rPr>
+        <w:t>MudDatePicker</w:t>
+      </w:r>
+      <w:proofErr w:type="spellEnd"/>
+      <w:r>
+        <w:t>&gt;</w:t>
+      </w:r>
+    </w:p>
+    <w:p>
+      <w:pPr>
+        <w:spacing w:after="0" w:line="240" w:lineRule="auto"/>
+      </w:pPr>
+    </w:p>
+    <w:p>
+      <w:pPr>
+        <w:spacing w:after="0" w:line="240" w:lineRule="auto"/>
+      </w:pPr>
+      <w:r>
+        <w:t xml:space="preserve">I need to </w:t>
+      </w:r>
+      <w:r>
+        <w:t xml:space="preserve">use </w:t>
+      </w:r>
+      <w:proofErr w:type="spellStart"/>
+      <w:r>
+        <w:t>MudDatePicker</w:t>
+      </w:r>
+      <w:proofErr w:type="spellEnd"/>
+      <w:r>
+        <w:t xml:space="preserve"> so t</w:t>
+      </w:r>
+      <w:r>
+        <w:t>ell me and I will show you how to:</w:t>
+      </w:r>
+    </w:p>
+    <w:p>
+      <w:pPr>
+        <w:spacing w:after="0" w:line="240" w:lineRule="auto"/>
+      </w:pPr>
+      <w:r>
+        <w:rPr>
+          <w:rFonts w:ascii="Segoe UI Symbol" w:hAnsi="Segoe UI Symbol" w:cs="Segoe UI Symbol"/>
+        </w:rPr>
+        <w:t>✔</w:t>
+      </w:r>
+      <w:r>
+        <w:t xml:space="preserve"> Overlay </w:t>
+      </w:r>
+      <w:proofErr w:type="spellStart"/>
+      <w:r>
+        <w:t>MudCalendar</w:t>
+      </w:r>
+      <w:proofErr w:type="spellEnd"/>
+      <w:r>
+        <w:t xml:space="preserve"> inside </w:t>
+      </w:r>
+      <w:proofErr w:type="spellStart"/>
+      <w:r>
+        <w:t>MudDatePicker’s</w:t>
+      </w:r>
+      <w:proofErr w:type="spellEnd"/>
+      <w:r>
+        <w:t xml:space="preserve"> popover</w:t>
+      </w:r>
+      <w:r>
+        <w:br/>
+      </w:r>
+      <w:r>
+        <w:rPr>
+          <w:rFonts w:ascii="Segoe UI Symbol" w:hAnsi="Segoe UI Symbol" w:cs="Segoe UI Symbol"/>
+        </w:rPr>
+        <w:t>✔</w:t>
+      </w:r>
+      <w:r>
+        <w:t xml:space="preserve"> Sync the selected date</w:t>
+      </w:r>
+      <w:r>
+        <w:br/>
+      </w:r>
+      <w:r>
+        <w:rPr>
+          <w:rFonts w:ascii="Segoe UI Symbol" w:hAnsi="Segoe UI Symbol" w:cs="Segoe UI Symbol"/>
+        </w:rPr>
+        <w:t>✔</w:t>
+      </w:r>
+      <w:r>
+        <w:t xml:space="preserve"> Keep the date input behavior</w:t>
+      </w:r>
+    </w:p>
+    <w:p>
+      <w:pPr>
+        <w:spacing w:after="0" w:line="240" w:lineRule="auto"/>
+      </w:pPr>
+    </w:p>
+    <w:p>
+      <w:pPr>
+        <w:spacing w:after="0" w:line="240" w:lineRule="auto"/>
+        <w:rPr>
+          <w:b/>
+          <w:bCs/>
+          <w:color w:val="EE0000"/>
+        </w:rPr>
+      </w:pPr>
+      <w:r>
+        <w:rPr>
+          <w:b/>
+          <w:bCs/>
+          <w:color w:val="EE0000"/>
+        </w:rPr>
+        <w:t>Error:</w:t>
+      </w:r>
+    </w:p>
+    <w:p>
+      <w:pPr>
+        <w:spacing w:after="0" w:line="240" w:lineRule="auto"/>
+      </w:pPr>
+    </w:p>
+    <w:p>
+      <w:pPr>
+        <w:spacing w:after="0" w:line="240" w:lineRule="auto"/>
+      </w:pPr>
+      <w:r>
+        <w:t xml:space="preserve">The following error occurred in </w:t>
+      </w:r>
+      <w:proofErr w:type="spellStart"/>
+      <w:proofErr w:type="gramStart"/>
+      <w:r>
+        <w:t>RenderFragment</w:t>
+      </w:r>
+      <w:proofErr w:type="spellEnd"/>
+      <w:r>
+        <w:t>(</w:t>
+      </w:r>
+      <w:proofErr w:type="gramEnd"/>
+      <w:r>
+        <w:t>) method.</w:t>
+      </w:r>
+    </w:p>
+    <w:p>
+      <w:pPr>
+        <w:spacing w:after="0" w:line="240" w:lineRule="auto"/>
+      </w:pPr>
+      <w:r>
+        <w:t>The type or namespace ‘</w:t>
+      </w:r>
+      <w:proofErr w:type="spellStart"/>
+      <w:r>
+        <w:t>Calenda</w:t>
+      </w:r>
+      <w:r>
+        <w:t>r</w:t>
+      </w:r>
+      <w:r>
+        <w:t>Day</w:t>
+      </w:r>
+      <w:proofErr w:type="spellEnd"/>
+      <w:r>
+        <w:t>’ could not be found (are you missing a using directive or assembly reference?)</w:t>
+      </w:r>
+      <w:r>
+        <w:t xml:space="preserve"> Tell me production-ready code to fix this error.</w:t>
+      </w:r>
+    </w:p>
+    <w:p>
+      <w:pPr>
+        <w:spacing w:after="0" w:line="240" w:lineRule="auto"/>
+      </w:pPr>
+    </w:p>
+    <w:p>
+      <w:pPr>
+        <w:spacing w:after="0" w:line="240" w:lineRule="auto"/>
+      </w:pPr>
+      <w:r>
+        <w:t>Same error:</w:t>
+      </w:r>
+    </w:p>
+    <w:p>
+      <w:pPr>
+        <w:spacing w:after="0" w:line="240" w:lineRule="auto"/>
+      </w:pPr>
+      <w:r>
+        <w:t>The type or namespace ‘</w:t>
+      </w:r>
+      <w:proofErr w:type="spellStart"/>
+      <w:r>
+        <w:t>DatePickerDay</w:t>
+      </w:r>
+      <w:proofErr w:type="spellEnd"/>
+      <w:r>
+        <w:t xml:space="preserve">’ </w:t>
+      </w:r>
+      <w:r>
+        <w:t>could not be found (are you missing a using directive or assembly reference?) Tell me production-ready code to fix this error.</w:t>
+      </w:r>
+    </w:p>
+    <w:p>
+      <w:pPr>
+        <w:spacing w:after="0" w:line="240" w:lineRule="auto"/>
+      </w:pPr>
+    </w:p>
+    <w:p>
+      <w:pPr>
+        <w:spacing w:after="0" w:line="240" w:lineRule="auto"/>
+      </w:pPr>
     </w:p>
     <w:sectPr>
       <w:pgSz w:w="12240" w:h="15840"/>

</xml_diff>